<commit_message>
fix(report): Update template to use dynamic date and fix requested by field
</commit_message>
<xml_diff>
--- a/public/template.docx
+++ b/public/template.docx
@@ -1,6 +1,6 @@
 
 <file path=word/document.xml><?xml version="1.0" encoding="utf-8"?>
-<w:document xmlns:wpc="http://schemas.microsoft.com/office/word/2010/wordprocessingCanvas" xmlns:cx="http://schemas.microsoft.com/office/drawing/2014/chartex" xmlns:cx1="http://schemas.microsoft.com/office/drawing/2015/9/8/chartex" xmlns:cx2="http://schemas.microsoft.com/office/drawing/2015/10/21/chartex" xmlns:cx3="http://schemas.microsoft.com/office/drawing/2016/5/9/chartex" xmlns:cx4="http://schemas.microsoft.com/office/drawing/2016/5/10/chartex" xmlns:cx5="http://schemas.microsoft.com/office/drawing/2016/5/11/chartex" xmlns:cx6="http://schemas.microsoft.com/office/drawing/2016/5/12/chartex" xmlns:cx7="http://schemas.microsoft.com/office/drawing/2016/5/13/chartex" xmlns:cx8="http://schemas.microsoft.com/office/drawing/2016/5/14/chartex" xmlns:mc="http://schemas.openxmlformats.org/markup-compatibility/2006" xmlns:o="urn:schemas-microsoft-com:office:office" xmlns:r="http://schemas.openxmlformats.org/officeDocument/2006/relationships" xmlns:m="http://schemas.openxmlformats.org/officeDocument/2006/math" xmlns:v="urn:schemas-microsoft-com:vml" xmlns:wp14="http://schemas.microsoft.com/office/word/2010/wordprocessingDrawing" xmlns:wp="http://schemas.openxmlformats.org/drawingml/2006/wordprocessingDrawing" xmlns:w="http://schemas.openxmlformats.org/wordprocessingml/2006/main" xmlns:w14="http://schemas.microsoft.com/office/word/2010/wordml" xmlns:w10="urn:schemas-microsoft-com:office:word" xmlns:w15="http://schemas.microsoft.com/office/word/2012/wordml" xmlns:wpg="http://schemas.microsoft.com/office/word/2010/wordprocessingGroup" xmlns:wpi="http://schemas.microsoft.com/office/word/2010/wordprocessingInk" xmlns:wne="http://schemas.microsoft.com/office/word/2006/wordml" xmlns:wps="http://schemas.microsoft.com/office/word/2010/wordprocessingShape" xmlns:wpsCustomData="http://www.wps.cn/officeDocument/2013/wpsCustomData" mc:Ignorable="w14 w15 wp14">
+<w:document xmlns:wpc="http://schemas.microsoft.com/office/word/2010/wordprocessingCanvas" xmlns:cx="http://schemas.microsoft.com/office/drawing/2014/chartex" xmlns:cx1="http://schemas.microsoft.com/office/drawing/2015/9/8/chartex" xmlns:cx2="http://schemas.microsoft.com/office/drawing/2015/10/21/chartex" xmlns:cx3="http://schemas.microsoft.com/office/drawing/2016/5/9/chartex" xmlns:cx4="http://schemas.microsoft.com/office/drawing/2016/5/10/chartex" xmlns:cx5="http://schemas.microsoft.com/office/drawing/2016/5/11/chartex" xmlns:cx6="http://schemas.microsoft.com/office/drawing/2016/5/12/chartex" xmlns:cx7="http://schemas.microsoft.com/office/drawing/2016/5/13/chartex" xmlns:cx8="http://schemas.microsoft.com/office/drawing/2016/5/14/chartex" xmlns:mc="http://schemas.openxmlformats.org/markup-compatibility/2006" xmlns:aink="http://schemas.microsoft.com/office/drawing/2016/ink" xmlns:am3d="http://schemas.microsoft.com/office/drawing/2017/model3d" xmlns:o="urn:schemas-microsoft-com:office:office" xmlns:oel="http://schemas.microsoft.com/office/2019/extlst" xmlns:r="http://schemas.openxmlformats.org/officeDocument/2006/relationships" xmlns:m="http://schemas.openxmlformats.org/officeDocument/2006/math" xmlns:v="urn:schemas-microsoft-com:vml" xmlns:wp14="http://schemas.microsoft.com/office/word/2010/wordprocessingDrawing" xmlns:wp="http://schemas.openxmlformats.org/drawingml/2006/wordprocessingDrawing" xmlns:w10="urn:schemas-microsoft-com:office:word" xmlns:w="http://schemas.openxmlformats.org/wordprocessingml/2006/main" xmlns:w14="http://schemas.microsoft.com/office/word/2010/wordml" xmlns:w15="http://schemas.microsoft.com/office/word/2012/wordml" xmlns:w16cei="http://schemas.microsoft.com/office/word/2026/wordml/cei" xmlns:w16cex="http://schemas.microsoft.com/office/word/2018/wordml/cex" xmlns:w16cid="http://schemas.microsoft.com/office/word/2016/wordml/cid" xmlns:w16="http://schemas.microsoft.com/office/word/2018/wordml" xmlns:w16du="http://schemas.microsoft.com/office/word/2023/wordml/word16du" xmlns:w16sdtdh="http://schemas.microsoft.com/office/word/2020/wordml/sdtdatahash" xmlns:w16sdtfl="http://schemas.microsoft.com/office/word/2024/wordml/sdtformatlock" xmlns:w16se="http://schemas.microsoft.com/office/word/2015/wordml/symex" xmlns:wpg="http://schemas.microsoft.com/office/word/2010/wordprocessingGroup" xmlns:wpi="http://schemas.microsoft.com/office/word/2010/wordprocessingInk" xmlns:wne="http://schemas.microsoft.com/office/word/2006/wordml" xmlns:wps="http://schemas.microsoft.com/office/word/2010/wordprocessingShape" mc:Ignorable="w14 w15 w16se w16cid w16 w16cex w16sdtdh w16sdtfl w16du wp14">
   <w:body>
     <w:p>
       <w:pPr>
@@ -14,7 +14,7 @@
     </w:p>
     <w:p>
       <w:pPr>
-        <w:ind w:left="720" w:firstLine="905" w:firstLineChars="377"/>
+        <w:ind w:left="720" w:firstLineChars="377" w:firstLine="908"/>
         <w:rPr>
           <w:rFonts w:asciiTheme="majorHAnsi" w:hAnsiTheme="majorHAnsi" w:cstheme="majorHAnsi"/>
           <w:b/>
@@ -45,7 +45,7 @@
       </w:r>
       <w:r>
         <w:rPr>
-          <w:rFonts w:hint="default" w:asciiTheme="majorHAnsi" w:hAnsiTheme="majorHAnsi" w:cstheme="majorHAnsi"/>
+          <w:rFonts w:asciiTheme="majorHAnsi" w:hAnsiTheme="majorHAnsi" w:cstheme="majorHAnsi"/>
           <w:b/>
           <w:bCs/>
           <w:sz w:val="24"/>
@@ -64,6 +64,7 @@
         </w:rPr>
         <w:t xml:space="preserve">       SPECIFICATIONS</w:t>
       </w:r>
+      <w:proofErr w:type="gramStart"/>
       <w:r>
         <w:rPr>
           <w:rFonts w:asciiTheme="majorHAnsi" w:hAnsiTheme="majorHAnsi" w:cstheme="majorHAnsi"/>
@@ -73,7 +74,9 @@
           <w:szCs w:val="24"/>
         </w:rPr>
         <w:tab/>
+        <w:t xml:space="preserve">  ACTUAL</w:t>
       </w:r>
+      <w:proofErr w:type="gramEnd"/>
       <w:r>
         <w:rPr>
           <w:rFonts w:asciiTheme="majorHAnsi" w:hAnsiTheme="majorHAnsi" w:cstheme="majorHAnsi"/>
@@ -82,29 +85,23 @@
           <w:sz w:val="24"/>
           <w:szCs w:val="24"/>
         </w:rPr>
-        <w:t xml:space="preserve">  ACTUAL RESULTS</w:t>
+        <w:t xml:space="preserve"> RESULTS</w:t>
       </w:r>
     </w:p>
     <w:tbl>
       <w:tblPr>
-        <w:tblStyle w:val="12"/>
         <w:tblW w:w="9450" w:type="dxa"/>
         <w:jc w:val="center"/>
         <w:tblBorders>
-          <w:top w:val="single" w:color="auto" w:sz="4" w:space="0"/>
-          <w:left w:val="single" w:color="auto" w:sz="4" w:space="0"/>
-          <w:bottom w:val="single" w:color="auto" w:sz="4" w:space="0"/>
-          <w:right w:val="single" w:color="auto" w:sz="4" w:space="0"/>
-          <w:insideH w:val="single" w:color="auto" w:sz="4" w:space="0"/>
-          <w:insideV w:val="single" w:color="auto" w:sz="4" w:space="0"/>
+          <w:top w:val="single" w:sz="4" w:space="0" w:color="auto"/>
+          <w:left w:val="single" w:sz="4" w:space="0" w:color="auto"/>
+          <w:bottom w:val="single" w:sz="4" w:space="0" w:color="auto"/>
+          <w:right w:val="single" w:sz="4" w:space="0" w:color="auto"/>
+          <w:insideH w:val="single" w:sz="4" w:space="0" w:color="auto"/>
+          <w:insideV w:val="single" w:sz="4" w:space="0" w:color="auto"/>
         </w:tblBorders>
         <w:tblLayout w:type="fixed"/>
-        <w:tblCellMar>
-          <w:top w:w="0" w:type="dxa"/>
-          <w:left w:w="108" w:type="dxa"/>
-          <w:bottom w:w="0" w:type="dxa"/>
-          <w:right w:w="108" w:type="dxa"/>
-        </w:tblCellMar>
+        <w:tblLook w:val="04A0" w:firstRow="1" w:lastRow="0" w:firstColumn="1" w:lastColumn="0" w:noHBand="0" w:noVBand="1"/>
       </w:tblPr>
       <w:tblGrid>
         <w:gridCol w:w="2972"/>
@@ -113,35 +110,19 @@
         <w:gridCol w:w="1355"/>
       </w:tblGrid>
       <w:tr>
-        <w:tblPrEx>
-          <w:tblBorders>
-            <w:top w:val="single" w:color="auto" w:sz="4" w:space="0"/>
-            <w:left w:val="single" w:color="auto" w:sz="4" w:space="0"/>
-            <w:bottom w:val="single" w:color="auto" w:sz="4" w:space="0"/>
-            <w:right w:val="single" w:color="auto" w:sz="4" w:space="0"/>
-            <w:insideH w:val="single" w:color="auto" w:sz="4" w:space="0"/>
-            <w:insideV w:val="single" w:color="auto" w:sz="4" w:space="0"/>
-          </w:tblBorders>
-          <w:tblCellMar>
-            <w:top w:w="0" w:type="dxa"/>
-            <w:left w:w="108" w:type="dxa"/>
-            <w:bottom w:w="0" w:type="dxa"/>
-            <w:right w:w="108" w:type="dxa"/>
-          </w:tblCellMar>
-        </w:tblPrEx>
         <w:trPr>
           <w:cantSplit/>
-          <w:trHeight w:val="620" w:hRule="atLeast"/>
+          <w:trHeight w:val="620"/>
           <w:jc w:val="center"/>
         </w:trPr>
         <w:tc>
           <w:tcPr>
             <w:tcW w:w="2972" w:type="dxa"/>
             <w:tcBorders>
-              <w:top w:val="single" w:color="auto" w:sz="4" w:space="0"/>
-              <w:left w:val="single" w:color="auto" w:sz="4" w:space="0"/>
-              <w:bottom w:val="single" w:color="auto" w:sz="4" w:space="0"/>
-              <w:right w:val="single" w:color="auto" w:sz="4" w:space="0"/>
+              <w:top w:val="single" w:sz="4" w:space="0" w:color="auto"/>
+              <w:left w:val="single" w:sz="4" w:space="0" w:color="auto"/>
+              <w:bottom w:val="single" w:sz="4" w:space="0" w:color="auto"/>
+              <w:right w:val="single" w:sz="4" w:space="0" w:color="auto"/>
             </w:tcBorders>
             <w:vAlign w:val="center"/>
           </w:tcPr>
@@ -168,10 +149,10 @@
           <w:tcPr>
             <w:tcW w:w="2063" w:type="dxa"/>
             <w:tcBorders>
-              <w:top w:val="single" w:color="auto" w:sz="4" w:space="0"/>
-              <w:left w:val="single" w:color="auto" w:sz="4" w:space="0"/>
-              <w:bottom w:val="single" w:color="auto" w:sz="4" w:space="0"/>
-              <w:right w:val="single" w:color="auto" w:sz="4" w:space="0"/>
+              <w:top w:val="single" w:sz="4" w:space="0" w:color="auto"/>
+              <w:left w:val="single" w:sz="4" w:space="0" w:color="auto"/>
+              <w:bottom w:val="single" w:sz="4" w:space="0" w:color="auto"/>
+              <w:right w:val="single" w:sz="4" w:space="0" w:color="auto"/>
             </w:tcBorders>
           </w:tcPr>
           <w:p>
@@ -196,16 +177,16 @@
           <w:tcPr>
             <w:tcW w:w="3060" w:type="dxa"/>
             <w:tcBorders>
-              <w:top w:val="single" w:color="auto" w:sz="4" w:space="0"/>
-              <w:left w:val="single" w:color="auto" w:sz="4" w:space="0"/>
-              <w:bottom w:val="single" w:color="auto" w:sz="4" w:space="0"/>
-              <w:right w:val="single" w:color="auto" w:sz="4" w:space="0"/>
+              <w:top w:val="single" w:sz="4" w:space="0" w:color="auto"/>
+              <w:left w:val="single" w:sz="4" w:space="0" w:color="auto"/>
+              <w:bottom w:val="single" w:sz="4" w:space="0" w:color="auto"/>
+              <w:right w:val="single" w:sz="4" w:space="0" w:color="auto"/>
             </w:tcBorders>
             <w:vAlign w:val="center"/>
           </w:tcPr>
           <w:p>
             <w:pPr>
-              <w:pStyle w:val="16"/>
+              <w:pStyle w:val="NormalWeb"/>
               <w:jc w:val="center"/>
               <w:rPr>
                 <w:rFonts w:ascii="Arial" w:hAnsi="Arial"/>
@@ -231,16 +212,16 @@
           <w:tcPr>
             <w:tcW w:w="1355" w:type="dxa"/>
             <w:tcBorders>
-              <w:top w:val="single" w:color="auto" w:sz="4" w:space="0"/>
-              <w:left w:val="single" w:color="auto" w:sz="4" w:space="0"/>
-              <w:bottom w:val="single" w:color="auto" w:sz="4" w:space="0"/>
-              <w:right w:val="single" w:color="auto" w:sz="4" w:space="0"/>
+              <w:top w:val="single" w:sz="4" w:space="0" w:color="auto"/>
+              <w:left w:val="single" w:sz="4" w:space="0" w:color="auto"/>
+              <w:bottom w:val="single" w:sz="4" w:space="0" w:color="auto"/>
+              <w:right w:val="single" w:sz="4" w:space="0" w:color="auto"/>
             </w:tcBorders>
             <w:vAlign w:val="center"/>
           </w:tcPr>
           <w:p>
             <w:pPr>
-              <w:pStyle w:val="16"/>
+              <w:pStyle w:val="NormalWeb"/>
               <w:jc w:val="center"/>
               <w:rPr>
                 <w:rFonts w:ascii="Arial" w:hAnsi="Arial"/>
@@ -264,47 +245,32 @@
         </w:tc>
       </w:tr>
       <w:tr>
-        <w:tblPrEx>
-          <w:tblBorders>
-            <w:top w:val="single" w:color="auto" w:sz="4" w:space="0"/>
-            <w:left w:val="single" w:color="auto" w:sz="4" w:space="0"/>
-            <w:bottom w:val="single" w:color="auto" w:sz="4" w:space="0"/>
-            <w:right w:val="single" w:color="auto" w:sz="4" w:space="0"/>
-            <w:insideH w:val="single" w:color="auto" w:sz="4" w:space="0"/>
-            <w:insideV w:val="single" w:color="auto" w:sz="4" w:space="0"/>
-          </w:tblBorders>
-          <w:tblCellMar>
-            <w:top w:w="0" w:type="dxa"/>
-            <w:left w:w="108" w:type="dxa"/>
-            <w:bottom w:w="0" w:type="dxa"/>
-            <w:right w:w="108" w:type="dxa"/>
-          </w:tblCellMar>
-        </w:tblPrEx>
         <w:trPr>
           <w:cantSplit/>
-          <w:trHeight w:val="731" w:hRule="atLeast"/>
+          <w:trHeight w:val="731"/>
           <w:jc w:val="center"/>
         </w:trPr>
         <w:tc>
           <w:tcPr>
             <w:tcW w:w="2972" w:type="dxa"/>
             <w:tcBorders>
-              <w:top w:val="single" w:color="auto" w:sz="4" w:space="0"/>
-              <w:left w:val="single" w:color="auto" w:sz="4" w:space="0"/>
-              <w:bottom w:val="single" w:color="auto" w:sz="4" w:space="0"/>
-              <w:right w:val="single" w:color="auto" w:sz="4" w:space="0"/>
+              <w:top w:val="single" w:sz="4" w:space="0" w:color="auto"/>
+              <w:left w:val="single" w:sz="4" w:space="0" w:color="auto"/>
+              <w:bottom w:val="single" w:sz="4" w:space="0" w:color="auto"/>
+              <w:right w:val="single" w:sz="4" w:space="0" w:color="auto"/>
             </w:tcBorders>
             <w:vAlign w:val="center"/>
           </w:tcPr>
           <w:p>
             <w:pPr>
-              <w:pStyle w:val="10"/>
+              <w:pStyle w:val="Heading9"/>
               <w:jc w:val="center"/>
               <w:rPr>
-                <w:rFonts w:hint="default" w:ascii="Verdana" w:hAnsi="Verdana"/>
+                <w:rFonts w:ascii="Verdana" w:hAnsi="Verdana"/>
                 <w:bCs/>
                 <w:i w:val="0"/>
                 <w:iCs w:val="0"/>
+                <w:color w:val="262626" w:themeColor="text1" w:themeTint="D9"/>
                 <w:sz w:val="16"/>
                 <w:szCs w:val="16"/>
                 <w:lang w:val="en-US"/>
@@ -312,7 +278,7 @@
             </w:pPr>
             <w:r>
               <w:rPr>
-                <w:rFonts w:hint="default" w:ascii="Verdana" w:hAnsi="Verdana"/>
+                <w:rFonts w:ascii="Verdana" w:hAnsi="Verdana"/>
                 <w:b/>
                 <w:bCs/>
                 <w:i w:val="0"/>
@@ -321,6 +287,14 @@
                 <w:sz w:val="18"/>
                 <w:szCs w:val="18"/>
                 <w:lang w:val="en-US"/>
+                <w14:textFill>
+                  <w14:solidFill>
+                    <w14:srgbClr w14:val="000000">
+                      <w14:lumMod w14:val="85000"/>
+                      <w14:lumOff w14:val="15000"/>
+                    </w14:srgbClr>
+                  </w14:solidFill>
+                </w14:textFill>
               </w:rPr>
               <w:t>Aerobic Plate Count</w:t>
             </w:r>
@@ -331,33 +305,51 @@
             <w:tcW w:w="2063" w:type="dxa"/>
             <w:tcBorders>
               <w:top w:val="nil"/>
-              <w:left w:val="single" w:color="auto" w:sz="4" w:space="0"/>
-              <w:bottom w:val="single" w:color="auto" w:sz="4" w:space="0"/>
-              <w:right w:val="single" w:color="auto" w:sz="4" w:space="0"/>
+              <w:left w:val="single" w:sz="4" w:space="0" w:color="auto"/>
+              <w:bottom w:val="single" w:sz="4" w:space="0" w:color="auto"/>
+              <w:right w:val="single" w:sz="4" w:space="0" w:color="auto"/>
             </w:tcBorders>
             <w:vAlign w:val="center"/>
           </w:tcPr>
           <w:p>
             <w:pPr>
-              <w:pStyle w:val="16"/>
+              <w:pStyle w:val="NormalWeb"/>
               <w:jc w:val="center"/>
               <w:rPr>
-                <w:rFonts w:hint="default" w:ascii="Verdana" w:hAnsi="Verdana"/>
+                <w:rFonts w:ascii="Verdana" w:hAnsi="Verdana"/>
                 <w:b/>
                 <w:sz w:val="16"/>
                 <w:szCs w:val="16"/>
-                <w:lang w:val="en-US"/>
               </w:rPr>
             </w:pPr>
             <w:r>
               <w:rPr>
-                <w:rFonts w:hint="default" w:ascii="Verdana" w:hAnsi="Verdana"/>
+                <w:rFonts w:ascii="Verdana" w:hAnsi="Verdana"/>
                 <w:b/>
                 <w:sz w:val="16"/>
                 <w:szCs w:val="16"/>
-                <w:lang w:val="en-US"/>
               </w:rPr>
-              <w:t>{APC_Spec}</w:t>
+              <w:t>{</w:t>
+            </w:r>
+            <w:proofErr w:type="spellStart"/>
+            <w:r>
+              <w:rPr>
+                <w:rFonts w:ascii="Verdana" w:hAnsi="Verdana"/>
+                <w:b/>
+                <w:sz w:val="16"/>
+                <w:szCs w:val="16"/>
+              </w:rPr>
+              <w:t>APC_Spec</w:t>
+            </w:r>
+            <w:proofErr w:type="spellEnd"/>
+            <w:r>
+              <w:rPr>
+                <w:rFonts w:ascii="Verdana" w:hAnsi="Verdana"/>
+                <w:b/>
+                <w:sz w:val="16"/>
+                <w:szCs w:val="16"/>
+              </w:rPr>
+              <w:t>}</w:t>
             </w:r>
           </w:p>
         </w:tc>
@@ -365,16 +357,16 @@
           <w:tcPr>
             <w:tcW w:w="3060" w:type="dxa"/>
             <w:tcBorders>
-              <w:top w:val="single" w:color="auto" w:sz="4" w:space="0"/>
-              <w:left w:val="single" w:color="auto" w:sz="4" w:space="0"/>
-              <w:bottom w:val="single" w:color="auto" w:sz="4" w:space="0"/>
-              <w:right w:val="single" w:color="auto" w:sz="4" w:space="0"/>
+              <w:top w:val="single" w:sz="4" w:space="0" w:color="auto"/>
+              <w:left w:val="single" w:sz="4" w:space="0" w:color="auto"/>
+              <w:bottom w:val="single" w:sz="4" w:space="0" w:color="auto"/>
+              <w:right w:val="single" w:sz="4" w:space="0" w:color="auto"/>
             </w:tcBorders>
             <w:vAlign w:val="center"/>
           </w:tcPr>
           <w:p>
             <w:pPr>
-              <w:pStyle w:val="16"/>
+              <w:pStyle w:val="NormalWeb"/>
               <w:jc w:val="center"/>
               <w:rPr>
                 <w:rFonts w:ascii="Verdana" w:hAnsi="Verdana"/>
@@ -386,13 +378,32 @@
             </w:pPr>
             <w:r>
               <w:rPr>
-                <w:rFonts w:hint="default" w:ascii="Verdana" w:hAnsi="Verdana"/>
+                <w:rFonts w:ascii="Verdana" w:hAnsi="Verdana"/>
                 <w:b/>
                 <w:sz w:val="16"/>
                 <w:szCs w:val="16"/>
-                <w:lang w:val="en-US"/>
               </w:rPr>
-              <w:t>{APC_Result}</w:t>
+              <w:t>{</w:t>
+            </w:r>
+            <w:proofErr w:type="spellStart"/>
+            <w:r>
+              <w:rPr>
+                <w:rFonts w:ascii="Verdana" w:hAnsi="Verdana"/>
+                <w:b/>
+                <w:sz w:val="16"/>
+                <w:szCs w:val="16"/>
+              </w:rPr>
+              <w:t>APC_Result</w:t>
+            </w:r>
+            <w:proofErr w:type="spellEnd"/>
+            <w:r>
+              <w:rPr>
+                <w:rFonts w:ascii="Verdana" w:hAnsi="Verdana"/>
+                <w:b/>
+                <w:sz w:val="16"/>
+                <w:szCs w:val="16"/>
+              </w:rPr>
+              <w:t>}</w:t>
             </w:r>
           </w:p>
         </w:tc>
@@ -400,149 +411,16 @@
           <w:tcPr>
             <w:tcW w:w="1355" w:type="dxa"/>
             <w:tcBorders>
-              <w:top w:val="single" w:color="auto" w:sz="4" w:space="0"/>
-              <w:left w:val="single" w:color="auto" w:sz="4" w:space="0"/>
-              <w:bottom w:val="single" w:color="auto" w:sz="4" w:space="0"/>
-              <w:right w:val="single" w:color="auto" w:sz="4" w:space="0"/>
+              <w:top w:val="single" w:sz="4" w:space="0" w:color="auto"/>
+              <w:left w:val="single" w:sz="4" w:space="0" w:color="auto"/>
+              <w:bottom w:val="single" w:sz="4" w:space="0" w:color="auto"/>
+              <w:right w:val="single" w:sz="4" w:space="0" w:color="auto"/>
             </w:tcBorders>
             <w:vAlign w:val="center"/>
           </w:tcPr>
           <w:p>
             <w:pPr>
-              <w:pStyle w:val="16"/>
-              <w:jc w:val="center"/>
-              <w:rPr>
-                <w:rFonts w:hint="default" w:ascii="Verdana" w:hAnsi="Verdana"/>
-                <w:b/>
-                <w:bCs/>
-                <w:sz w:val="16"/>
-                <w:szCs w:val="16"/>
-                <w:lang w:val="en-US"/>
-              </w:rPr>
-            </w:pPr>
-            <w:r>
-              <w:rPr>
-                <w:rFonts w:hint="default" w:ascii="Verdana" w:hAnsi="Verdana"/>
-                <w:b/>
-                <w:bCs/>
-                <w:sz w:val="16"/>
-                <w:szCs w:val="16"/>
-                <w:lang w:val="en-US"/>
-              </w:rPr>
-              <w:t>{APC_Remarks}</w:t>
-            </w:r>
-          </w:p>
-        </w:tc>
-      </w:tr>
-      <w:tr>
-        <w:tblPrEx>
-          <w:tblBorders>
-            <w:top w:val="single" w:color="auto" w:sz="4" w:space="0"/>
-            <w:left w:val="single" w:color="auto" w:sz="4" w:space="0"/>
-            <w:bottom w:val="single" w:color="auto" w:sz="4" w:space="0"/>
-            <w:right w:val="single" w:color="auto" w:sz="4" w:space="0"/>
-            <w:insideH w:val="single" w:color="auto" w:sz="4" w:space="0"/>
-            <w:insideV w:val="single" w:color="auto" w:sz="4" w:space="0"/>
-          </w:tblBorders>
-          <w:tblCellMar>
-            <w:top w:w="0" w:type="dxa"/>
-            <w:left w:w="108" w:type="dxa"/>
-            <w:bottom w:w="0" w:type="dxa"/>
-            <w:right w:w="108" w:type="dxa"/>
-          </w:tblCellMar>
-        </w:tblPrEx>
-        <w:trPr>
-          <w:cantSplit/>
-          <w:trHeight w:val="743" w:hRule="atLeast"/>
-          <w:jc w:val="center"/>
-        </w:trPr>
-        <w:tc>
-          <w:tcPr>
-            <w:tcW w:w="2972" w:type="dxa"/>
-            <w:tcBorders>
-              <w:top w:val="single" w:color="auto" w:sz="4" w:space="0"/>
-              <w:left w:val="single" w:color="auto" w:sz="4" w:space="0"/>
-              <w:bottom w:val="single" w:color="auto" w:sz="4" w:space="0"/>
-              <w:right w:val="single" w:color="auto" w:sz="4" w:space="0"/>
-            </w:tcBorders>
-          </w:tcPr>
-          <w:p>
-            <w:pPr>
-              <w:pStyle w:val="16"/>
-              <w:spacing w:before="240" w:beforeAutospacing="0"/>
-              <w:jc w:val="center"/>
-              <w:rPr>
-                <w:rFonts w:ascii="Verdana" w:hAnsi="Verdana"/>
-                <w:b/>
-                <w:i w:val="0"/>
-                <w:iCs w:val="0"/>
-                <w:sz w:val="16"/>
-                <w:szCs w:val="16"/>
-              </w:rPr>
-            </w:pPr>
-            <w:r>
-              <w:rPr>
-                <w:rFonts w:ascii="Verdana" w:hAnsi="Verdana"/>
-                <w:b/>
-                <w:i w:val="0"/>
-                <w:iCs w:val="0"/>
-                <w:sz w:val="18"/>
-                <w:szCs w:val="18"/>
-              </w:rPr>
-              <w:t>Molds &amp; Yeast</w:t>
-            </w:r>
-            <w:bookmarkStart w:id="0" w:name="_GoBack"/>
-            <w:bookmarkEnd w:id="0"/>
-          </w:p>
-        </w:tc>
-        <w:tc>
-          <w:tcPr>
-            <w:tcW w:w="2063" w:type="dxa"/>
-            <w:tcBorders>
-              <w:top w:val="nil"/>
-              <w:left w:val="single" w:color="auto" w:sz="4" w:space="0"/>
-              <w:bottom w:val="single" w:color="auto" w:sz="4" w:space="0"/>
-              <w:right w:val="single" w:color="auto" w:sz="4" w:space="0"/>
-            </w:tcBorders>
-            <w:vAlign w:val="center"/>
-          </w:tcPr>
-          <w:p>
-            <w:pPr>
-              <w:pStyle w:val="16"/>
-              <w:jc w:val="center"/>
-              <w:rPr>
-                <w:rFonts w:ascii="Verdana" w:hAnsi="Verdana"/>
-                <w:b/>
-                <w:sz w:val="16"/>
-                <w:szCs w:val="16"/>
-              </w:rPr>
-            </w:pPr>
-            <w:r>
-              <w:rPr>
-                <w:rFonts w:hint="default" w:ascii="Verdana" w:hAnsi="Verdana"/>
-                <w:b/>
-                <w:sz w:val="16"/>
-                <w:szCs w:val="16"/>
-                <w:lang w:val="en-US"/>
-              </w:rPr>
-              <w:t>{MY_Spec}</w:t>
-            </w:r>
-          </w:p>
-        </w:tc>
-        <w:tc>
-          <w:tcPr>
-            <w:tcW w:w="3060" w:type="dxa"/>
-            <w:tcBorders>
-              <w:top w:val="single" w:color="auto" w:sz="4" w:space="0"/>
-              <w:left w:val="single" w:color="auto" w:sz="4" w:space="0"/>
-              <w:bottom w:val="single" w:color="auto" w:sz="4" w:space="0"/>
-              <w:right w:val="single" w:color="auto" w:sz="4" w:space="0"/>
-            </w:tcBorders>
-            <w:vAlign w:val="center"/>
-          </w:tcPr>
-          <w:p>
-            <w:pPr>
-              <w:pStyle w:val="16"/>
+              <w:pStyle w:val="NormalWeb"/>
               <w:jc w:val="center"/>
               <w:rPr>
                 <w:rFonts w:ascii="Verdana" w:hAnsi="Verdana"/>
@@ -554,13 +432,182 @@
             </w:pPr>
             <w:r>
               <w:rPr>
-                <w:rFonts w:hint="default" w:ascii="Verdana" w:hAnsi="Verdana"/>
+                <w:rFonts w:ascii="Verdana" w:hAnsi="Verdana"/>
+                <w:b/>
+                <w:bCs/>
+                <w:sz w:val="16"/>
+                <w:szCs w:val="16"/>
+              </w:rPr>
+              <w:t>{</w:t>
+            </w:r>
+            <w:proofErr w:type="spellStart"/>
+            <w:r>
+              <w:rPr>
+                <w:rFonts w:ascii="Verdana" w:hAnsi="Verdana"/>
+                <w:b/>
+                <w:bCs/>
+                <w:sz w:val="16"/>
+                <w:szCs w:val="16"/>
+              </w:rPr>
+              <w:t>APC_Remarks</w:t>
+            </w:r>
+            <w:proofErr w:type="spellEnd"/>
+            <w:r>
+              <w:rPr>
+                <w:rFonts w:ascii="Verdana" w:hAnsi="Verdana"/>
+                <w:b/>
+                <w:bCs/>
+                <w:sz w:val="16"/>
+                <w:szCs w:val="16"/>
+              </w:rPr>
+              <w:t>}</w:t>
+            </w:r>
+          </w:p>
+        </w:tc>
+      </w:tr>
+      <w:tr>
+        <w:trPr>
+          <w:cantSplit/>
+          <w:trHeight w:val="743"/>
+          <w:jc w:val="center"/>
+        </w:trPr>
+        <w:tc>
+          <w:tcPr>
+            <w:tcW w:w="2972" w:type="dxa"/>
+            <w:tcBorders>
+              <w:top w:val="single" w:sz="4" w:space="0" w:color="auto"/>
+              <w:left w:val="single" w:sz="4" w:space="0" w:color="auto"/>
+              <w:bottom w:val="single" w:sz="4" w:space="0" w:color="auto"/>
+              <w:right w:val="single" w:sz="4" w:space="0" w:color="auto"/>
+            </w:tcBorders>
+          </w:tcPr>
+          <w:p>
+            <w:pPr>
+              <w:pStyle w:val="NormalWeb"/>
+              <w:spacing w:before="240" w:beforeAutospacing="0"/>
+              <w:jc w:val="center"/>
+              <w:rPr>
+                <w:rFonts w:ascii="Verdana" w:hAnsi="Verdana"/>
                 <w:b/>
                 <w:sz w:val="16"/>
                 <w:szCs w:val="16"/>
-                <w:lang w:val="en-US"/>
               </w:rPr>
-              <w:t>{MY_Result}</w:t>
+            </w:pPr>
+            <w:r>
+              <w:rPr>
+                <w:rFonts w:ascii="Verdana" w:hAnsi="Verdana"/>
+                <w:b/>
+                <w:sz w:val="18"/>
+                <w:szCs w:val="18"/>
+              </w:rPr>
+              <w:t>Molds &amp; Yeast</w:t>
+            </w:r>
+          </w:p>
+        </w:tc>
+        <w:tc>
+          <w:tcPr>
+            <w:tcW w:w="2063" w:type="dxa"/>
+            <w:tcBorders>
+              <w:top w:val="nil"/>
+              <w:left w:val="single" w:sz="4" w:space="0" w:color="auto"/>
+              <w:bottom w:val="single" w:sz="4" w:space="0" w:color="auto"/>
+              <w:right w:val="single" w:sz="4" w:space="0" w:color="auto"/>
+            </w:tcBorders>
+            <w:vAlign w:val="center"/>
+          </w:tcPr>
+          <w:p>
+            <w:pPr>
+              <w:pStyle w:val="NormalWeb"/>
+              <w:jc w:val="center"/>
+              <w:rPr>
+                <w:rFonts w:ascii="Verdana" w:hAnsi="Verdana"/>
+                <w:b/>
+                <w:sz w:val="16"/>
+                <w:szCs w:val="16"/>
+              </w:rPr>
+            </w:pPr>
+            <w:r>
+              <w:rPr>
+                <w:rFonts w:ascii="Verdana" w:hAnsi="Verdana"/>
+                <w:b/>
+                <w:sz w:val="16"/>
+                <w:szCs w:val="16"/>
+              </w:rPr>
+              <w:t>{</w:t>
+            </w:r>
+            <w:proofErr w:type="spellStart"/>
+            <w:r>
+              <w:rPr>
+                <w:rFonts w:ascii="Verdana" w:hAnsi="Verdana"/>
+                <w:b/>
+                <w:sz w:val="16"/>
+                <w:szCs w:val="16"/>
+              </w:rPr>
+              <w:t>MY_Spec</w:t>
+            </w:r>
+            <w:proofErr w:type="spellEnd"/>
+            <w:r>
+              <w:rPr>
+                <w:rFonts w:ascii="Verdana" w:hAnsi="Verdana"/>
+                <w:b/>
+                <w:sz w:val="16"/>
+                <w:szCs w:val="16"/>
+              </w:rPr>
+              <w:t>}</w:t>
+            </w:r>
+          </w:p>
+        </w:tc>
+        <w:tc>
+          <w:tcPr>
+            <w:tcW w:w="3060" w:type="dxa"/>
+            <w:tcBorders>
+              <w:top w:val="single" w:sz="4" w:space="0" w:color="auto"/>
+              <w:left w:val="single" w:sz="4" w:space="0" w:color="auto"/>
+              <w:bottom w:val="single" w:sz="4" w:space="0" w:color="auto"/>
+              <w:right w:val="single" w:sz="4" w:space="0" w:color="auto"/>
+            </w:tcBorders>
+            <w:vAlign w:val="center"/>
+          </w:tcPr>
+          <w:p>
+            <w:pPr>
+              <w:pStyle w:val="NormalWeb"/>
+              <w:jc w:val="center"/>
+              <w:rPr>
+                <w:rFonts w:ascii="Verdana" w:hAnsi="Verdana"/>
+                <w:b/>
+                <w:bCs/>
+                <w:sz w:val="16"/>
+                <w:szCs w:val="16"/>
+              </w:rPr>
+            </w:pPr>
+            <w:r>
+              <w:rPr>
+                <w:rFonts w:ascii="Verdana" w:hAnsi="Verdana"/>
+                <w:b/>
+                <w:sz w:val="16"/>
+                <w:szCs w:val="16"/>
+              </w:rPr>
+              <w:t>{</w:t>
+            </w:r>
+            <w:proofErr w:type="spellStart"/>
+            <w:r>
+              <w:rPr>
+                <w:rFonts w:ascii="Verdana" w:hAnsi="Verdana"/>
+                <w:b/>
+                <w:sz w:val="16"/>
+                <w:szCs w:val="16"/>
+              </w:rPr>
+              <w:t>MY_Result</w:t>
+            </w:r>
+            <w:proofErr w:type="spellEnd"/>
+            <w:r>
+              <w:rPr>
+                <w:rFonts w:ascii="Verdana" w:hAnsi="Verdana"/>
+                <w:b/>
+                <w:sz w:val="16"/>
+                <w:szCs w:val="16"/>
+              </w:rPr>
+              <w:t>}</w:t>
             </w:r>
           </w:p>
         </w:tc>
@@ -568,10 +615,10 @@
           <w:tcPr>
             <w:tcW w:w="1355" w:type="dxa"/>
             <w:tcBorders>
-              <w:top w:val="single" w:color="auto" w:sz="4" w:space="0"/>
-              <w:left w:val="single" w:color="auto" w:sz="4" w:space="0"/>
-              <w:bottom w:val="single" w:color="auto" w:sz="4" w:space="0"/>
-              <w:right w:val="single" w:color="auto" w:sz="4" w:space="0"/>
+              <w:top w:val="single" w:sz="4" w:space="0" w:color="auto"/>
+              <w:left w:val="single" w:sz="4" w:space="0" w:color="auto"/>
+              <w:bottom w:val="single" w:sz="4" w:space="0" w:color="auto"/>
+              <w:right w:val="single" w:sz="4" w:space="0" w:color="auto"/>
             </w:tcBorders>
             <w:vAlign w:val="center"/>
           </w:tcPr>
@@ -588,48 +635,56 @@
             </w:pPr>
             <w:r>
               <w:rPr>
-                <w:rFonts w:hint="default" w:ascii="Verdana" w:hAnsi="Verdana"/>
+                <w:rFonts w:ascii="Verdana" w:hAnsi="Verdana"/>
                 <w:b/>
                 <w:bCs/>
                 <w:sz w:val="16"/>
                 <w:szCs w:val="16"/>
                 <w:lang w:val="en-US"/>
               </w:rPr>
-              <w:t>{MY_Remarks}</w:t>
+              <w:t>{</w:t>
+            </w:r>
+            <w:proofErr w:type="spellStart"/>
+            <w:r>
+              <w:rPr>
+                <w:rFonts w:ascii="Verdana" w:hAnsi="Verdana"/>
+                <w:b/>
+                <w:bCs/>
+                <w:sz w:val="16"/>
+                <w:szCs w:val="16"/>
+                <w:lang w:val="en-US"/>
+              </w:rPr>
+              <w:t>MY_Remarks</w:t>
+            </w:r>
+            <w:proofErr w:type="spellEnd"/>
+            <w:r>
+              <w:rPr>
+                <w:rFonts w:ascii="Verdana" w:hAnsi="Verdana"/>
+                <w:b/>
+                <w:bCs/>
+                <w:sz w:val="16"/>
+                <w:szCs w:val="16"/>
+                <w:lang w:val="en-US"/>
+              </w:rPr>
+              <w:t>}</w:t>
             </w:r>
           </w:p>
         </w:tc>
       </w:tr>
       <w:tr>
-        <w:tblPrEx>
-          <w:tblBorders>
-            <w:top w:val="single" w:color="auto" w:sz="4" w:space="0"/>
-            <w:left w:val="single" w:color="auto" w:sz="4" w:space="0"/>
-            <w:bottom w:val="single" w:color="auto" w:sz="4" w:space="0"/>
-            <w:right w:val="single" w:color="auto" w:sz="4" w:space="0"/>
-            <w:insideH w:val="single" w:color="auto" w:sz="4" w:space="0"/>
-            <w:insideV w:val="single" w:color="auto" w:sz="4" w:space="0"/>
-          </w:tblBorders>
-          <w:tblCellMar>
-            <w:top w:w="0" w:type="dxa"/>
-            <w:left w:w="108" w:type="dxa"/>
-            <w:bottom w:w="0" w:type="dxa"/>
-            <w:right w:w="108" w:type="dxa"/>
-          </w:tblCellMar>
-        </w:tblPrEx>
         <w:trPr>
           <w:cantSplit/>
-          <w:trHeight w:val="766" w:hRule="atLeast"/>
+          <w:trHeight w:val="766"/>
           <w:jc w:val="center"/>
         </w:trPr>
         <w:tc>
           <w:tcPr>
             <w:tcW w:w="2972" w:type="dxa"/>
             <w:tcBorders>
-              <w:top w:val="single" w:color="auto" w:sz="4" w:space="0"/>
-              <w:left w:val="single" w:color="auto" w:sz="4" w:space="0"/>
-              <w:bottom w:val="single" w:color="auto" w:sz="4" w:space="0"/>
-              <w:right w:val="single" w:color="auto" w:sz="4" w:space="0"/>
+              <w:top w:val="single" w:sz="4" w:space="0" w:color="auto"/>
+              <w:left w:val="single" w:sz="4" w:space="0" w:color="auto"/>
+              <w:bottom w:val="single" w:sz="4" w:space="0" w:color="auto"/>
+              <w:right w:val="single" w:sz="4" w:space="0" w:color="auto"/>
             </w:tcBorders>
             <w:vAlign w:val="center"/>
           </w:tcPr>
@@ -638,11 +693,9 @@
               <w:spacing w:after="0"/>
               <w:jc w:val="center"/>
               <w:rPr>
-                <w:rFonts w:hint="default" w:ascii="Verdana" w:hAnsi="Verdana"/>
+                <w:rFonts w:ascii="Verdana" w:hAnsi="Verdana"/>
                 <w:b/>
                 <w:bCs/>
-                <w:i w:val="0"/>
-                <w:iCs w:val="0"/>
                 <w:sz w:val="16"/>
                 <w:szCs w:val="16"/>
                 <w:lang w:val="en-US"/>
@@ -650,11 +703,9 @@
             </w:pPr>
             <w:r>
               <w:rPr>
-                <w:rFonts w:hint="default" w:ascii="Verdana" w:hAnsi="Verdana"/>
+                <w:rFonts w:ascii="Verdana" w:hAnsi="Verdana"/>
                 <w:b/>
                 <w:bCs/>
-                <w:i w:val="0"/>
-                <w:iCs w:val="0"/>
                 <w:sz w:val="18"/>
                 <w:szCs w:val="18"/>
                 <w:lang w:val="en-US"/>
@@ -667,10 +718,10 @@
           <w:tcPr>
             <w:tcW w:w="2063" w:type="dxa"/>
             <w:tcBorders>
-              <w:top w:val="single" w:color="auto" w:sz="4" w:space="0"/>
-              <w:left w:val="single" w:color="auto" w:sz="4" w:space="0"/>
-              <w:bottom w:val="single" w:color="auto" w:sz="4" w:space="0"/>
-              <w:right w:val="single" w:color="auto" w:sz="4" w:space="0"/>
+              <w:top w:val="single" w:sz="4" w:space="0" w:color="auto"/>
+              <w:left w:val="single" w:sz="4" w:space="0" w:color="auto"/>
+              <w:bottom w:val="single" w:sz="4" w:space="0" w:color="auto"/>
+              <w:right w:val="single" w:sz="4" w:space="0" w:color="auto"/>
             </w:tcBorders>
             <w:vAlign w:val="center"/>
           </w:tcPr>
@@ -678,7 +729,7 @@
             <w:pPr>
               <w:jc w:val="center"/>
               <w:rPr>
-                <w:rFonts w:hint="default" w:ascii="Verdana" w:hAnsi="Verdana" w:eastAsia="DengXian Light"/>
+                <w:rFonts w:ascii="Verdana" w:eastAsia="等线 Light" w:hAnsi="Verdana"/>
                 <w:b/>
                 <w:color w:val="2F5496"/>
                 <w:sz w:val="16"/>
@@ -688,14 +739,38 @@
             </w:pPr>
             <w:r>
               <w:rPr>
-                <w:rFonts w:hint="default" w:ascii="Verdana" w:hAnsi="Verdana"/>
+                <w:rFonts w:ascii="Verdana" w:hAnsi="Verdana"/>
                 <w:b/>
                 <w:bCs/>
                 <w:sz w:val="16"/>
                 <w:szCs w:val="16"/>
                 <w:lang w:val="en-US"/>
               </w:rPr>
-              <w:t>{GN_Spec}</w:t>
+              <w:t>{</w:t>
+            </w:r>
+            <w:proofErr w:type="spellStart"/>
+            <w:r>
+              <w:rPr>
+                <w:rFonts w:ascii="Verdana" w:hAnsi="Verdana"/>
+                <w:b/>
+                <w:bCs/>
+                <w:sz w:val="16"/>
+                <w:szCs w:val="16"/>
+                <w:lang w:val="en-US"/>
+              </w:rPr>
+              <w:t>GN_Spec</w:t>
+            </w:r>
+            <w:proofErr w:type="spellEnd"/>
+            <w:r>
+              <w:rPr>
+                <w:rFonts w:ascii="Verdana" w:hAnsi="Verdana"/>
+                <w:b/>
+                <w:bCs/>
+                <w:sz w:val="16"/>
+                <w:szCs w:val="16"/>
+                <w:lang w:val="en-US"/>
+              </w:rPr>
+              <w:t>}</w:t>
             </w:r>
           </w:p>
         </w:tc>
@@ -703,10 +778,10 @@
           <w:tcPr>
             <w:tcW w:w="3060" w:type="dxa"/>
             <w:tcBorders>
-              <w:top w:val="single" w:color="auto" w:sz="4" w:space="0"/>
-              <w:left w:val="single" w:color="auto" w:sz="4" w:space="0"/>
-              <w:bottom w:val="single" w:color="auto" w:sz="4" w:space="0"/>
-              <w:right w:val="single" w:color="auto" w:sz="4" w:space="0"/>
+              <w:top w:val="single" w:sz="4" w:space="0" w:color="auto"/>
+              <w:left w:val="single" w:sz="4" w:space="0" w:color="auto"/>
+              <w:bottom w:val="single" w:sz="4" w:space="0" w:color="auto"/>
+              <w:right w:val="single" w:sz="4" w:space="0" w:color="auto"/>
             </w:tcBorders>
             <w:vAlign w:val="center"/>
           </w:tcPr>
@@ -714,7 +789,7 @@
             <w:pPr>
               <w:jc w:val="center"/>
               <w:rPr>
-                <w:rFonts w:ascii="Verdana" w:hAnsi="Verdana" w:eastAsia="Times New Roman"/>
+                <w:rFonts w:ascii="Verdana" w:eastAsia="Times New Roman" w:hAnsi="Verdana"/>
                 <w:b/>
                 <w:bCs/>
                 <w:sz w:val="16"/>
@@ -723,14 +798,38 @@
             </w:pPr>
             <w:r>
               <w:rPr>
-                <w:rFonts w:hint="default" w:ascii="Verdana" w:hAnsi="Verdana"/>
+                <w:rFonts w:ascii="Verdana" w:hAnsi="Verdana"/>
                 <w:b/>
                 <w:bCs/>
                 <w:sz w:val="16"/>
                 <w:szCs w:val="16"/>
                 <w:lang w:val="en-US"/>
               </w:rPr>
-              <w:t>{GN_Result}</w:t>
+              <w:t>{</w:t>
+            </w:r>
+            <w:proofErr w:type="spellStart"/>
+            <w:r>
+              <w:rPr>
+                <w:rFonts w:ascii="Verdana" w:hAnsi="Verdana"/>
+                <w:b/>
+                <w:bCs/>
+                <w:sz w:val="16"/>
+                <w:szCs w:val="16"/>
+                <w:lang w:val="en-US"/>
+              </w:rPr>
+              <w:t>GN_Result</w:t>
+            </w:r>
+            <w:proofErr w:type="spellEnd"/>
+            <w:r>
+              <w:rPr>
+                <w:rFonts w:ascii="Verdana" w:hAnsi="Verdana"/>
+                <w:b/>
+                <w:bCs/>
+                <w:sz w:val="16"/>
+                <w:szCs w:val="16"/>
+                <w:lang w:val="en-US"/>
+              </w:rPr>
+              <w:t>}</w:t>
             </w:r>
           </w:p>
         </w:tc>
@@ -738,10 +837,10 @@
           <w:tcPr>
             <w:tcW w:w="1355" w:type="dxa"/>
             <w:tcBorders>
-              <w:top w:val="single" w:color="auto" w:sz="4" w:space="0"/>
-              <w:left w:val="single" w:color="auto" w:sz="4" w:space="0"/>
-              <w:bottom w:val="single" w:color="auto" w:sz="4" w:space="0"/>
-              <w:right w:val="single" w:color="auto" w:sz="4" w:space="0"/>
+              <w:top w:val="single" w:sz="4" w:space="0" w:color="auto"/>
+              <w:left w:val="single" w:sz="4" w:space="0" w:color="auto"/>
+              <w:bottom w:val="single" w:sz="4" w:space="0" w:color="auto"/>
+              <w:right w:val="single" w:sz="4" w:space="0" w:color="auto"/>
             </w:tcBorders>
             <w:vAlign w:val="center"/>
           </w:tcPr>
@@ -759,14 +858,38 @@
             </w:pPr>
             <w:r>
               <w:rPr>
-                <w:rFonts w:hint="default" w:ascii="Verdana" w:hAnsi="Verdana"/>
+                <w:rFonts w:ascii="Verdana" w:hAnsi="Verdana"/>
                 <w:b/>
                 <w:bCs/>
                 <w:sz w:val="16"/>
                 <w:szCs w:val="16"/>
                 <w:lang w:val="en-US"/>
               </w:rPr>
-              <w:t>{GN_Remarks}</w:t>
+              <w:t>{</w:t>
+            </w:r>
+            <w:proofErr w:type="spellStart"/>
+            <w:r>
+              <w:rPr>
+                <w:rFonts w:ascii="Verdana" w:hAnsi="Verdana"/>
+                <w:b/>
+                <w:bCs/>
+                <w:sz w:val="16"/>
+                <w:szCs w:val="16"/>
+                <w:lang w:val="en-US"/>
+              </w:rPr>
+              <w:t>GN_Remarks</w:t>
+            </w:r>
+            <w:proofErr w:type="spellEnd"/>
+            <w:r>
+              <w:rPr>
+                <w:rFonts w:ascii="Verdana" w:hAnsi="Verdana"/>
+                <w:b/>
+                <w:bCs/>
+                <w:sz w:val="16"/>
+                <w:szCs w:val="16"/>
+                <w:lang w:val="en-US"/>
+              </w:rPr>
+              <w:t>}</w:t>
             </w:r>
           </w:p>
         </w:tc>
@@ -777,24 +900,19 @@
     <w:p/>
     <w:p/>
     <w:sectPr>
-      <w:headerReference r:id="rId7" w:type="first"/>
-      <w:footerReference r:id="rId10" w:type="first"/>
-      <w:headerReference r:id="rId5" w:type="default"/>
-      <w:footerReference r:id="rId8" w:type="default"/>
-      <w:headerReference r:id="rId6" w:type="even"/>
-      <w:footerReference r:id="rId9" w:type="even"/>
+      <w:headerReference w:type="default" r:id="rId8"/>
+      <w:footerReference w:type="default" r:id="rId9"/>
       <w:pgSz w:w="12240" w:h="15840"/>
       <w:pgMar w:top="432" w:right="432" w:bottom="432" w:left="432" w:header="709" w:footer="567" w:gutter="0"/>
-      <w:pgNumType w:fmt="decimal"/>
-      <w:cols w:space="720" w:num="1"/>
+      <w:cols w:space="720"/>
     </w:sectPr>
   </w:body>
 </w:document>
 </file>
 
 <file path=word/endnotes.xml><?xml version="1.0" encoding="utf-8"?>
-<w:endnotes xmlns:wpc="http://schemas.microsoft.com/office/word/2010/wordprocessingCanvas" xmlns:mc="http://schemas.openxmlformats.org/markup-compatibility/2006" xmlns:o="urn:schemas-microsoft-com:office:office" xmlns:r="http://schemas.openxmlformats.org/officeDocument/2006/relationships" xmlns:m="http://schemas.openxmlformats.org/officeDocument/2006/math" xmlns:v="urn:schemas-microsoft-com:vml" xmlns:wp14="http://schemas.microsoft.com/office/word/2010/wordprocessingDrawing" xmlns:wp="http://schemas.openxmlformats.org/drawingml/2006/wordprocessingDrawing" xmlns:w="http://schemas.openxmlformats.org/wordprocessingml/2006/main" xmlns:w14="http://schemas.microsoft.com/office/word/2010/wordml" xmlns:w15="http://schemas.microsoft.com/office/word/2012/wordml" xmlns:w10="urn:schemas-microsoft-com:office:word" xmlns:wpg="http://schemas.microsoft.com/office/word/2010/wordprocessingGroup" xmlns:wpi="http://schemas.microsoft.com/office/word/2010/wordprocessingInk" xmlns:wne="http://schemas.microsoft.com/office/word/2006/wordml" xmlns:wps="http://schemas.microsoft.com/office/word/2010/wordprocessingShape" xmlns:wpsCustomData="http://www.wps.cn/officeDocument/2013/wpsCustomData" mc:Ignorable="w14 w15 wp14">
-  <w:endnote w:type="separator" w:id="0">
+<w:endnotes xmlns:wpc="http://schemas.microsoft.com/office/word/2010/wordprocessingCanvas" xmlns:cx="http://schemas.microsoft.com/office/drawing/2014/chartex" xmlns:cx1="http://schemas.microsoft.com/office/drawing/2015/9/8/chartex" xmlns:cx2="http://schemas.microsoft.com/office/drawing/2015/10/21/chartex" xmlns:cx3="http://schemas.microsoft.com/office/drawing/2016/5/9/chartex" xmlns:cx4="http://schemas.microsoft.com/office/drawing/2016/5/10/chartex" xmlns:cx5="http://schemas.microsoft.com/office/drawing/2016/5/11/chartex" xmlns:cx6="http://schemas.microsoft.com/office/drawing/2016/5/12/chartex" xmlns:cx7="http://schemas.microsoft.com/office/drawing/2016/5/13/chartex" xmlns:cx8="http://schemas.microsoft.com/office/drawing/2016/5/14/chartex" xmlns:mc="http://schemas.openxmlformats.org/markup-compatibility/2006" xmlns:aink="http://schemas.microsoft.com/office/drawing/2016/ink" xmlns:am3d="http://schemas.microsoft.com/office/drawing/2017/model3d" xmlns:o="urn:schemas-microsoft-com:office:office" xmlns:oel="http://schemas.microsoft.com/office/2019/extlst" xmlns:r="http://schemas.openxmlformats.org/officeDocument/2006/relationships" xmlns:m="http://schemas.openxmlformats.org/officeDocument/2006/math" xmlns:v="urn:schemas-microsoft-com:vml" xmlns:wp14="http://schemas.microsoft.com/office/word/2010/wordprocessingDrawing" xmlns:wp="http://schemas.openxmlformats.org/drawingml/2006/wordprocessingDrawing" xmlns:w10="urn:schemas-microsoft-com:office:word" xmlns:w="http://schemas.openxmlformats.org/wordprocessingml/2006/main" xmlns:w14="http://schemas.microsoft.com/office/word/2010/wordml" xmlns:w15="http://schemas.microsoft.com/office/word/2012/wordml" xmlns:w16cei="http://schemas.microsoft.com/office/word/2026/wordml/cei" xmlns:w16cex="http://schemas.microsoft.com/office/word/2018/wordml/cex" xmlns:w16cid="http://schemas.microsoft.com/office/word/2016/wordml/cid" xmlns:w16="http://schemas.microsoft.com/office/word/2018/wordml" xmlns:w16du="http://schemas.microsoft.com/office/word/2023/wordml/word16du" xmlns:w16sdtdh="http://schemas.microsoft.com/office/word/2020/wordml/sdtdatahash" xmlns:w16sdtfl="http://schemas.microsoft.com/office/word/2024/wordml/sdtformatlock" xmlns:w16se="http://schemas.microsoft.com/office/word/2015/wordml/symex" xmlns:wpg="http://schemas.microsoft.com/office/word/2010/wordprocessingGroup" xmlns:wpi="http://schemas.microsoft.com/office/word/2010/wordprocessingInk" xmlns:wne="http://schemas.microsoft.com/office/word/2006/wordml" xmlns:wps="http://schemas.microsoft.com/office/word/2010/wordprocessingShape" mc:Ignorable="w14 w15 w16se w16cid w16 w16cex w16sdtdh w16sdtfl w16du wp14">
+  <w:endnote w:type="separator" w:id="-1">
     <w:p>
       <w:pPr>
         <w:spacing w:line="240" w:lineRule="auto"/>
@@ -804,7 +922,7 @@
       </w:r>
     </w:p>
   </w:endnote>
-  <w:endnote w:type="continuationSeparator" w:id="1">
+  <w:endnote w:type="continuationSeparator" w:id="0">
     <w:p>
       <w:pPr>
         <w:spacing w:line="240" w:lineRule="auto"/>
@@ -818,10 +936,10 @@
 </file>
 
 <file path=word/footer1.xml><?xml version="1.0" encoding="utf-8"?>
-<w:ftr xmlns:wpc="http://schemas.microsoft.com/office/word/2010/wordprocessingCanvas" xmlns:mc="http://schemas.openxmlformats.org/markup-compatibility/2006" xmlns:o="urn:schemas-microsoft-com:office:office" xmlns:r="http://schemas.openxmlformats.org/officeDocument/2006/relationships" xmlns:m="http://schemas.openxmlformats.org/officeDocument/2006/math" xmlns:v="urn:schemas-microsoft-com:vml" xmlns:wp14="http://schemas.microsoft.com/office/word/2010/wordprocessingDrawing" xmlns:wp="http://schemas.openxmlformats.org/drawingml/2006/wordprocessingDrawing" xmlns:w10="urn:schemas-microsoft-com:office:word" xmlns:w="http://schemas.openxmlformats.org/wordprocessingml/2006/main" xmlns:w14="http://schemas.microsoft.com/office/word/2010/wordml" xmlns:w15="http://schemas.microsoft.com/office/word/2012/wordml" xmlns:wpg="http://schemas.microsoft.com/office/word/2010/wordprocessingGroup" xmlns:wpi="http://schemas.microsoft.com/office/word/2010/wordprocessingInk" xmlns:wne="http://schemas.microsoft.com/office/word/2006/wordml" xmlns:wps="http://schemas.microsoft.com/office/word/2010/wordprocessingShape" xmlns:wpsCustomData="http://www.wps.cn/officeDocument/2013/wpsCustomData" mc:Ignorable="w14 w15 wp14">
+<w:ftr xmlns:wpc="http://schemas.microsoft.com/office/word/2010/wordprocessingCanvas" xmlns:cx="http://schemas.microsoft.com/office/drawing/2014/chartex" xmlns:cx1="http://schemas.microsoft.com/office/drawing/2015/9/8/chartex" xmlns:cx2="http://schemas.microsoft.com/office/drawing/2015/10/21/chartex" xmlns:cx3="http://schemas.microsoft.com/office/drawing/2016/5/9/chartex" xmlns:cx4="http://schemas.microsoft.com/office/drawing/2016/5/10/chartex" xmlns:cx5="http://schemas.microsoft.com/office/drawing/2016/5/11/chartex" xmlns:cx6="http://schemas.microsoft.com/office/drawing/2016/5/12/chartex" xmlns:cx7="http://schemas.microsoft.com/office/drawing/2016/5/13/chartex" xmlns:cx8="http://schemas.microsoft.com/office/drawing/2016/5/14/chartex" xmlns:mc="http://schemas.openxmlformats.org/markup-compatibility/2006" xmlns:aink="http://schemas.microsoft.com/office/drawing/2016/ink" xmlns:am3d="http://schemas.microsoft.com/office/drawing/2017/model3d" xmlns:o="urn:schemas-microsoft-com:office:office" xmlns:oel="http://schemas.microsoft.com/office/2019/extlst" xmlns:r="http://schemas.openxmlformats.org/officeDocument/2006/relationships" xmlns:m="http://schemas.openxmlformats.org/officeDocument/2006/math" xmlns:v="urn:schemas-microsoft-com:vml" xmlns:wp14="http://schemas.microsoft.com/office/word/2010/wordprocessingDrawing" xmlns:wp="http://schemas.openxmlformats.org/drawingml/2006/wordprocessingDrawing" xmlns:w10="urn:schemas-microsoft-com:office:word" xmlns:w="http://schemas.openxmlformats.org/wordprocessingml/2006/main" xmlns:w14="http://schemas.microsoft.com/office/word/2010/wordml" xmlns:w15="http://schemas.microsoft.com/office/word/2012/wordml" xmlns:w16cei="http://schemas.microsoft.com/office/word/2026/wordml/cei" xmlns:w16cex="http://schemas.microsoft.com/office/word/2018/wordml/cex" xmlns:w16cid="http://schemas.microsoft.com/office/word/2016/wordml/cid" xmlns:w16="http://schemas.microsoft.com/office/word/2018/wordml" xmlns:w16du="http://schemas.microsoft.com/office/word/2023/wordml/word16du" xmlns:w16sdtdh="http://schemas.microsoft.com/office/word/2020/wordml/sdtdatahash" xmlns:w16sdtfl="http://schemas.microsoft.com/office/word/2024/wordml/sdtformatlock" xmlns:w16se="http://schemas.microsoft.com/office/word/2015/wordml/symex" xmlns:wpg="http://schemas.microsoft.com/office/word/2010/wordprocessingGroup" xmlns:wpi="http://schemas.microsoft.com/office/word/2010/wordprocessingInk" xmlns:wne="http://schemas.microsoft.com/office/word/2006/wordml" xmlns:wps="http://schemas.microsoft.com/office/word/2010/wordprocessingShape" mc:Ignorable="w14 w15 w16se w16cid w16 w16cex w16sdtdh w16sdtfl w16du wp14">
   <w:p>
     <w:pPr>
-      <w:pStyle w:val="14"/>
+      <w:pStyle w:val="Footer"/>
       <w:rPr>
         <w:rFonts w:ascii="Verdana" w:hAnsi="Verdana"/>
         <w:sz w:val="16"/>
@@ -831,24 +949,9 @@
   </w:p>
   <w:tbl>
     <w:tblPr>
-      <w:tblStyle w:val="17"/>
+      <w:tblStyle w:val="TableGrid"/>
       <w:tblW w:w="0" w:type="auto"/>
-      <w:tblInd w:w="0" w:type="dxa"/>
-      <w:tblBorders>
-        <w:top w:val="single" w:color="auto" w:sz="4" w:space="0"/>
-        <w:left w:val="single" w:color="auto" w:sz="4" w:space="0"/>
-        <w:bottom w:val="single" w:color="auto" w:sz="4" w:space="0"/>
-        <w:right w:val="single" w:color="auto" w:sz="4" w:space="0"/>
-        <w:insideH w:val="single" w:color="auto" w:sz="4" w:space="0"/>
-        <w:insideV w:val="single" w:color="auto" w:sz="4" w:space="0"/>
-      </w:tblBorders>
-      <w:tblLayout w:type="autofit"/>
-      <w:tblCellMar>
-        <w:top w:w="0" w:type="dxa"/>
-        <w:left w:w="108" w:type="dxa"/>
-        <w:bottom w:w="0" w:type="dxa"/>
-        <w:right w:w="108" w:type="dxa"/>
-      </w:tblCellMar>
+      <w:tblLook w:val="04A0" w:firstRow="1" w:lastRow="0" w:firstColumn="1" w:lastColumn="0" w:noHBand="0" w:noVBand="1"/>
     </w:tblPr>
     <w:tblGrid>
       <w:gridCol w:w="3446"/>
@@ -857,43 +960,26 @@
       <w:gridCol w:w="1613"/>
     </w:tblGrid>
     <w:tr>
-      <w:tblPrEx>
-        <w:tblBorders>
-          <w:top w:val="single" w:color="auto" w:sz="4" w:space="0"/>
-          <w:left w:val="single" w:color="auto" w:sz="4" w:space="0"/>
-          <w:bottom w:val="single" w:color="auto" w:sz="4" w:space="0"/>
-          <w:right w:val="single" w:color="auto" w:sz="4" w:space="0"/>
-          <w:insideH w:val="single" w:color="auto" w:sz="4" w:space="0"/>
-          <w:insideV w:val="single" w:color="auto" w:sz="4" w:space="0"/>
-        </w:tblBorders>
-        <w:tblCellMar>
-          <w:top w:w="0" w:type="dxa"/>
-          <w:left w:w="108" w:type="dxa"/>
-          <w:bottom w:w="0" w:type="dxa"/>
-          <w:right w:w="108" w:type="dxa"/>
-        </w:tblCellMar>
-      </w:tblPrEx>
       <w:trPr>
-        <w:trHeight w:val="397" w:hRule="atLeast"/>
+        <w:trHeight w:val="397"/>
       </w:trPr>
       <w:tc>
         <w:tcPr>
           <w:tcW w:w="7465" w:type="dxa"/>
           <w:gridSpan w:val="2"/>
           <w:tcBorders>
-            <w:top w:val="single" w:color="auto" w:sz="4" w:space="0"/>
-            <w:right w:val="single" w:color="auto" w:sz="4" w:space="0"/>
+            <w:top w:val="single" w:sz="4" w:space="0" w:color="auto"/>
+            <w:right w:val="single" w:sz="4" w:space="0" w:color="auto"/>
           </w:tcBorders>
         </w:tcPr>
         <w:p>
           <w:pPr>
-            <w:pStyle w:val="14"/>
-            <w:rPr>
-              <w:rFonts w:hint="default" w:ascii="Verdana" w:hAnsi="Verdana"/>
+            <w:pStyle w:val="Footer"/>
+            <w:rPr>
+              <w:rFonts w:ascii="Verdana" w:hAnsi="Verdana"/>
               <w:b/>
               <w:sz w:val="18"/>
               <w:szCs w:val="18"/>
-              <w:u w:val="none"/>
               <w:lang w:val="en-US"/>
             </w:rPr>
           </w:pPr>
@@ -912,37 +998,58 @@
               <w:b/>
               <w:sz w:val="18"/>
               <w:szCs w:val="18"/>
-              <w:u w:val="none"/>
             </w:rPr>
             <w:t>:</w:t>
           </w:r>
           <w:r>
             <w:rPr>
-              <w:rFonts w:hint="default" w:ascii="Verdana" w:hAnsi="Verdana"/>
+              <w:rFonts w:ascii="Verdana" w:hAnsi="Verdana"/>
               <w:b/>
               <w:sz w:val="18"/>
               <w:szCs w:val="18"/>
-              <w:u w:val="none"/>
               <w:lang w:val="en-US"/>
             </w:rPr>
             <w:t xml:space="preserve"> </w:t>
           </w:r>
           <w:r>
             <w:rPr>
-              <w:rFonts w:hint="default" w:ascii="Verdana" w:hAnsi="Verdana"/>
+              <w:rFonts w:ascii="Verdana" w:hAnsi="Verdana"/>
               <w:b/>
               <w:bCs/>
               <w:sz w:val="18"/>
               <w:szCs w:val="18"/>
-              <w:u w:val="none"/>
-              <w:lang w:val="en-US"/>
-            </w:rPr>
-            <w:t>{OverallRemarks}</w:t>
-          </w:r>
-        </w:p>
-        <w:p>
-          <w:pPr>
-            <w:pStyle w:val="14"/>
+              <w:lang w:val="en-US"/>
+            </w:rPr>
+            <w:t>{</w:t>
+          </w:r>
+          <w:proofErr w:type="spellStart"/>
+          <w:r>
+            <w:rPr>
+              <w:rFonts w:ascii="Verdana" w:hAnsi="Verdana"/>
+              <w:b/>
+              <w:bCs/>
+              <w:sz w:val="18"/>
+              <w:szCs w:val="18"/>
+              <w:lang w:val="en-US"/>
+            </w:rPr>
+            <w:t>OverallRemarks</w:t>
+          </w:r>
+          <w:proofErr w:type="spellEnd"/>
+          <w:r>
+            <w:rPr>
+              <w:rFonts w:ascii="Verdana" w:hAnsi="Verdana"/>
+              <w:b/>
+              <w:bCs/>
+              <w:sz w:val="18"/>
+              <w:szCs w:val="18"/>
+              <w:lang w:val="en-US"/>
+            </w:rPr>
+            <w:t>}</w:t>
+          </w:r>
+        </w:p>
+        <w:p>
+          <w:pPr>
+            <w:pStyle w:val="Footer"/>
             <w:rPr>
               <w:rFonts w:ascii="Verdana" w:hAnsi="Verdana"/>
               <w:b/>
@@ -956,16 +1063,16 @@
         <w:tcPr>
           <w:tcW w:w="2006" w:type="dxa"/>
           <w:tcBorders>
-            <w:top w:val="single" w:color="auto" w:sz="4" w:space="0"/>
-            <w:left w:val="single" w:color="auto" w:sz="4" w:space="0"/>
-            <w:bottom w:val="single" w:color="auto" w:sz="4" w:space="0"/>
+            <w:top w:val="single" w:sz="4" w:space="0" w:color="auto"/>
+            <w:left w:val="single" w:sz="4" w:space="0" w:color="auto"/>
+            <w:bottom w:val="single" w:sz="4" w:space="0" w:color="auto"/>
             <w:right w:val="nil"/>
           </w:tcBorders>
           <w:vAlign w:val="center"/>
         </w:tcPr>
         <w:p>
           <w:pPr>
-            <w:pStyle w:val="14"/>
+            <w:pStyle w:val="Footer"/>
             <w:rPr>
               <w:rFonts w:ascii="Verdana" w:hAnsi="Verdana"/>
               <w:b/>
@@ -988,18 +1095,11 @@
                 <w14:uncheckedState w14:val="2610" w14:font="MS Gothic"/>
               </w14:checkbox>
             </w:sdtPr>
-            <w:sdtEndPr>
-              <w:rPr>
-                <w:rFonts w:ascii="Verdana" w:hAnsi="Verdana"/>
-                <w:b/>
-                <w:sz w:val="18"/>
-                <w:szCs w:val="18"/>
-              </w:rPr>
-            </w:sdtEndPr>
+            <w:sdtEndPr/>
             <w:sdtContent>
               <w:r>
                 <w:rPr>
-                  <w:rFonts w:hint="eastAsia" w:ascii="MS Gothic" w:hAnsi="MS Gothic" w:eastAsia="MS Gothic"/>
+                  <w:rFonts w:ascii="MS Gothic" w:eastAsia="MS Gothic" w:hAnsi="MS Gothic" w:hint="eastAsia"/>
                   <w:b/>
                   <w:sz w:val="18"/>
                   <w:szCs w:val="18"/>
@@ -1023,16 +1123,16 @@
         <w:tcPr>
           <w:tcW w:w="1613" w:type="dxa"/>
           <w:tcBorders>
-            <w:top w:val="single" w:color="auto" w:sz="4" w:space="0"/>
+            <w:top w:val="single" w:sz="4" w:space="0" w:color="auto"/>
             <w:left w:val="nil"/>
-            <w:bottom w:val="single" w:color="auto" w:sz="4" w:space="0"/>
-            <w:right w:val="single" w:color="auto" w:sz="4" w:space="0"/>
+            <w:bottom w:val="single" w:sz="4" w:space="0" w:color="auto"/>
+            <w:right w:val="single" w:sz="4" w:space="0" w:color="auto"/>
           </w:tcBorders>
           <w:vAlign w:val="center"/>
         </w:tcPr>
         <w:p>
           <w:pPr>
-            <w:pStyle w:val="14"/>
+            <w:pStyle w:val="Footer"/>
             <w:rPr>
               <w:rFonts w:ascii="Verdana" w:hAnsi="Verdana"/>
               <w:b/>
@@ -1055,18 +1155,11 @@
                 <w14:uncheckedState w14:val="2610" w14:font="MS Gothic"/>
               </w14:checkbox>
             </w:sdtPr>
-            <w:sdtEndPr>
-              <w:rPr>
-                <w:rFonts w:ascii="Verdana" w:hAnsi="Verdana"/>
-                <w:b/>
-                <w:sz w:val="18"/>
-                <w:szCs w:val="18"/>
-              </w:rPr>
-            </w:sdtEndPr>
+            <w:sdtEndPr/>
             <w:sdtContent>
               <w:r>
                 <w:rPr>
-                  <w:rFonts w:hint="eastAsia" w:ascii="MS Gothic" w:hAnsi="MS Gothic" w:eastAsia="MS Gothic"/>
+                  <w:rFonts w:ascii="MS Gothic" w:eastAsia="MS Gothic" w:hAnsi="MS Gothic" w:hint="eastAsia"/>
                   <w:b/>
                   <w:sz w:val="18"/>
                   <w:szCs w:val="18"/>
@@ -1088,29 +1181,13 @@
       </w:tc>
     </w:tr>
     <w:tr>
-      <w:tblPrEx>
-        <w:tblBorders>
-          <w:top w:val="single" w:color="auto" w:sz="4" w:space="0"/>
-          <w:left w:val="single" w:color="auto" w:sz="4" w:space="0"/>
-          <w:bottom w:val="single" w:color="auto" w:sz="4" w:space="0"/>
-          <w:right w:val="single" w:color="auto" w:sz="4" w:space="0"/>
-          <w:insideH w:val="single" w:color="auto" w:sz="4" w:space="0"/>
-          <w:insideV w:val="single" w:color="auto" w:sz="4" w:space="0"/>
-        </w:tblBorders>
-        <w:tblCellMar>
-          <w:top w:w="0" w:type="dxa"/>
-          <w:left w:w="108" w:type="dxa"/>
-          <w:bottom w:w="0" w:type="dxa"/>
-          <w:right w:w="108" w:type="dxa"/>
-        </w:tblCellMar>
-      </w:tblPrEx>
       <w:tc>
         <w:tcPr>
           <w:tcW w:w="3446" w:type="dxa"/>
         </w:tcPr>
         <w:p>
           <w:pPr>
-            <w:pStyle w:val="14"/>
+            <w:pStyle w:val="Footer"/>
             <w:rPr>
               <w:rFonts w:ascii="Verdana" w:hAnsi="Verdana"/>
               <w:sz w:val="18"/>
@@ -1133,7 +1210,7 @@
         </w:tcPr>
         <w:p>
           <w:pPr>
-            <w:pStyle w:val="14"/>
+            <w:pStyle w:val="Footer"/>
             <w:rPr>
               <w:rFonts w:ascii="Verdana" w:hAnsi="Verdana"/>
               <w:sz w:val="18"/>
@@ -1155,12 +1232,12 @@
           <w:tcW w:w="3619" w:type="dxa"/>
           <w:gridSpan w:val="2"/>
           <w:tcBorders>
-            <w:top w:val="single" w:color="auto" w:sz="4" w:space="0"/>
+            <w:top w:val="single" w:sz="4" w:space="0" w:color="auto"/>
           </w:tcBorders>
         </w:tcPr>
         <w:p>
           <w:pPr>
-            <w:pStyle w:val="14"/>
+            <w:pStyle w:val="Footer"/>
             <w:rPr>
               <w:rFonts w:ascii="Verdana" w:hAnsi="Verdana"/>
               <w:sz w:val="18"/>
@@ -1179,79 +1256,83 @@
       </w:tc>
     </w:tr>
     <w:tr>
-      <w:tblPrEx>
-        <w:tblBorders>
-          <w:top w:val="single" w:color="auto" w:sz="4" w:space="0"/>
-          <w:left w:val="single" w:color="auto" w:sz="4" w:space="0"/>
-          <w:bottom w:val="single" w:color="auto" w:sz="4" w:space="0"/>
-          <w:right w:val="single" w:color="auto" w:sz="4" w:space="0"/>
-          <w:insideH w:val="single" w:color="auto" w:sz="4" w:space="0"/>
-          <w:insideV w:val="single" w:color="auto" w:sz="4" w:space="0"/>
-        </w:tblBorders>
-        <w:tblCellMar>
-          <w:top w:w="0" w:type="dxa"/>
-          <w:left w:w="108" w:type="dxa"/>
-          <w:bottom w:w="0" w:type="dxa"/>
-          <w:right w:w="108" w:type="dxa"/>
-        </w:tblCellMar>
-      </w:tblPrEx>
       <w:tc>
         <w:tcPr>
           <w:tcW w:w="3446" w:type="dxa"/>
         </w:tcPr>
         <w:p>
           <w:pPr>
-            <w:pStyle w:val="14"/>
-            <w:rPr>
-              <w:rFonts w:ascii="Verdana" w:hAnsi="Verdana"/>
-              <w:sz w:val="18"/>
-              <w:szCs w:val="18"/>
-            </w:rPr>
-          </w:pPr>
-        </w:p>
-        <w:p>
-          <w:pPr>
-            <w:pStyle w:val="14"/>
-            <w:rPr>
-              <w:rFonts w:ascii="Verdana" w:hAnsi="Verdana"/>
-              <w:sz w:val="18"/>
-              <w:szCs w:val="18"/>
-            </w:rPr>
-          </w:pPr>
-        </w:p>
-        <w:p>
-          <w:pPr>
-            <w:pStyle w:val="14"/>
-            <w:rPr>
-              <w:rFonts w:hint="default" w:ascii="Verdana" w:hAnsi="Verdana"/>
-              <w:sz w:val="18"/>
-              <w:szCs w:val="18"/>
-              <w:lang w:val="en-US"/>
-            </w:rPr>
-          </w:pPr>
-          <w:r>
-            <w:rPr>
-              <w:rFonts w:hint="default" w:ascii="Verdana" w:hAnsi="Verdana"/>
-              <w:sz w:val="18"/>
-              <w:szCs w:val="18"/>
-              <w:lang w:val="en-US"/>
-            </w:rPr>
-            <w:t>{AnalyzedBy}</w:t>
-          </w:r>
-        </w:p>
-        <w:p>
-          <w:pPr>
-            <w:pStyle w:val="14"/>
-            <w:rPr>
-              <w:rFonts w:hint="default" w:ascii="Verdana" w:hAnsi="Verdana"/>
-              <w:sz w:val="18"/>
-              <w:szCs w:val="18"/>
-              <w:lang w:val="en-US"/>
-            </w:rPr>
-          </w:pPr>
-          <w:r>
-            <w:rPr>
-              <w:rFonts w:hint="default" w:ascii="Verdana" w:hAnsi="Verdana"/>
+            <w:pStyle w:val="Footer"/>
+            <w:rPr>
+              <w:rFonts w:ascii="Verdana" w:hAnsi="Verdana"/>
+              <w:sz w:val="18"/>
+              <w:szCs w:val="18"/>
+            </w:rPr>
+          </w:pPr>
+        </w:p>
+        <w:p>
+          <w:pPr>
+            <w:pStyle w:val="Footer"/>
+            <w:rPr>
+              <w:rFonts w:ascii="Verdana" w:hAnsi="Verdana"/>
+              <w:sz w:val="18"/>
+              <w:szCs w:val="18"/>
+            </w:rPr>
+          </w:pPr>
+        </w:p>
+        <w:p>
+          <w:pPr>
+            <w:pStyle w:val="Footer"/>
+            <w:rPr>
+              <w:rFonts w:ascii="Verdana" w:hAnsi="Verdana"/>
+              <w:sz w:val="18"/>
+              <w:szCs w:val="18"/>
+              <w:lang w:val="en-US"/>
+            </w:rPr>
+          </w:pPr>
+          <w:r>
+            <w:rPr>
+              <w:rFonts w:ascii="Verdana" w:hAnsi="Verdana"/>
+              <w:sz w:val="18"/>
+              <w:szCs w:val="18"/>
+              <w:lang w:val="en-US"/>
+            </w:rPr>
+            <w:t>{</w:t>
+          </w:r>
+          <w:proofErr w:type="spellStart"/>
+          <w:r>
+            <w:rPr>
+              <w:rFonts w:ascii="Verdana" w:hAnsi="Verdana"/>
+              <w:sz w:val="18"/>
+              <w:szCs w:val="18"/>
+              <w:lang w:val="en-US"/>
+            </w:rPr>
+            <w:t>AnalyzedBy</w:t>
+          </w:r>
+          <w:proofErr w:type="spellEnd"/>
+          <w:r>
+            <w:rPr>
+              <w:rFonts w:ascii="Verdana" w:hAnsi="Verdana"/>
+              <w:sz w:val="18"/>
+              <w:szCs w:val="18"/>
+              <w:lang w:val="en-US"/>
+            </w:rPr>
+            <w:t>}</w:t>
+          </w:r>
+        </w:p>
+        <w:p>
+          <w:pPr>
+            <w:pStyle w:val="Footer"/>
+            <w:rPr>
+              <w:rFonts w:ascii="Verdana" w:hAnsi="Verdana"/>
+              <w:sz w:val="18"/>
+              <w:szCs w:val="18"/>
+              <w:lang w:val="en-US"/>
+            </w:rPr>
+          </w:pPr>
+          <w:r>
+            <w:rPr>
+              <w:rFonts w:ascii="Verdana" w:hAnsi="Verdana"/>
               <w:sz w:val="18"/>
               <w:szCs w:val="18"/>
               <w:lang w:val="en-US"/>
@@ -1261,9 +1342,9 @@
         </w:p>
         <w:p>
           <w:pPr>
-            <w:pStyle w:val="14"/>
-            <w:rPr>
-              <w:rFonts w:hint="default" w:ascii="Verdana" w:hAnsi="Verdana"/>
+            <w:pStyle w:val="Footer"/>
+            <w:rPr>
+              <w:rFonts w:ascii="Verdana" w:hAnsi="Verdana"/>
               <w:sz w:val="18"/>
               <w:szCs w:val="18"/>
               <w:lang w:val="en-US"/>
@@ -1277,55 +1358,65 @@
         </w:tcPr>
         <w:p>
           <w:pPr>
-            <w:pStyle w:val="14"/>
-            <w:rPr>
-              <w:rFonts w:ascii="Verdana" w:hAnsi="Verdana"/>
-              <w:sz w:val="18"/>
-              <w:szCs w:val="18"/>
-            </w:rPr>
-          </w:pPr>
-        </w:p>
-        <w:p>
-          <w:pPr>
-            <w:pStyle w:val="14"/>
-            <w:rPr>
-              <w:rFonts w:ascii="Verdana" w:hAnsi="Verdana"/>
-              <w:sz w:val="18"/>
-              <w:szCs w:val="18"/>
-            </w:rPr>
-          </w:pPr>
-        </w:p>
-        <w:p>
-          <w:pPr>
-            <w:pStyle w:val="14"/>
-            <w:rPr>
-              <w:rFonts w:ascii="Verdana" w:hAnsi="Verdana"/>
-              <w:sz w:val="18"/>
-              <w:szCs w:val="18"/>
-            </w:rPr>
-          </w:pPr>
-          <w:r>
-            <w:rPr>
-              <w:rFonts w:ascii="Verdana" w:hAnsi="Verdana"/>
-              <w:sz w:val="18"/>
-              <w:szCs w:val="18"/>
-            </w:rPr>
-            <w:t>Celeste P. Yandug</w:t>
-          </w:r>
-        </w:p>
-        <w:p>
-          <w:pPr>
-            <w:pStyle w:val="14"/>
-            <w:rPr>
-              <w:rFonts w:hint="default" w:ascii="Verdana" w:hAnsi="Verdana"/>
-              <w:sz w:val="18"/>
-              <w:szCs w:val="18"/>
-              <w:lang w:val="en-US"/>
-            </w:rPr>
-          </w:pPr>
-          <w:r>
-            <w:rPr>
-              <w:rFonts w:hint="default" w:ascii="Verdana" w:hAnsi="Verdana"/>
+            <w:pStyle w:val="Footer"/>
+            <w:rPr>
+              <w:rFonts w:ascii="Verdana" w:hAnsi="Verdana"/>
+              <w:sz w:val="18"/>
+              <w:szCs w:val="18"/>
+            </w:rPr>
+          </w:pPr>
+        </w:p>
+        <w:p>
+          <w:pPr>
+            <w:pStyle w:val="Footer"/>
+            <w:rPr>
+              <w:rFonts w:ascii="Verdana" w:hAnsi="Verdana"/>
+              <w:sz w:val="18"/>
+              <w:szCs w:val="18"/>
+            </w:rPr>
+          </w:pPr>
+        </w:p>
+        <w:p>
+          <w:pPr>
+            <w:pStyle w:val="Footer"/>
+            <w:rPr>
+              <w:rFonts w:ascii="Verdana" w:hAnsi="Verdana"/>
+              <w:sz w:val="18"/>
+              <w:szCs w:val="18"/>
+            </w:rPr>
+          </w:pPr>
+          <w:r>
+            <w:rPr>
+              <w:rFonts w:ascii="Verdana" w:hAnsi="Verdana"/>
+              <w:sz w:val="18"/>
+              <w:szCs w:val="18"/>
+            </w:rPr>
+            <w:t xml:space="preserve">Celeste P. </w:t>
+          </w:r>
+          <w:proofErr w:type="spellStart"/>
+          <w:r>
+            <w:rPr>
+              <w:rFonts w:ascii="Verdana" w:hAnsi="Verdana"/>
+              <w:sz w:val="18"/>
+              <w:szCs w:val="18"/>
+            </w:rPr>
+            <w:t>Yandug</w:t>
+          </w:r>
+          <w:proofErr w:type="spellEnd"/>
+        </w:p>
+        <w:p>
+          <w:pPr>
+            <w:pStyle w:val="Footer"/>
+            <w:rPr>
+              <w:rFonts w:ascii="Verdana" w:hAnsi="Verdana"/>
+              <w:sz w:val="18"/>
+              <w:szCs w:val="18"/>
+              <w:lang w:val="en-US"/>
+            </w:rPr>
+          </w:pPr>
+          <w:r>
+            <w:rPr>
+              <w:rFonts w:ascii="Verdana" w:hAnsi="Verdana"/>
               <w:sz w:val="18"/>
               <w:szCs w:val="18"/>
               <w:lang w:val="en-US"/>
@@ -1341,27 +1432,27 @@
         </w:tcPr>
         <w:p>
           <w:pPr>
-            <w:pStyle w:val="14"/>
-            <w:rPr>
-              <w:rFonts w:ascii="Verdana" w:hAnsi="Verdana"/>
-              <w:sz w:val="18"/>
-              <w:szCs w:val="18"/>
-            </w:rPr>
-          </w:pPr>
-        </w:p>
-        <w:p>
-          <w:pPr>
-            <w:pStyle w:val="14"/>
-            <w:rPr>
-              <w:rFonts w:ascii="Verdana" w:hAnsi="Verdana"/>
-              <w:sz w:val="18"/>
-              <w:szCs w:val="18"/>
-            </w:rPr>
-          </w:pPr>
-        </w:p>
-        <w:p>
-          <w:pPr>
-            <w:pStyle w:val="14"/>
+            <w:pStyle w:val="Footer"/>
+            <w:rPr>
+              <w:rFonts w:ascii="Verdana" w:hAnsi="Verdana"/>
+              <w:sz w:val="18"/>
+              <w:szCs w:val="18"/>
+            </w:rPr>
+          </w:pPr>
+        </w:p>
+        <w:p>
+          <w:pPr>
+            <w:pStyle w:val="Footer"/>
+            <w:rPr>
+              <w:rFonts w:ascii="Verdana" w:hAnsi="Verdana"/>
+              <w:sz w:val="18"/>
+              <w:szCs w:val="18"/>
+            </w:rPr>
+          </w:pPr>
+        </w:p>
+        <w:p>
+          <w:pPr>
+            <w:pStyle w:val="Footer"/>
             <w:rPr>
               <w:rFonts w:ascii="Verdana" w:hAnsi="Verdana"/>
               <w:sz w:val="18"/>
@@ -1379,7 +1470,7 @@
         </w:p>
         <w:p>
           <w:pPr>
-            <w:pStyle w:val="14"/>
+            <w:pStyle w:val="Footer"/>
             <w:rPr>
               <w:rFonts w:ascii="Verdana" w:hAnsi="Verdana"/>
               <w:sz w:val="18"/>
@@ -1398,24 +1489,8 @@
       </w:tc>
     </w:tr>
     <w:tr>
-      <w:tblPrEx>
-        <w:tblBorders>
-          <w:top w:val="single" w:color="auto" w:sz="4" w:space="0"/>
-          <w:left w:val="single" w:color="auto" w:sz="4" w:space="0"/>
-          <w:bottom w:val="single" w:color="auto" w:sz="4" w:space="0"/>
-          <w:right w:val="single" w:color="auto" w:sz="4" w:space="0"/>
-          <w:insideH w:val="single" w:color="auto" w:sz="4" w:space="0"/>
-          <w:insideV w:val="single" w:color="auto" w:sz="4" w:space="0"/>
-        </w:tblBorders>
-        <w:tblCellMar>
-          <w:top w:w="0" w:type="dxa"/>
-          <w:left w:w="108" w:type="dxa"/>
-          <w:bottom w:w="0" w:type="dxa"/>
-          <w:right w:w="108" w:type="dxa"/>
-        </w:tblCellMar>
-      </w:tblPrEx>
       <w:trPr>
-        <w:trHeight w:val="203" w:hRule="atLeast"/>
+        <w:trHeight w:val="203"/>
       </w:trPr>
       <w:tc>
         <w:tcPr>
@@ -1423,9 +1498,9 @@
         </w:tcPr>
         <w:p>
           <w:pPr>
-            <w:pStyle w:val="14"/>
-            <w:rPr>
-              <w:rFonts w:hint="default" w:ascii="Verdana" w:hAnsi="Verdana"/>
+            <w:pStyle w:val="Footer"/>
+            <w:rPr>
+              <w:rFonts w:ascii="Verdana" w:hAnsi="Verdana"/>
               <w:sz w:val="18"/>
               <w:szCs w:val="18"/>
               <w:lang w:val="en-US"/>
@@ -1441,29 +1516,32 @@
           </w:r>
           <w:r>
             <w:rPr>
-              <w:rFonts w:hint="default" w:ascii="Verdana" w:hAnsi="Verdana"/>
-              <w:sz w:val="18"/>
-              <w:szCs w:val="18"/>
-              <w:lang w:val="en-US"/>
-            </w:rPr>
-            <w:t>08/13</w:t>
-          </w:r>
-          <w:r>
-            <w:rPr>
-              <w:rFonts w:ascii="Verdana" w:hAnsi="Verdana"/>
-              <w:sz w:val="18"/>
-              <w:szCs w:val="18"/>
-            </w:rPr>
-            <w:t>/202</w:t>
-          </w:r>
-          <w:r>
-            <w:rPr>
-              <w:rFonts w:hint="default" w:ascii="Verdana" w:hAnsi="Verdana"/>
-              <w:sz w:val="18"/>
-              <w:szCs w:val="18"/>
-              <w:lang w:val="en-US"/>
-            </w:rPr>
-            <w:t>6</w:t>
+              <w:rFonts w:ascii="Verdana" w:hAnsi="Verdana"/>
+              <w:sz w:val="18"/>
+              <w:szCs w:val="18"/>
+              <w:lang w:val="en-US"/>
+            </w:rPr>
+            <w:t>{</w:t>
+          </w:r>
+          <w:proofErr w:type="spellStart"/>
+          <w:r>
+            <w:rPr>
+              <w:rFonts w:ascii="Verdana" w:hAnsi="Verdana"/>
+              <w:sz w:val="18"/>
+              <w:szCs w:val="18"/>
+              <w:lang w:val="en-US"/>
+            </w:rPr>
+            <w:t>DateReleased</w:t>
+          </w:r>
+          <w:proofErr w:type="spellEnd"/>
+          <w:r>
+            <w:rPr>
+              <w:rFonts w:ascii="Verdana" w:hAnsi="Verdana"/>
+              <w:sz w:val="18"/>
+              <w:szCs w:val="18"/>
+              <w:lang w:val="en-US"/>
+            </w:rPr>
+            <w:t>}</w:t>
           </w:r>
         </w:p>
       </w:tc>
@@ -1473,7 +1551,7 @@
         </w:tcPr>
         <w:p>
           <w:pPr>
-            <w:pStyle w:val="14"/>
+            <w:pStyle w:val="Footer"/>
             <w:rPr>
               <w:rFonts w:ascii="Verdana" w:hAnsi="Verdana"/>
               <w:sz w:val="18"/>
@@ -1497,7 +1575,7 @@
         </w:tcPr>
         <w:p>
           <w:pPr>
-            <w:pStyle w:val="14"/>
+            <w:pStyle w:val="Footer"/>
             <w:rPr>
               <w:rFonts w:ascii="Verdana" w:hAnsi="Verdana"/>
               <w:sz w:val="18"/>
@@ -1518,7 +1596,7 @@
   </w:tbl>
   <w:p>
     <w:pPr>
-      <w:pStyle w:val="14"/>
+      <w:pStyle w:val="Footer"/>
       <w:rPr>
         <w:rFonts w:ascii="Verdana" w:hAnsi="Verdana"/>
         <w:sz w:val="16"/>
@@ -1527,12 +1605,13 @@
     </w:pPr>
     <w:r>
       <w:rPr>
+        <w:noProof/>
         <w:sz w:val="16"/>
       </w:rPr>
       <mc:AlternateContent>
         <mc:Choice Requires="wps">
           <w:drawing>
-            <wp:anchor distT="0" distB="0" distL="114300" distR="114300" simplePos="0" relativeHeight="251661312" behindDoc="0" locked="0" layoutInCell="1" allowOverlap="1">
+            <wp:anchor distT="0" distB="0" distL="114300" distR="114300" simplePos="0" relativeHeight="251661312" behindDoc="0" locked="0" layoutInCell="1" allowOverlap="1" wp14:anchorId="1F7BDDAD" wp14:editId="1F7BDDAE">
               <wp:simplePos x="0" y="0"/>
               <wp:positionH relativeFrom="margin">
                 <wp:posOffset>6496050</wp:posOffset>
@@ -1580,16 +1659,16 @@
                       <w:txbxContent>
                         <w:p>
                           <w:pPr>
-                            <w:pStyle w:val="14"/>
+                            <w:pStyle w:val="Footer"/>
                             <w:rPr>
-                              <w:rFonts w:hint="default" w:ascii="Verdana" w:hAnsi="Verdana" w:cs="Verdana"/>
+                              <w:rFonts w:ascii="Verdana" w:hAnsi="Verdana" w:cs="Verdana"/>
                               <w:sz w:val="16"/>
                               <w:szCs w:val="16"/>
                             </w:rPr>
                           </w:pPr>
                           <w:r>
                             <w:rPr>
-                              <w:rFonts w:hint="default" w:ascii="Verdana" w:hAnsi="Verdana" w:cs="Verdana"/>
+                              <w:rFonts w:ascii="Verdana" w:hAnsi="Verdana" w:cs="Verdana"/>
                               <w:sz w:val="16"/>
                               <w:szCs w:val="16"/>
                             </w:rPr>
@@ -1597,7 +1676,7 @@
                           </w:r>
                           <w:r>
                             <w:rPr>
-                              <w:rFonts w:hint="default" w:ascii="Verdana" w:hAnsi="Verdana" w:cs="Verdana"/>
+                              <w:rFonts w:ascii="Verdana" w:hAnsi="Verdana" w:cs="Verdana"/>
                               <w:sz w:val="16"/>
                               <w:szCs w:val="16"/>
                             </w:rPr>
@@ -1605,7 +1684,7 @@
                           </w:r>
                           <w:r>
                             <w:rPr>
-                              <w:rFonts w:hint="default" w:ascii="Verdana" w:hAnsi="Verdana" w:cs="Verdana"/>
+                              <w:rFonts w:ascii="Verdana" w:hAnsi="Verdana" w:cs="Verdana"/>
                               <w:sz w:val="16"/>
                               <w:szCs w:val="16"/>
                             </w:rPr>
@@ -1613,7 +1692,7 @@
                           </w:r>
                           <w:r>
                             <w:rPr>
-                              <w:rFonts w:hint="default" w:ascii="Verdana" w:hAnsi="Verdana" w:cs="Verdana"/>
+                              <w:rFonts w:ascii="Verdana" w:hAnsi="Verdana" w:cs="Verdana"/>
                               <w:sz w:val="16"/>
                               <w:szCs w:val="16"/>
                             </w:rPr>
@@ -1621,7 +1700,7 @@
                           </w:r>
                           <w:r>
                             <w:rPr>
-                              <w:rFonts w:hint="default" w:ascii="Verdana" w:hAnsi="Verdana" w:cs="Verdana"/>
+                              <w:rFonts w:ascii="Verdana" w:hAnsi="Verdana" w:cs="Verdana"/>
                               <w:sz w:val="16"/>
                               <w:szCs w:val="16"/>
                             </w:rPr>
@@ -1629,7 +1708,7 @@
                           </w:r>
                           <w:r>
                             <w:rPr>
-                              <w:rFonts w:hint="default" w:ascii="Verdana" w:hAnsi="Verdana" w:cs="Verdana"/>
+                              <w:rFonts w:ascii="Verdana" w:hAnsi="Verdana" w:cs="Verdana"/>
                               <w:sz w:val="16"/>
                               <w:szCs w:val="16"/>
                             </w:rPr>
@@ -1637,7 +1716,7 @@
                           </w:r>
                           <w:r>
                             <w:rPr>
-                              <w:rFonts w:hint="default" w:ascii="Verdana" w:hAnsi="Verdana" w:cs="Verdana"/>
+                              <w:rFonts w:ascii="Verdana" w:hAnsi="Verdana" w:cs="Verdana"/>
                               <w:sz w:val="16"/>
                               <w:szCs w:val="16"/>
                             </w:rPr>
@@ -1645,7 +1724,7 @@
                           </w:r>
                           <w:r>
                             <w:rPr>
-                              <w:rFonts w:hint="default" w:ascii="Verdana" w:hAnsi="Verdana" w:cs="Verdana"/>
+                              <w:rFonts w:ascii="Verdana" w:hAnsi="Verdana" w:cs="Verdana"/>
                               <w:sz w:val="16"/>
                               <w:szCs w:val="16"/>
                             </w:rPr>
@@ -1653,7 +1732,7 @@
                           </w:r>
                           <w:r>
                             <w:rPr>
-                              <w:rFonts w:hint="default" w:ascii="Verdana" w:hAnsi="Verdana" w:cs="Verdana"/>
+                              <w:rFonts w:ascii="Verdana" w:hAnsi="Verdana" w:cs="Verdana"/>
                               <w:sz w:val="16"/>
                               <w:szCs w:val="16"/>
                             </w:rPr>
@@ -1661,7 +1740,7 @@
                           </w:r>
                           <w:r>
                             <w:rPr>
-                              <w:rFonts w:hint="default" w:ascii="Verdana" w:hAnsi="Verdana" w:cs="Verdana"/>
+                              <w:rFonts w:ascii="Verdana" w:hAnsi="Verdana" w:cs="Verdana"/>
                               <w:sz w:val="16"/>
                               <w:szCs w:val="16"/>
                             </w:rPr>
@@ -1669,7 +1748,7 @@
                           </w:r>
                           <w:r>
                             <w:rPr>
-                              <w:rFonts w:hint="default" w:ascii="Verdana" w:hAnsi="Verdana" w:cs="Verdana"/>
+                              <w:rFonts w:ascii="Verdana" w:hAnsi="Verdana" w:cs="Verdana"/>
                               <w:sz w:val="16"/>
                               <w:szCs w:val="16"/>
                             </w:rPr>
@@ -1677,7 +1756,7 @@
                           </w:r>
                           <w:r>
                             <w:rPr>
-                              <w:rFonts w:hint="default" w:ascii="Verdana" w:hAnsi="Verdana" w:cs="Verdana"/>
+                              <w:rFonts w:ascii="Verdana" w:hAnsi="Verdana" w:cs="Verdana"/>
                               <w:sz w:val="16"/>
                               <w:szCs w:val="16"/>
                             </w:rPr>
@@ -1686,7 +1765,7 @@
                         </w:p>
                       </w:txbxContent>
                     </wps:txbx>
-                    <wps:bodyPr rot="0" spcFirstLastPara="0" vertOverflow="overflow" horzOverflow="overflow" vert="horz" wrap="none" lIns="0" tIns="0" rIns="0" bIns="0" numCol="1" spcCol="0" rtlCol="0" fromWordArt="0" anchor="t" anchorCtr="0" forceAA="0" upright="0" compatLnSpc="1">
+                    <wps:bodyPr rot="0" spcFirstLastPara="0" vertOverflow="overflow" horzOverflow="overflow" vert="horz" wrap="none" lIns="0" tIns="0" rIns="0" bIns="0" numCol="1" spcCol="0" rtlCol="0" fromWordArt="0" anchor="t" anchorCtr="0" forceAA="0" compatLnSpc="1">
                       <a:spAutoFit/>
                     </wps:bodyPr>
                   </wps:wsp>
@@ -1695,7 +1774,7 @@
             </wp:anchor>
           </w:drawing>
         </mc:Choice>
-        <mc:Fallback>
+        <mc:Fallback xmlns:wpsCustomData="http://www.wps.cn/officeDocument/2013/wpsCustomData">
           <w:pict>
             <v:shape id="_x0000_s1026" o:spid="_x0000_s1026" o:spt="202" type="#_x0000_t202" style="position:absolute;left:0pt;margin-left:511.5pt;margin-top:3.6pt;height:144pt;width:144pt;mso-position-horizontal-relative:margin;mso-wrap-style:none;z-index:251661312;mso-width-relative:page;mso-height-relative:page;" filled="f" stroked="f" coordsize="21600,21600" o:gfxdata="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">
               <v:fill on="f" focussize="0,0"/>
@@ -1820,9 +1899,9 @@
   </w:p>
   <w:p>
     <w:pPr>
-      <w:pStyle w:val="14"/>
+      <w:pStyle w:val="Footer"/>
       <w:rPr>
-        <w:rFonts w:hint="default" w:ascii="Verdana" w:hAnsi="Verdana"/>
+        <w:rFonts w:ascii="Verdana" w:hAnsi="Verdana"/>
         <w:sz w:val="16"/>
         <w:szCs w:val="16"/>
         <w:lang w:val="en-US" w:eastAsia="en-PH"/>
@@ -1854,7 +1933,7 @@
     </w:r>
     <w:r>
       <w:rPr>
-        <w:rFonts w:hint="default" w:ascii="Verdana" w:hAnsi="Verdana"/>
+        <w:rFonts w:ascii="Verdana" w:hAnsi="Verdana"/>
         <w:sz w:val="16"/>
         <w:szCs w:val="16"/>
         <w:lang w:val="en-US"/>
@@ -1864,7 +1943,7 @@
   </w:p>
   <w:p>
     <w:pPr>
-      <w:pStyle w:val="14"/>
+      <w:pStyle w:val="Footer"/>
       <w:rPr>
         <w:rFonts w:ascii="Verdana" w:hAnsi="Verdana"/>
         <w:sz w:val="18"/>
@@ -1874,7 +1953,7 @@
   </w:p>
   <w:p>
     <w:pPr>
-      <w:pStyle w:val="14"/>
+      <w:pStyle w:val="Footer"/>
       <w:rPr>
         <w:rFonts w:ascii="Verdana" w:hAnsi="Verdana"/>
         <w:sz w:val="18"/>
@@ -1884,7 +1963,7 @@
   </w:p>
   <w:p>
     <w:pPr>
-      <w:pStyle w:val="14"/>
+      <w:pStyle w:val="Footer"/>
       <w:rPr>
         <w:rFonts w:ascii="Verdana" w:hAnsi="Verdana"/>
         <w:sz w:val="16"/>
@@ -1894,7 +1973,7 @@
   </w:p>
   <w:p>
     <w:pPr>
-      <w:pStyle w:val="14"/>
+      <w:pStyle w:val="Footer"/>
       <w:rPr>
         <w:rFonts w:ascii="Verdana" w:hAnsi="Verdana"/>
         <w:sz w:val="16"/>
@@ -1913,42 +1992,22 @@
 </w:ftr>
 </file>
 
-<file path=word/footer2.xml><?xml version="1.0" encoding="utf-8"?>
-<w:ftr xmlns:wpc="http://schemas.microsoft.com/office/word/2010/wordprocessingCanvas" xmlns:mc="http://schemas.openxmlformats.org/markup-compatibility/2006" xmlns:o="urn:schemas-microsoft-com:office:office" xmlns:r="http://schemas.openxmlformats.org/officeDocument/2006/relationships" xmlns:m="http://schemas.openxmlformats.org/officeDocument/2006/math" xmlns:v="urn:schemas-microsoft-com:vml" xmlns:wp14="http://schemas.microsoft.com/office/word/2010/wordprocessingDrawing" xmlns:wp="http://schemas.openxmlformats.org/drawingml/2006/wordprocessingDrawing" xmlns:w10="urn:schemas-microsoft-com:office:word" xmlns:w="http://schemas.openxmlformats.org/wordprocessingml/2006/main" xmlns:w14="http://schemas.microsoft.com/office/word/2010/wordml" xmlns:w15="http://schemas.microsoft.com/office/word/2012/wordml" xmlns:wpg="http://schemas.microsoft.com/office/word/2010/wordprocessingGroup" xmlns:wpi="http://schemas.microsoft.com/office/word/2010/wordprocessingInk" xmlns:wne="http://schemas.microsoft.com/office/word/2006/wordml" xmlns:wps="http://schemas.microsoft.com/office/word/2010/wordprocessingShape" xmlns:wpsCustomData="http://www.wps.cn/officeDocument/2013/wpsCustomData" mc:Ignorable="w14 w15 wp14">
-  <w:p>
-    <w:pPr>
-      <w:pStyle w:val="14"/>
-    </w:pPr>
-  </w:p>
-</w:ftr>
-</file>
-
-<file path=word/footer3.xml><?xml version="1.0" encoding="utf-8"?>
-<w:ftr xmlns:wpc="http://schemas.microsoft.com/office/word/2010/wordprocessingCanvas" xmlns:mc="http://schemas.openxmlformats.org/markup-compatibility/2006" xmlns:o="urn:schemas-microsoft-com:office:office" xmlns:r="http://schemas.openxmlformats.org/officeDocument/2006/relationships" xmlns:m="http://schemas.openxmlformats.org/officeDocument/2006/math" xmlns:v="urn:schemas-microsoft-com:vml" xmlns:wp14="http://schemas.microsoft.com/office/word/2010/wordprocessingDrawing" xmlns:wp="http://schemas.openxmlformats.org/drawingml/2006/wordprocessingDrawing" xmlns:w10="urn:schemas-microsoft-com:office:word" xmlns:w="http://schemas.openxmlformats.org/wordprocessingml/2006/main" xmlns:w14="http://schemas.microsoft.com/office/word/2010/wordml" xmlns:w15="http://schemas.microsoft.com/office/word/2012/wordml" xmlns:wpg="http://schemas.microsoft.com/office/word/2010/wordprocessingGroup" xmlns:wpi="http://schemas.microsoft.com/office/word/2010/wordprocessingInk" xmlns:wne="http://schemas.microsoft.com/office/word/2006/wordml" xmlns:wps="http://schemas.microsoft.com/office/word/2010/wordprocessingShape" xmlns:wpsCustomData="http://www.wps.cn/officeDocument/2013/wpsCustomData" mc:Ignorable="w14 w15 wp14">
-  <w:p>
-    <w:pPr>
-      <w:pStyle w:val="14"/>
-    </w:pPr>
-  </w:p>
-</w:ftr>
-</file>
-
 <file path=word/footnotes.xml><?xml version="1.0" encoding="utf-8"?>
-<w:footnotes xmlns:wpc="http://schemas.microsoft.com/office/word/2010/wordprocessingCanvas" xmlns:mc="http://schemas.openxmlformats.org/markup-compatibility/2006" xmlns:o="urn:schemas-microsoft-com:office:office" xmlns:r="http://schemas.openxmlformats.org/officeDocument/2006/relationships" xmlns:m="http://schemas.openxmlformats.org/officeDocument/2006/math" xmlns:v="urn:schemas-microsoft-com:vml" xmlns:wp14="http://schemas.microsoft.com/office/word/2010/wordprocessingDrawing" xmlns:wp="http://schemas.openxmlformats.org/drawingml/2006/wordprocessingDrawing" xmlns:w="http://schemas.openxmlformats.org/wordprocessingml/2006/main" xmlns:w14="http://schemas.microsoft.com/office/word/2010/wordml" xmlns:w15="http://schemas.microsoft.com/office/word/2012/wordml" xmlns:w10="urn:schemas-microsoft-com:office:word" xmlns:wpg="http://schemas.microsoft.com/office/word/2010/wordprocessingGroup" xmlns:wpi="http://schemas.microsoft.com/office/word/2010/wordprocessingInk" xmlns:wne="http://schemas.microsoft.com/office/word/2006/wordml" xmlns:wps="http://schemas.microsoft.com/office/word/2010/wordprocessingShape" xmlns:wpsCustomData="http://www.wps.cn/officeDocument/2013/wpsCustomData" mc:Ignorable="w14 w15 wp14">
-  <w:footnote w:type="separator" w:id="0">
+<w:footnotes xmlns:wpc="http://schemas.microsoft.com/office/word/2010/wordprocessingCanvas" xmlns:cx="http://schemas.microsoft.com/office/drawing/2014/chartex" xmlns:cx1="http://schemas.microsoft.com/office/drawing/2015/9/8/chartex" xmlns:cx2="http://schemas.microsoft.com/office/drawing/2015/10/21/chartex" xmlns:cx3="http://schemas.microsoft.com/office/drawing/2016/5/9/chartex" xmlns:cx4="http://schemas.microsoft.com/office/drawing/2016/5/10/chartex" xmlns:cx5="http://schemas.microsoft.com/office/drawing/2016/5/11/chartex" xmlns:cx6="http://schemas.microsoft.com/office/drawing/2016/5/12/chartex" xmlns:cx7="http://schemas.microsoft.com/office/drawing/2016/5/13/chartex" xmlns:cx8="http://schemas.microsoft.com/office/drawing/2016/5/14/chartex" xmlns:mc="http://schemas.openxmlformats.org/markup-compatibility/2006" xmlns:aink="http://schemas.microsoft.com/office/drawing/2016/ink" xmlns:am3d="http://schemas.microsoft.com/office/drawing/2017/model3d" xmlns:o="urn:schemas-microsoft-com:office:office" xmlns:oel="http://schemas.microsoft.com/office/2019/extlst" xmlns:r="http://schemas.openxmlformats.org/officeDocument/2006/relationships" xmlns:m="http://schemas.openxmlformats.org/officeDocument/2006/math" xmlns:v="urn:schemas-microsoft-com:vml" xmlns:wp14="http://schemas.microsoft.com/office/word/2010/wordprocessingDrawing" xmlns:wp="http://schemas.openxmlformats.org/drawingml/2006/wordprocessingDrawing" xmlns:w10="urn:schemas-microsoft-com:office:word" xmlns:w="http://schemas.openxmlformats.org/wordprocessingml/2006/main" xmlns:w14="http://schemas.microsoft.com/office/word/2010/wordml" xmlns:w15="http://schemas.microsoft.com/office/word/2012/wordml" xmlns:w16cei="http://schemas.microsoft.com/office/word/2026/wordml/cei" xmlns:w16cex="http://schemas.microsoft.com/office/word/2018/wordml/cex" xmlns:w16cid="http://schemas.microsoft.com/office/word/2016/wordml/cid" xmlns:w16="http://schemas.microsoft.com/office/word/2018/wordml" xmlns:w16du="http://schemas.microsoft.com/office/word/2023/wordml/word16du" xmlns:w16sdtdh="http://schemas.microsoft.com/office/word/2020/wordml/sdtdatahash" xmlns:w16sdtfl="http://schemas.microsoft.com/office/word/2024/wordml/sdtformatlock" xmlns:w16se="http://schemas.microsoft.com/office/word/2015/wordml/symex" xmlns:wpg="http://schemas.microsoft.com/office/word/2010/wordprocessingGroup" xmlns:wpi="http://schemas.microsoft.com/office/word/2010/wordprocessingInk" xmlns:wne="http://schemas.microsoft.com/office/word/2006/wordml" xmlns:wps="http://schemas.microsoft.com/office/word/2010/wordprocessingShape" mc:Ignorable="w14 w15 w16se w16cid w16 w16cex w16sdtdh w16sdtfl w16du wp14">
+  <w:footnote w:type="separator" w:id="-1">
     <w:p>
       <w:pPr>
-        <w:spacing w:before="0" w:after="0" w:line="249" w:lineRule="auto"/>
+        <w:spacing w:after="0"/>
       </w:pPr>
       <w:r>
         <w:separator/>
       </w:r>
     </w:p>
   </w:footnote>
-  <w:footnote w:type="continuationSeparator" w:id="1">
+  <w:footnote w:type="continuationSeparator" w:id="0">
     <w:p>
       <w:pPr>
-        <w:spacing w:before="0" w:after="0" w:line="249" w:lineRule="auto"/>
+        <w:spacing w:after="0"/>
       </w:pPr>
       <w:r>
         <w:continuationSeparator/>
@@ -1959,10 +2018,10 @@
 </file>
 
 <file path=word/header1.xml><?xml version="1.0" encoding="utf-8"?>
-<w:hdr xmlns:wpc="http://schemas.microsoft.com/office/word/2010/wordprocessingCanvas" xmlns:mc="http://schemas.openxmlformats.org/markup-compatibility/2006" xmlns:o="urn:schemas-microsoft-com:office:office" xmlns:r="http://schemas.openxmlformats.org/officeDocument/2006/relationships" xmlns:m="http://schemas.openxmlformats.org/officeDocument/2006/math" xmlns:v="urn:schemas-microsoft-com:vml" xmlns:wp14="http://schemas.microsoft.com/office/word/2010/wordprocessingDrawing" xmlns:wp="http://schemas.openxmlformats.org/drawingml/2006/wordprocessingDrawing" xmlns:w10="urn:schemas-microsoft-com:office:word" xmlns:w="http://schemas.openxmlformats.org/wordprocessingml/2006/main" xmlns:w14="http://schemas.microsoft.com/office/word/2010/wordml" xmlns:w15="http://schemas.microsoft.com/office/word/2012/wordml" xmlns:wpg="http://schemas.microsoft.com/office/word/2010/wordprocessingGroup" xmlns:wpi="http://schemas.microsoft.com/office/word/2010/wordprocessingInk" xmlns:wne="http://schemas.microsoft.com/office/word/2006/wordml" xmlns:wps="http://schemas.microsoft.com/office/word/2010/wordprocessingShape" xmlns:wpsCustomData="http://www.wps.cn/officeDocument/2013/wpsCustomData" mc:Ignorable="w14 w15 wp14">
+<w:hdr xmlns:wpc="http://schemas.microsoft.com/office/word/2010/wordprocessingCanvas" xmlns:cx="http://schemas.microsoft.com/office/drawing/2014/chartex" xmlns:cx1="http://schemas.microsoft.com/office/drawing/2015/9/8/chartex" xmlns:cx2="http://schemas.microsoft.com/office/drawing/2015/10/21/chartex" xmlns:cx3="http://schemas.microsoft.com/office/drawing/2016/5/9/chartex" xmlns:cx4="http://schemas.microsoft.com/office/drawing/2016/5/10/chartex" xmlns:cx5="http://schemas.microsoft.com/office/drawing/2016/5/11/chartex" xmlns:cx6="http://schemas.microsoft.com/office/drawing/2016/5/12/chartex" xmlns:cx7="http://schemas.microsoft.com/office/drawing/2016/5/13/chartex" xmlns:cx8="http://schemas.microsoft.com/office/drawing/2016/5/14/chartex" xmlns:mc="http://schemas.openxmlformats.org/markup-compatibility/2006" xmlns:aink="http://schemas.microsoft.com/office/drawing/2016/ink" xmlns:am3d="http://schemas.microsoft.com/office/drawing/2017/model3d" xmlns:o="urn:schemas-microsoft-com:office:office" xmlns:oel="http://schemas.microsoft.com/office/2019/extlst" xmlns:r="http://schemas.openxmlformats.org/officeDocument/2006/relationships" xmlns:m="http://schemas.openxmlformats.org/officeDocument/2006/math" xmlns:v="urn:schemas-microsoft-com:vml" xmlns:wp14="http://schemas.microsoft.com/office/word/2010/wordprocessingDrawing" xmlns:wp="http://schemas.openxmlformats.org/drawingml/2006/wordprocessingDrawing" xmlns:w10="urn:schemas-microsoft-com:office:word" xmlns:w="http://schemas.openxmlformats.org/wordprocessingml/2006/main" xmlns:w14="http://schemas.microsoft.com/office/word/2010/wordml" xmlns:w15="http://schemas.microsoft.com/office/word/2012/wordml" xmlns:w16cei="http://schemas.microsoft.com/office/word/2026/wordml/cei" xmlns:w16cex="http://schemas.microsoft.com/office/word/2018/wordml/cex" xmlns:w16cid="http://schemas.microsoft.com/office/word/2016/wordml/cid" xmlns:w16="http://schemas.microsoft.com/office/word/2018/wordml" xmlns:w16du="http://schemas.microsoft.com/office/word/2023/wordml/word16du" xmlns:w16sdtdh="http://schemas.microsoft.com/office/word/2020/wordml/sdtdatahash" xmlns:w16sdtfl="http://schemas.microsoft.com/office/word/2024/wordml/sdtformatlock" xmlns:w16se="http://schemas.microsoft.com/office/word/2015/wordml/symex" xmlns:wpg="http://schemas.microsoft.com/office/word/2010/wordprocessingGroup" xmlns:wpi="http://schemas.microsoft.com/office/word/2010/wordprocessingInk" xmlns:wne="http://schemas.microsoft.com/office/word/2006/wordml" xmlns:wps="http://schemas.microsoft.com/office/word/2010/wordprocessingShape" mc:Ignorable="w14 w15 w16se w16cid w16 w16cex w16sdtdh w16sdtfl w16du wp14">
   <w:p>
     <w:pPr>
-      <w:pStyle w:val="15"/>
+      <w:pStyle w:val="Header"/>
       <w:ind w:firstLine="1440"/>
       <w:jc w:val="center"/>
       <w:rPr>
@@ -1974,6 +2033,7 @@
     <w:r>
       <w:rPr>
         <w:rFonts w:ascii="Verdana" w:hAnsi="Verdana" w:cs="Calibri"/>
+        <w:noProof/>
         <w:sz w:val="18"/>
         <w:szCs w:val="18"/>
         <w:lang w:eastAsia="en-PH"/>
@@ -1981,7 +2041,7 @@
       <mc:AlternateContent>
         <mc:Choice Requires="wps">
           <w:drawing>
-            <wp:anchor distT="0" distB="0" distL="114300" distR="114300" simplePos="0" relativeHeight="251659264" behindDoc="0" locked="0" layoutInCell="1" allowOverlap="1">
+            <wp:anchor distT="0" distB="0" distL="114300" distR="114300" simplePos="0" relativeHeight="251659264" behindDoc="0" locked="0" layoutInCell="1" allowOverlap="1" wp14:anchorId="1F7BDDA9" wp14:editId="1F7BDDAA">
               <wp:simplePos x="0" y="0"/>
               <wp:positionH relativeFrom="margin">
                 <wp:posOffset>0</wp:posOffset>
@@ -2101,7 +2161,7 @@
             </wp:anchor>
           </w:drawing>
         </mc:Choice>
-        <mc:Fallback>
+        <mc:Fallback xmlns:wpsCustomData="http://www.wps.cn/officeDocument/2013/wpsCustomData">
           <w:pict>
             <v:shape id="Text Box 2" o:spid="_x0000_s1026" o:spt="202" type="#_x0000_t202" style="position:absolute;left:0pt;margin-left:0pt;margin-top:1.3pt;height:47.25pt;width:118.45pt;mso-position-horizontal-relative:margin;mso-wrap-distance-bottom:0pt;mso-wrap-distance-left:9pt;mso-wrap-distance-right:9pt;mso-wrap-distance-top:0pt;z-index:251659264;mso-width-relative:page;mso-height-relative:page;" fillcolor="#FFFFFF" filled="t" stroked="t" coordsize="21600,21600" o:gfxdata="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">
               <v:fill on="t" focussize="0,0"/>
@@ -2193,26 +2253,18 @@
   </w:p>
   <w:p>
     <w:pPr>
-      <w:pStyle w:val="15"/>
+      <w:pStyle w:val="Header"/>
       <w:ind w:firstLine="1440"/>
       <w:jc w:val="both"/>
     </w:pPr>
     <w:r>
       <w:rPr>
-        <w:rFonts w:hint="default" w:ascii="Verdana" w:hAnsi="Verdana" w:cs="Calibri"/>
+        <w:rFonts w:ascii="Verdana" w:hAnsi="Verdana" w:cs="Calibri"/>
         <w:sz w:val="16"/>
         <w:szCs w:val="16"/>
         <w:lang w:val="en-US"/>
       </w:rPr>
       <w:tab/>
-    </w:r>
-    <w:r>
-      <w:rPr>
-        <w:rFonts w:hint="default" w:ascii="Verdana" w:hAnsi="Verdana" w:cs="Calibri"/>
-        <w:sz w:val="16"/>
-        <w:szCs w:val="16"/>
-        <w:lang w:val="en-US"/>
-      </w:rPr>
       <w:t xml:space="preserve">                               </w:t>
     </w:r>
     <w:r>
@@ -2226,10 +2278,10 @@
   </w:p>
   <w:p>
     <w:pPr>
-      <w:pStyle w:val="15"/>
+      <w:pStyle w:val="Header"/>
       <w:jc w:val="center"/>
       <w:rPr>
-        <w:rFonts w:hint="default" w:ascii="Verdana" w:hAnsi="Verdana" w:cs="Calibri"/>
+        <w:rFonts w:ascii="Verdana" w:hAnsi="Verdana" w:cs="Calibri"/>
         <w:sz w:val="16"/>
         <w:szCs w:val="16"/>
         <w:lang w:val="en-US"/>
@@ -2237,20 +2289,40 @@
     </w:pPr>
     <w:r>
       <w:rPr>
-        <w:rFonts w:hint="default" w:ascii="Verdana" w:hAnsi="Verdana" w:cs="Calibri"/>
+        <w:rFonts w:ascii="Verdana" w:hAnsi="Verdana" w:cs="Calibri"/>
         <w:sz w:val="16"/>
         <w:szCs w:val="16"/>
         <w:lang w:val="en-US"/>
       </w:rPr>
-      <w:t>B. Suico St. Tingub, Mandaue City, 6014, Cebu, Philippines</w:t>
+      <w:t xml:space="preserve">B. Suico St. </w:t>
+    </w:r>
+    <w:proofErr w:type="spellStart"/>
+    <w:r>
+      <w:rPr>
+        <w:rFonts w:ascii="Verdana" w:hAnsi="Verdana" w:cs="Calibri"/>
+        <w:sz w:val="16"/>
+        <w:szCs w:val="16"/>
+        <w:lang w:val="en-US"/>
+      </w:rPr>
+      <w:t>Tingub</w:t>
+    </w:r>
+    <w:proofErr w:type="spellEnd"/>
+    <w:r>
+      <w:rPr>
+        <w:rFonts w:ascii="Verdana" w:hAnsi="Verdana" w:cs="Calibri"/>
+        <w:sz w:val="16"/>
+        <w:szCs w:val="16"/>
+        <w:lang w:val="en-US"/>
+      </w:rPr>
+      <w:t>, Mandaue City, 6014, Cebu, Philippines</w:t>
     </w:r>
   </w:p>
   <w:p>
     <w:pPr>
-      <w:pStyle w:val="15"/>
+      <w:pStyle w:val="Header"/>
       <w:jc w:val="center"/>
       <w:rPr>
-        <w:rFonts w:hint="default" w:ascii="Verdana" w:hAnsi="Verdana" w:cs="Calibri"/>
+        <w:rFonts w:ascii="Verdana" w:hAnsi="Verdana" w:cs="Calibri"/>
         <w:sz w:val="16"/>
         <w:szCs w:val="16"/>
         <w:lang w:val="en-US"/>
@@ -2259,7 +2331,7 @@
   </w:p>
   <w:p>
     <w:pPr>
-      <w:pStyle w:val="15"/>
+      <w:pStyle w:val="Header"/>
       <w:rPr>
         <w:rFonts w:ascii="Verdana" w:hAnsi="Verdana" w:cs="Calibri"/>
         <w:b/>
@@ -2275,19 +2347,11 @@
         <w:szCs w:val="16"/>
       </w:rPr>
       <w:tab/>
+      <w:t xml:space="preserve">                       </w:t>
     </w:r>
     <w:r>
       <w:rPr>
         <w:rFonts w:ascii="Verdana" w:hAnsi="Verdana" w:cs="Calibri"/>
-        <w:b/>
-        <w:sz w:val="16"/>
-        <w:szCs w:val="16"/>
-      </w:rPr>
-      <w:t xml:space="preserve">                       </w:t>
-    </w:r>
-    <w:r>
-      <w:rPr>
-        <w:rFonts w:hint="default" w:ascii="Verdana" w:hAnsi="Verdana" w:cs="Calibri"/>
         <w:b/>
         <w:sz w:val="16"/>
         <w:szCs w:val="16"/>
@@ -2307,7 +2371,7 @@
   </w:p>
   <w:p>
     <w:pPr>
-      <w:pStyle w:val="15"/>
+      <w:pStyle w:val="Header"/>
       <w:jc w:val="center"/>
       <w:rPr>
         <w:rFonts w:ascii="Verdana" w:hAnsi="Verdana" w:cs="Calibri"/>
@@ -2319,7 +2383,7 @@
   </w:p>
   <w:p>
     <w:pPr>
-      <w:pStyle w:val="15"/>
+      <w:pStyle w:val="Header"/>
       <w:jc w:val="center"/>
       <w:rPr>
         <w:rFonts w:ascii="Verdana" w:hAnsi="Verdana" w:cs="Calibri"/>
@@ -2340,7 +2404,7 @@
   </w:p>
   <w:p>
     <w:pPr>
-      <w:pStyle w:val="15"/>
+      <w:pStyle w:val="Header"/>
       <w:jc w:val="center"/>
       <w:rPr>
         <w:rFonts w:ascii="Verdana" w:hAnsi="Verdana" w:cs="Calibri"/>
@@ -2352,26 +2416,18 @@
   </w:p>
   <w:tbl>
     <w:tblPr>
-      <w:tblStyle w:val="17"/>
+      <w:tblStyle w:val="TableGrid"/>
       <w:tblpPr w:leftFromText="180" w:rightFromText="180" w:vertAnchor="text" w:horzAnchor="page" w:tblpX="364" w:tblpY="19"/>
       <w:tblOverlap w:val="never"/>
       <w:tblW w:w="11907" w:type="dxa"/>
-      <w:tblInd w:w="0" w:type="dxa"/>
       <w:tblBorders>
-        <w:top w:val="none" w:color="auto" w:sz="0" w:space="0"/>
-        <w:left w:val="none" w:color="auto" w:sz="0" w:space="0"/>
-        <w:bottom w:val="none" w:color="auto" w:sz="0" w:space="0"/>
-        <w:right w:val="none" w:color="auto" w:sz="0" w:space="0"/>
-        <w:insideH w:val="single" w:color="auto" w:sz="4" w:space="0"/>
-        <w:insideV w:val="single" w:color="auto" w:sz="4" w:space="0"/>
+        <w:top w:val="none" w:sz="0" w:space="0" w:color="auto"/>
+        <w:left w:val="none" w:sz="0" w:space="0" w:color="auto"/>
+        <w:bottom w:val="none" w:sz="0" w:space="0" w:color="auto"/>
+        <w:right w:val="none" w:sz="0" w:space="0" w:color="auto"/>
       </w:tblBorders>
       <w:tblLayout w:type="fixed"/>
-      <w:tblCellMar>
-        <w:top w:w="0" w:type="dxa"/>
-        <w:left w:w="108" w:type="dxa"/>
-        <w:bottom w:w="0" w:type="dxa"/>
-        <w:right w:w="108" w:type="dxa"/>
-      </w:tblCellMar>
+      <w:tblLook w:val="04A0" w:firstRow="1" w:lastRow="0" w:firstColumn="1" w:lastColumn="0" w:noHBand="0" w:noVBand="1"/>
     </w:tblPr>
     <w:tblGrid>
       <w:gridCol w:w="1848"/>
@@ -2385,24 +2441,8 @@
       <w:gridCol w:w="2405"/>
     </w:tblGrid>
     <w:tr>
-      <w:tblPrEx>
-        <w:tblBorders>
-          <w:top w:val="none" w:color="auto" w:sz="0" w:space="0"/>
-          <w:left w:val="none" w:color="auto" w:sz="0" w:space="0"/>
-          <w:bottom w:val="none" w:color="auto" w:sz="0" w:space="0"/>
-          <w:right w:val="none" w:color="auto" w:sz="0" w:space="0"/>
-          <w:insideH w:val="single" w:color="auto" w:sz="4" w:space="0"/>
-          <w:insideV w:val="single" w:color="auto" w:sz="4" w:space="0"/>
-        </w:tblBorders>
-        <w:tblCellMar>
-          <w:top w:w="0" w:type="dxa"/>
-          <w:left w:w="108" w:type="dxa"/>
-          <w:bottom w:w="0" w:type="dxa"/>
-          <w:right w:w="108" w:type="dxa"/>
-        </w:tblCellMar>
-      </w:tblPrEx>
       <w:trPr>
-        <w:trHeight w:val="227" w:hRule="atLeast"/>
+        <w:trHeight w:val="227"/>
       </w:trPr>
       <w:tc>
         <w:tcPr>
@@ -2417,7 +2457,7 @@
         </w:tcPr>
         <w:p>
           <w:pPr>
-            <w:pStyle w:val="15"/>
+            <w:pStyle w:val="Header"/>
             <w:jc w:val="both"/>
             <w:rPr>
               <w:rFonts w:ascii="Verdana" w:hAnsi="Verdana" w:cs="Calibri"/>
@@ -2448,7 +2488,7 @@
         </w:tcPr>
         <w:p>
           <w:pPr>
-            <w:pStyle w:val="15"/>
+            <w:pStyle w:val="Header"/>
             <w:jc w:val="both"/>
             <w:rPr>
               <w:rFonts w:ascii="Verdana" w:hAnsi="Verdana" w:cs="Calibri"/>
@@ -2473,25 +2513,25 @@
           <w:tcBorders>
             <w:top w:val="nil"/>
             <w:left w:val="nil"/>
-            <w:bottom w:val="single" w:color="auto" w:sz="4" w:space="0"/>
+            <w:bottom w:val="single" w:sz="4" w:space="0" w:color="auto"/>
             <w:right w:val="nil"/>
           </w:tcBorders>
           <w:vAlign w:val="center"/>
         </w:tcPr>
         <w:p>
           <w:pPr>
-            <w:pStyle w:val="15"/>
+            <w:pStyle w:val="Header"/>
             <w:jc w:val="both"/>
             <w:rPr>
-              <w:rFonts w:hint="default" w:ascii="Verdana" w:hAnsi="Verdana" w:cs="Calibri"/>
-              <w:sz w:val="18"/>
-              <w:szCs w:val="18"/>
-              <w:lang w:val="en-US"/>
-            </w:rPr>
-          </w:pPr>
-          <w:r>
-            <w:rPr>
-              <w:rFonts w:hint="default" w:ascii="Verdana" w:hAnsi="Verdana" w:cs="Calibri"/>
+              <w:rFonts w:ascii="Verdana" w:hAnsi="Verdana" w:cs="Calibri"/>
+              <w:sz w:val="18"/>
+              <w:szCs w:val="18"/>
+              <w:lang w:val="en-US"/>
+            </w:rPr>
+          </w:pPr>
+          <w:r>
+            <w:rPr>
+              <w:rFonts w:ascii="Verdana" w:hAnsi="Verdana" w:cs="Calibri"/>
               <w:b/>
               <w:bCs/>
               <w:sz w:val="18"/>
@@ -2515,7 +2555,7 @@
         </w:tcPr>
         <w:p>
           <w:pPr>
-            <w:pStyle w:val="15"/>
+            <w:pStyle w:val="Header"/>
             <w:jc w:val="both"/>
             <w:rPr>
               <w:rFonts w:ascii="Verdana" w:hAnsi="Verdana" w:cs="Calibri"/>
@@ -2538,7 +2578,7 @@
         </w:tcPr>
         <w:p>
           <w:pPr>
-            <w:pStyle w:val="15"/>
+            <w:pStyle w:val="Header"/>
             <w:jc w:val="both"/>
             <w:rPr>
               <w:rFonts w:ascii="Verdana" w:hAnsi="Verdana" w:cs="Calibri"/>
@@ -2561,7 +2601,7 @@
         </w:tcPr>
         <w:p>
           <w:pPr>
-            <w:pStyle w:val="15"/>
+            <w:pStyle w:val="Header"/>
             <w:jc w:val="both"/>
             <w:rPr>
               <w:rFonts w:ascii="Verdana" w:hAnsi="Verdana" w:cs="Calibri"/>
@@ -2569,13 +2609,23 @@
               <w:szCs w:val="18"/>
             </w:rPr>
           </w:pPr>
-          <w:r>
-            <w:rPr>
-              <w:rFonts w:ascii="Verdana" w:hAnsi="Verdana" w:cs="Calibri"/>
-              <w:sz w:val="18"/>
-              <w:szCs w:val="18"/>
-            </w:rPr>
-            <w:t>Date&amp;Time Received</w:t>
+          <w:proofErr w:type="spellStart"/>
+          <w:r>
+            <w:rPr>
+              <w:rFonts w:ascii="Verdana" w:hAnsi="Verdana" w:cs="Calibri"/>
+              <w:sz w:val="18"/>
+              <w:szCs w:val="18"/>
+            </w:rPr>
+            <w:t>Date&amp;Time</w:t>
+          </w:r>
+          <w:proofErr w:type="spellEnd"/>
+          <w:r>
+            <w:rPr>
+              <w:rFonts w:ascii="Verdana" w:hAnsi="Verdana" w:cs="Calibri"/>
+              <w:sz w:val="18"/>
+              <w:szCs w:val="18"/>
+            </w:rPr>
+            <w:t xml:space="preserve"> Received</w:t>
           </w:r>
         </w:p>
       </w:tc>
@@ -2592,7 +2642,7 @@
         </w:tcPr>
         <w:p>
           <w:pPr>
-            <w:pStyle w:val="15"/>
+            <w:pStyle w:val="Header"/>
             <w:jc w:val="both"/>
             <w:rPr>
               <w:rFonts w:ascii="Verdana" w:hAnsi="Verdana" w:cs="Calibri"/>
@@ -2616,14 +2666,14 @@
           <w:tcBorders>
             <w:top w:val="nil"/>
             <w:left w:val="nil"/>
-            <w:bottom w:val="single" w:color="auto" w:sz="4" w:space="0"/>
+            <w:bottom w:val="single" w:sz="4" w:space="0" w:color="auto"/>
             <w:right w:val="nil"/>
           </w:tcBorders>
           <w:vAlign w:val="center"/>
         </w:tcPr>
         <w:p>
           <w:pPr>
-            <w:pStyle w:val="15"/>
+            <w:pStyle w:val="Header"/>
             <w:jc w:val="both"/>
             <w:rPr>
               <w:rFonts w:ascii="Verdana" w:hAnsi="Verdana" w:cs="Calibri"/>
@@ -2633,35 +2683,39 @@
           </w:pPr>
           <w:r>
             <w:rPr>
-              <w:rFonts w:hint="default" w:ascii="Verdana" w:hAnsi="Verdana"/>
-              <w:sz w:val="18"/>
-              <w:szCs w:val="18"/>
-              <w:lang w:val="en-US"/>
-            </w:rPr>
-            <w:t>{DateReceived}</w:t>
+              <w:rFonts w:ascii="Verdana" w:hAnsi="Verdana"/>
+              <w:sz w:val="18"/>
+              <w:szCs w:val="18"/>
+              <w:lang w:val="en-US"/>
+            </w:rPr>
+            <w:t>{</w:t>
+          </w:r>
+          <w:proofErr w:type="spellStart"/>
+          <w:r>
+            <w:rPr>
+              <w:rFonts w:ascii="Verdana" w:hAnsi="Verdana"/>
+              <w:sz w:val="18"/>
+              <w:szCs w:val="18"/>
+              <w:lang w:val="en-US"/>
+            </w:rPr>
+            <w:t>DateReceived</w:t>
+          </w:r>
+          <w:proofErr w:type="spellEnd"/>
+          <w:r>
+            <w:rPr>
+              <w:rFonts w:ascii="Verdana" w:hAnsi="Verdana"/>
+              <w:sz w:val="18"/>
+              <w:szCs w:val="18"/>
+              <w:lang w:val="en-US"/>
+            </w:rPr>
+            <w:t>}</w:t>
           </w:r>
         </w:p>
       </w:tc>
     </w:tr>
     <w:tr>
-      <w:tblPrEx>
-        <w:tblBorders>
-          <w:top w:val="none" w:color="auto" w:sz="0" w:space="0"/>
-          <w:left w:val="none" w:color="auto" w:sz="0" w:space="0"/>
-          <w:bottom w:val="none" w:color="auto" w:sz="0" w:space="0"/>
-          <w:right w:val="none" w:color="auto" w:sz="0" w:space="0"/>
-          <w:insideH w:val="single" w:color="auto" w:sz="4" w:space="0"/>
-          <w:insideV w:val="single" w:color="auto" w:sz="4" w:space="0"/>
-        </w:tblBorders>
-        <w:tblCellMar>
-          <w:top w:w="0" w:type="dxa"/>
-          <w:left w:w="108" w:type="dxa"/>
-          <w:bottom w:w="0" w:type="dxa"/>
-          <w:right w:w="108" w:type="dxa"/>
-        </w:tblCellMar>
-      </w:tblPrEx>
       <w:trPr>
-        <w:trHeight w:val="227" w:hRule="atLeast"/>
+        <w:trHeight w:val="227"/>
       </w:trPr>
       <w:tc>
         <w:tcPr>
@@ -2676,7 +2730,7 @@
         </w:tcPr>
         <w:p>
           <w:pPr>
-            <w:pStyle w:val="15"/>
+            <w:pStyle w:val="Header"/>
             <w:jc w:val="both"/>
             <w:rPr>
               <w:rFonts w:ascii="Verdana" w:hAnsi="Verdana" w:cs="Calibri"/>
@@ -2707,7 +2761,7 @@
         </w:tcPr>
         <w:p>
           <w:pPr>
-            <w:pStyle w:val="15"/>
+            <w:pStyle w:val="Header"/>
             <w:jc w:val="both"/>
             <w:rPr>
               <w:rFonts w:ascii="Verdana" w:hAnsi="Verdana" w:cs="Calibri"/>
@@ -2732,32 +2786,56 @@
           <w:tcBorders>
             <w:top w:val="nil"/>
             <w:left w:val="nil"/>
-            <w:bottom w:val="single" w:color="auto" w:sz="4" w:space="0"/>
+            <w:bottom w:val="single" w:sz="4" w:space="0" w:color="auto"/>
             <w:right w:val="nil"/>
           </w:tcBorders>
           <w:vAlign w:val="center"/>
         </w:tcPr>
         <w:p>
           <w:pPr>
-            <w:pStyle w:val="15"/>
+            <w:pStyle w:val="Header"/>
             <w:jc w:val="both"/>
             <w:rPr>
-              <w:rFonts w:hint="default" w:ascii="Verdana" w:hAnsi="Verdana" w:cs="Calibri"/>
-              <w:sz w:val="18"/>
-              <w:szCs w:val="18"/>
-              <w:lang w:val="en-US"/>
-            </w:rPr>
-          </w:pPr>
-          <w:r>
-            <w:rPr>
-              <w:rFonts w:hint="default" w:ascii="Verdana" w:hAnsi="Verdana" w:cs="Calibri"/>
+              <w:rFonts w:ascii="Verdana" w:hAnsi="Verdana" w:cs="Calibri"/>
+              <w:sz w:val="18"/>
+              <w:szCs w:val="18"/>
+              <w:lang w:val="en-US"/>
+            </w:rPr>
+          </w:pPr>
+          <w:r>
+            <w:rPr>
+              <w:rFonts w:ascii="Verdana" w:hAnsi="Verdana" w:cs="Calibri"/>
               <w:b/>
               <w:bCs/>
               <w:sz w:val="18"/>
               <w:szCs w:val="18"/>
               <w:lang w:val="en-US"/>
             </w:rPr>
-            <w:t>{SampleName}</w:t>
+            <w:t>{</w:t>
+          </w:r>
+          <w:proofErr w:type="spellStart"/>
+          <w:r>
+            <w:rPr>
+              <w:rFonts w:ascii="Verdana" w:hAnsi="Verdana" w:cs="Calibri"/>
+              <w:b/>
+              <w:bCs/>
+              <w:sz w:val="18"/>
+              <w:szCs w:val="18"/>
+              <w:lang w:val="en-US"/>
+            </w:rPr>
+            <w:t>SampleName</w:t>
+          </w:r>
+          <w:proofErr w:type="spellEnd"/>
+          <w:r>
+            <w:rPr>
+              <w:rFonts w:ascii="Verdana" w:hAnsi="Verdana" w:cs="Calibri"/>
+              <w:b/>
+              <w:bCs/>
+              <w:sz w:val="18"/>
+              <w:szCs w:val="18"/>
+              <w:lang w:val="en-US"/>
+            </w:rPr>
+            <w:t>}</w:t>
           </w:r>
         </w:p>
       </w:tc>
@@ -2774,7 +2852,7 @@
         </w:tcPr>
         <w:p>
           <w:pPr>
-            <w:pStyle w:val="15"/>
+            <w:pStyle w:val="Header"/>
             <w:jc w:val="both"/>
             <w:rPr>
               <w:rFonts w:ascii="Verdana" w:hAnsi="Verdana" w:cs="Calibri"/>
@@ -2782,13 +2860,23 @@
               <w:szCs w:val="18"/>
             </w:rPr>
           </w:pPr>
-          <w:r>
-            <w:rPr>
-              <w:rFonts w:ascii="Verdana" w:hAnsi="Verdana" w:cs="Calibri"/>
-              <w:sz w:val="18"/>
-              <w:szCs w:val="18"/>
-            </w:rPr>
-            <w:t>Date&amp;Time Released</w:t>
+          <w:proofErr w:type="spellStart"/>
+          <w:r>
+            <w:rPr>
+              <w:rFonts w:ascii="Verdana" w:hAnsi="Verdana" w:cs="Calibri"/>
+              <w:sz w:val="18"/>
+              <w:szCs w:val="18"/>
+            </w:rPr>
+            <w:t>Date&amp;Time</w:t>
+          </w:r>
+          <w:proofErr w:type="spellEnd"/>
+          <w:r>
+            <w:rPr>
+              <w:rFonts w:ascii="Verdana" w:hAnsi="Verdana" w:cs="Calibri"/>
+              <w:sz w:val="18"/>
+              <w:szCs w:val="18"/>
+            </w:rPr>
+            <w:t xml:space="preserve"> Released</w:t>
           </w:r>
         </w:p>
       </w:tc>
@@ -2805,7 +2893,7 @@
         </w:tcPr>
         <w:p>
           <w:pPr>
-            <w:pStyle w:val="15"/>
+            <w:pStyle w:val="Header"/>
             <w:jc w:val="both"/>
             <w:rPr>
               <w:rFonts w:ascii="Verdana" w:hAnsi="Verdana" w:cs="Calibri"/>
@@ -2827,16 +2915,16 @@
         <w:tcPr>
           <w:tcW w:w="2405" w:type="dxa"/>
           <w:tcBorders>
-            <w:top w:val="single" w:color="auto" w:sz="4" w:space="0"/>
+            <w:top w:val="single" w:sz="4" w:space="0" w:color="auto"/>
             <w:left w:val="nil"/>
-            <w:bottom w:val="single" w:color="auto" w:sz="4" w:space="0"/>
+            <w:bottom w:val="single" w:sz="4" w:space="0" w:color="auto"/>
             <w:right w:val="nil"/>
           </w:tcBorders>
           <w:vAlign w:val="center"/>
         </w:tcPr>
         <w:p>
           <w:pPr>
-            <w:pStyle w:val="15"/>
+            <w:pStyle w:val="Header"/>
             <w:jc w:val="both"/>
             <w:rPr>
               <w:rFonts w:ascii="Verdana" w:hAnsi="Verdana"/>
@@ -2846,35 +2934,39 @@
           </w:pPr>
           <w:r>
             <w:rPr>
-              <w:rFonts w:hint="default" w:ascii="Verdana" w:hAnsi="Verdana"/>
-              <w:sz w:val="18"/>
-              <w:szCs w:val="18"/>
-              <w:lang w:val="en-US"/>
-            </w:rPr>
-            <w:t>{DateReleased}</w:t>
+              <w:rFonts w:ascii="Verdana" w:hAnsi="Verdana"/>
+              <w:sz w:val="18"/>
+              <w:szCs w:val="18"/>
+              <w:lang w:val="en-US"/>
+            </w:rPr>
+            <w:t>{</w:t>
+          </w:r>
+          <w:proofErr w:type="spellStart"/>
+          <w:r>
+            <w:rPr>
+              <w:rFonts w:ascii="Verdana" w:hAnsi="Verdana"/>
+              <w:sz w:val="18"/>
+              <w:szCs w:val="18"/>
+              <w:lang w:val="en-US"/>
+            </w:rPr>
+            <w:t>DateReleased</w:t>
+          </w:r>
+          <w:proofErr w:type="spellEnd"/>
+          <w:r>
+            <w:rPr>
+              <w:rFonts w:ascii="Verdana" w:hAnsi="Verdana"/>
+              <w:sz w:val="18"/>
+              <w:szCs w:val="18"/>
+              <w:lang w:val="en-US"/>
+            </w:rPr>
+            <w:t>}</w:t>
           </w:r>
         </w:p>
       </w:tc>
     </w:tr>
     <w:tr>
-      <w:tblPrEx>
-        <w:tblBorders>
-          <w:top w:val="none" w:color="auto" w:sz="0" w:space="0"/>
-          <w:left w:val="none" w:color="auto" w:sz="0" w:space="0"/>
-          <w:bottom w:val="none" w:color="auto" w:sz="0" w:space="0"/>
-          <w:right w:val="none" w:color="auto" w:sz="0" w:space="0"/>
-          <w:insideH w:val="single" w:color="auto" w:sz="4" w:space="0"/>
-          <w:insideV w:val="single" w:color="auto" w:sz="4" w:space="0"/>
-        </w:tblBorders>
-        <w:tblCellMar>
-          <w:top w:w="0" w:type="dxa"/>
-          <w:left w:w="108" w:type="dxa"/>
-          <w:bottom w:w="0" w:type="dxa"/>
-          <w:right w:w="108" w:type="dxa"/>
-        </w:tblCellMar>
-      </w:tblPrEx>
       <w:trPr>
-        <w:trHeight w:val="252" w:hRule="atLeast"/>
+        <w:trHeight w:val="252"/>
       </w:trPr>
       <w:tc>
         <w:tcPr>
@@ -2889,7 +2981,7 @@
         </w:tcPr>
         <w:p>
           <w:pPr>
-            <w:pStyle w:val="15"/>
+            <w:pStyle w:val="Header"/>
             <w:jc w:val="both"/>
             <w:rPr>
               <w:rFonts w:ascii="Verdana" w:hAnsi="Verdana" w:cs="Calibri"/>
@@ -2920,7 +3012,7 @@
         </w:tcPr>
         <w:p>
           <w:pPr>
-            <w:pStyle w:val="15"/>
+            <w:pStyle w:val="Header"/>
             <w:jc w:val="both"/>
             <w:rPr>
               <w:rFonts w:ascii="Verdana" w:hAnsi="Verdana" w:cs="Calibri"/>
@@ -2942,19 +3034,19 @@
         <w:tcPr>
           <w:tcW w:w="1606" w:type="dxa"/>
           <w:tcBorders>
-            <w:top w:val="single" w:color="auto" w:sz="4" w:space="0"/>
+            <w:top w:val="single" w:sz="4" w:space="0" w:color="auto"/>
             <w:left w:val="nil"/>
-            <w:bottom w:val="single" w:color="auto" w:sz="4" w:space="0"/>
+            <w:bottom w:val="single" w:sz="4" w:space="0" w:color="auto"/>
             <w:right w:val="nil"/>
           </w:tcBorders>
           <w:vAlign w:val="center"/>
         </w:tcPr>
         <w:p>
           <w:pPr>
-            <w:pStyle w:val="15"/>
+            <w:pStyle w:val="Header"/>
             <w:jc w:val="both"/>
             <w:rPr>
-              <w:rFonts w:hint="default" w:ascii="Verdana" w:hAnsi="Verdana" w:cs="Calibri"/>
+              <w:rFonts w:ascii="Verdana" w:hAnsi="Verdana" w:cs="Calibri"/>
               <w:b/>
               <w:bCs/>
               <w:sz w:val="18"/>
@@ -2964,14 +3056,38 @@
           </w:pPr>
           <w:r>
             <w:rPr>
-              <w:rFonts w:hint="default" w:ascii="Verdana" w:hAnsi="Verdana" w:cs="Calibri"/>
+              <w:rFonts w:ascii="Verdana" w:hAnsi="Verdana" w:cs="Calibri"/>
               <w:b/>
               <w:bCs/>
               <w:sz w:val="18"/>
               <w:szCs w:val="18"/>
               <w:lang w:val="en-US"/>
             </w:rPr>
-            <w:t>{DateMfd}</w:t>
+            <w:t>{</w:t>
+          </w:r>
+          <w:proofErr w:type="spellStart"/>
+          <w:r>
+            <w:rPr>
+              <w:rFonts w:ascii="Verdana" w:hAnsi="Verdana" w:cs="Calibri"/>
+              <w:b/>
+              <w:bCs/>
+              <w:sz w:val="18"/>
+              <w:szCs w:val="18"/>
+              <w:lang w:val="en-US"/>
+            </w:rPr>
+            <w:t>DateMfd</w:t>
+          </w:r>
+          <w:proofErr w:type="spellEnd"/>
+          <w:r>
+            <w:rPr>
+              <w:rFonts w:ascii="Verdana" w:hAnsi="Verdana" w:cs="Calibri"/>
+              <w:b/>
+              <w:bCs/>
+              <w:sz w:val="18"/>
+              <w:szCs w:val="18"/>
+              <w:lang w:val="en-US"/>
+            </w:rPr>
+            <w:t>}</w:t>
           </w:r>
         </w:p>
       </w:tc>
@@ -2979,7 +3095,7 @@
         <w:tcPr>
           <w:tcW w:w="1701" w:type="dxa"/>
           <w:tcBorders>
-            <w:top w:val="single" w:color="auto" w:sz="4" w:space="0"/>
+            <w:top w:val="single" w:sz="4" w:space="0" w:color="auto"/>
             <w:left w:val="nil"/>
             <w:bottom w:val="nil"/>
             <w:right w:val="nil"/>
@@ -2988,7 +3104,7 @@
         </w:tcPr>
         <w:p>
           <w:pPr>
-            <w:pStyle w:val="15"/>
+            <w:pStyle w:val="Header"/>
             <w:jc w:val="both"/>
             <w:rPr>
               <w:rFonts w:ascii="Verdana" w:hAnsi="Verdana" w:cs="Calibri"/>
@@ -3010,7 +3126,7 @@
         <w:tcPr>
           <w:tcW w:w="238" w:type="dxa"/>
           <w:tcBorders>
-            <w:top w:val="single" w:color="auto" w:sz="4" w:space="0"/>
+            <w:top w:val="single" w:sz="4" w:space="0" w:color="auto"/>
             <w:left w:val="nil"/>
             <w:bottom w:val="nil"/>
             <w:right w:val="nil"/>
@@ -3019,7 +3135,7 @@
         </w:tcPr>
         <w:p>
           <w:pPr>
-            <w:pStyle w:val="15"/>
+            <w:pStyle w:val="Header"/>
             <w:jc w:val="both"/>
             <w:rPr>
               <w:rFonts w:ascii="Verdana" w:hAnsi="Verdana" w:cs="Calibri"/>
@@ -3041,34 +3157,58 @@
         <w:tcPr>
           <w:tcW w:w="1463" w:type="dxa"/>
           <w:tcBorders>
-            <w:top w:val="single" w:color="auto" w:sz="4" w:space="0"/>
+            <w:top w:val="single" w:sz="4" w:space="0" w:color="auto"/>
             <w:left w:val="nil"/>
-            <w:bottom w:val="single" w:color="auto" w:sz="4" w:space="0"/>
+            <w:bottom w:val="single" w:sz="4" w:space="0" w:color="auto"/>
             <w:right w:val="nil"/>
           </w:tcBorders>
           <w:vAlign w:val="center"/>
         </w:tcPr>
         <w:p>
           <w:pPr>
-            <w:pStyle w:val="15"/>
+            <w:pStyle w:val="Header"/>
             <w:jc w:val="both"/>
             <w:rPr>
-              <w:rFonts w:hint="default" w:ascii="Verdana" w:hAnsi="Verdana" w:cs="Calibri"/>
-              <w:sz w:val="18"/>
-              <w:szCs w:val="18"/>
-              <w:lang w:val="en-US"/>
-            </w:rPr>
-          </w:pPr>
-          <w:r>
-            <w:rPr>
-              <w:rFonts w:hint="default" w:ascii="Verdana" w:hAnsi="Verdana" w:cs="Calibri"/>
+              <w:rFonts w:ascii="Verdana" w:hAnsi="Verdana" w:cs="Calibri"/>
+              <w:sz w:val="18"/>
+              <w:szCs w:val="18"/>
+              <w:lang w:val="en-US"/>
+            </w:rPr>
+          </w:pPr>
+          <w:r>
+            <w:rPr>
+              <w:rFonts w:ascii="Verdana" w:hAnsi="Verdana" w:cs="Calibri"/>
               <w:b/>
               <w:bCs/>
               <w:sz w:val="18"/>
               <w:szCs w:val="18"/>
               <w:lang w:val="en-US"/>
             </w:rPr>
-            <w:t>{BatchNo}</w:t>
+            <w:t>{</w:t>
+          </w:r>
+          <w:proofErr w:type="spellStart"/>
+          <w:r>
+            <w:rPr>
+              <w:rFonts w:ascii="Verdana" w:hAnsi="Verdana" w:cs="Calibri"/>
+              <w:b/>
+              <w:bCs/>
+              <w:sz w:val="18"/>
+              <w:szCs w:val="18"/>
+              <w:lang w:val="en-US"/>
+            </w:rPr>
+            <w:t>BatchNo</w:t>
+          </w:r>
+          <w:proofErr w:type="spellEnd"/>
+          <w:r>
+            <w:rPr>
+              <w:rFonts w:ascii="Verdana" w:hAnsi="Verdana" w:cs="Calibri"/>
+              <w:b/>
+              <w:bCs/>
+              <w:sz w:val="18"/>
+              <w:szCs w:val="18"/>
+              <w:lang w:val="en-US"/>
+            </w:rPr>
+            <w:t>}</w:t>
           </w:r>
         </w:p>
       </w:tc>
@@ -3085,7 +3225,7 @@
         </w:tcPr>
         <w:p>
           <w:pPr>
-            <w:pStyle w:val="15"/>
+            <w:pStyle w:val="Header"/>
             <w:jc w:val="both"/>
             <w:rPr>
               <w:rFonts w:ascii="Verdana" w:hAnsi="Verdana" w:cs="Calibri"/>
@@ -3116,7 +3256,7 @@
         </w:tcPr>
         <w:p>
           <w:pPr>
-            <w:pStyle w:val="15"/>
+            <w:pStyle w:val="Header"/>
             <w:jc w:val="both"/>
             <w:rPr>
               <w:rFonts w:ascii="Verdana" w:hAnsi="Verdana" w:cs="Calibri"/>
@@ -3140,55 +3280,63 @@
           <w:tcBorders>
             <w:top w:val="nil"/>
             <w:left w:val="nil"/>
-            <w:bottom w:val="single" w:color="auto" w:sz="4" w:space="0"/>
+            <w:bottom w:val="single" w:sz="4" w:space="0" w:color="auto"/>
             <w:right w:val="nil"/>
           </w:tcBorders>
           <w:vAlign w:val="center"/>
         </w:tcPr>
         <w:p>
           <w:pPr>
-            <w:pStyle w:val="15"/>
+            <w:pStyle w:val="Header"/>
             <w:jc w:val="both"/>
             <w:rPr>
-              <w:rFonts w:hint="default" w:ascii="Verdana" w:hAnsi="Verdana" w:cs="Calibri"/>
-              <w:sz w:val="18"/>
-              <w:szCs w:val="18"/>
-              <w:lang w:val="en-US"/>
-            </w:rPr>
-          </w:pPr>
-          <w:r>
-            <w:rPr>
-              <w:rFonts w:hint="default" w:ascii="Verdana" w:hAnsi="Verdana" w:cs="Calibri"/>
+              <w:rFonts w:ascii="Verdana" w:hAnsi="Verdana" w:cs="Calibri"/>
+              <w:sz w:val="18"/>
+              <w:szCs w:val="18"/>
+              <w:lang w:val="en-US"/>
+            </w:rPr>
+          </w:pPr>
+          <w:r>
+            <w:rPr>
+              <w:rFonts w:ascii="Verdana" w:hAnsi="Verdana" w:cs="Calibri"/>
               <w:b/>
               <w:bCs/>
               <w:sz w:val="18"/>
               <w:szCs w:val="18"/>
               <w:lang w:val="en-US"/>
             </w:rPr>
-            <w:t>{FillVol}</w:t>
+            <w:t>{</w:t>
+          </w:r>
+          <w:proofErr w:type="spellStart"/>
+          <w:r>
+            <w:rPr>
+              <w:rFonts w:ascii="Verdana" w:hAnsi="Verdana" w:cs="Calibri"/>
+              <w:b/>
+              <w:bCs/>
+              <w:sz w:val="18"/>
+              <w:szCs w:val="18"/>
+              <w:lang w:val="en-US"/>
+            </w:rPr>
+            <w:t>FillVol</w:t>
+          </w:r>
+          <w:proofErr w:type="spellEnd"/>
+          <w:r>
+            <w:rPr>
+              <w:rFonts w:ascii="Verdana" w:hAnsi="Verdana" w:cs="Calibri"/>
+              <w:b/>
+              <w:bCs/>
+              <w:sz w:val="18"/>
+              <w:szCs w:val="18"/>
+              <w:lang w:val="en-US"/>
+            </w:rPr>
+            <w:t>}</w:t>
           </w:r>
         </w:p>
       </w:tc>
     </w:tr>
     <w:tr>
-      <w:tblPrEx>
-        <w:tblBorders>
-          <w:top w:val="none" w:color="auto" w:sz="0" w:space="0"/>
-          <w:left w:val="none" w:color="auto" w:sz="0" w:space="0"/>
-          <w:bottom w:val="none" w:color="auto" w:sz="0" w:space="0"/>
-          <w:right w:val="none" w:color="auto" w:sz="0" w:space="0"/>
-          <w:insideH w:val="single" w:color="auto" w:sz="4" w:space="0"/>
-          <w:insideV w:val="single" w:color="auto" w:sz="4" w:space="0"/>
-        </w:tblBorders>
-        <w:tblCellMar>
-          <w:top w:w="0" w:type="dxa"/>
-          <w:left w:w="108" w:type="dxa"/>
-          <w:bottom w:w="0" w:type="dxa"/>
-          <w:right w:w="108" w:type="dxa"/>
-        </w:tblCellMar>
-      </w:tblPrEx>
       <w:trPr>
-        <w:trHeight w:val="227" w:hRule="atLeast"/>
+        <w:trHeight w:val="227"/>
       </w:trPr>
       <w:tc>
         <w:tcPr>
@@ -3203,7 +3351,7 @@
         </w:tcPr>
         <w:p>
           <w:pPr>
-            <w:pStyle w:val="15"/>
+            <w:pStyle w:val="Header"/>
             <w:jc w:val="both"/>
             <w:rPr>
               <w:rFonts w:ascii="Verdana" w:hAnsi="Verdana" w:cs="Calibri"/>
@@ -3234,7 +3382,7 @@
         </w:tcPr>
         <w:p>
           <w:pPr>
-            <w:pStyle w:val="15"/>
+            <w:pStyle w:val="Header"/>
             <w:jc w:val="both"/>
             <w:rPr>
               <w:rFonts w:ascii="Verdana" w:hAnsi="Verdana" w:cs="Calibri"/>
@@ -3256,19 +3404,19 @@
         <w:tcPr>
           <w:tcW w:w="1606" w:type="dxa"/>
           <w:tcBorders>
-            <w:top w:val="single" w:color="auto" w:sz="4" w:space="0"/>
+            <w:top w:val="single" w:sz="4" w:space="0" w:color="auto"/>
             <w:left w:val="nil"/>
-            <w:bottom w:val="single" w:color="auto" w:sz="4" w:space="0"/>
+            <w:bottom w:val="single" w:sz="4" w:space="0" w:color="auto"/>
             <w:right w:val="nil"/>
           </w:tcBorders>
           <w:vAlign w:val="center"/>
         </w:tcPr>
         <w:p>
           <w:pPr>
-            <w:pStyle w:val="15"/>
+            <w:pStyle w:val="Header"/>
             <w:jc w:val="both"/>
             <w:rPr>
-              <w:rFonts w:hint="default" w:ascii="Verdana" w:hAnsi="Verdana" w:cs="Calibri"/>
+              <w:rFonts w:ascii="Verdana" w:hAnsi="Verdana" w:cs="Calibri"/>
               <w:b/>
               <w:bCs/>
               <w:sz w:val="18"/>
@@ -3278,14 +3426,38 @@
           </w:pPr>
           <w:r>
             <w:rPr>
-              <w:rFonts w:hint="default" w:ascii="Verdana" w:hAnsi="Verdana" w:cs="Calibri"/>
+              <w:rFonts w:ascii="Verdana" w:hAnsi="Verdana" w:cs="Calibri"/>
               <w:b/>
               <w:bCs/>
               <w:sz w:val="18"/>
               <w:szCs w:val="18"/>
               <w:lang w:val="en-US"/>
             </w:rPr>
-            <w:t>{ExpiryDate}</w:t>
+            <w:t>{</w:t>
+          </w:r>
+          <w:proofErr w:type="spellStart"/>
+          <w:r>
+            <w:rPr>
+              <w:rFonts w:ascii="Verdana" w:hAnsi="Verdana" w:cs="Calibri"/>
+              <w:b/>
+              <w:bCs/>
+              <w:sz w:val="18"/>
+              <w:szCs w:val="18"/>
+              <w:lang w:val="en-US"/>
+            </w:rPr>
+            <w:t>ExpiryDate</w:t>
+          </w:r>
+          <w:proofErr w:type="spellEnd"/>
+          <w:r>
+            <w:rPr>
+              <w:rFonts w:ascii="Verdana" w:hAnsi="Verdana" w:cs="Calibri"/>
+              <w:b/>
+              <w:bCs/>
+              <w:sz w:val="18"/>
+              <w:szCs w:val="18"/>
+              <w:lang w:val="en-US"/>
+            </w:rPr>
+            <w:t>}</w:t>
           </w:r>
         </w:p>
       </w:tc>
@@ -3302,7 +3474,7 @@
         </w:tcPr>
         <w:p>
           <w:pPr>
-            <w:pStyle w:val="15"/>
+            <w:pStyle w:val="Header"/>
             <w:jc w:val="both"/>
             <w:rPr>
               <w:rFonts w:ascii="Verdana" w:hAnsi="Verdana" w:cs="Calibri"/>
@@ -3333,7 +3505,7 @@
         </w:tcPr>
         <w:p>
           <w:pPr>
-            <w:pStyle w:val="15"/>
+            <w:pStyle w:val="Header"/>
             <w:jc w:val="both"/>
             <w:rPr>
               <w:rFonts w:ascii="Verdana" w:hAnsi="Verdana" w:cs="Calibri"/>
@@ -3355,19 +3527,19 @@
         <w:tcPr>
           <w:tcW w:w="1463" w:type="dxa"/>
           <w:tcBorders>
-            <w:top w:val="single" w:color="auto" w:sz="4" w:space="0"/>
+            <w:top w:val="single" w:sz="4" w:space="0" w:color="auto"/>
             <w:left w:val="nil"/>
-            <w:bottom w:val="single" w:color="auto" w:sz="4" w:space="0"/>
+            <w:bottom w:val="single" w:sz="4" w:space="0" w:color="auto"/>
             <w:right w:val="nil"/>
           </w:tcBorders>
           <w:vAlign w:val="center"/>
         </w:tcPr>
         <w:p>
           <w:pPr>
-            <w:pStyle w:val="15"/>
+            <w:pStyle w:val="Header"/>
             <w:jc w:val="both"/>
             <w:rPr>
-              <w:rFonts w:hint="default" w:ascii="Verdana" w:hAnsi="Verdana" w:cs="Calibri"/>
+              <w:rFonts w:ascii="Verdana" w:hAnsi="Verdana" w:cs="Calibri"/>
               <w:b/>
               <w:bCs/>
               <w:sz w:val="18"/>
@@ -3377,7 +3549,7 @@
           </w:pPr>
           <w:r>
             <w:rPr>
-              <w:rFonts w:hint="default" w:ascii="Verdana" w:hAnsi="Verdana" w:cs="Calibri"/>
+              <w:rFonts w:ascii="Verdana" w:hAnsi="Verdana" w:cs="Calibri"/>
               <w:b/>
               <w:bCs/>
               <w:sz w:val="18"/>
@@ -3401,7 +3573,7 @@
         </w:tcPr>
         <w:p>
           <w:pPr>
-            <w:pStyle w:val="15"/>
+            <w:pStyle w:val="Header"/>
             <w:jc w:val="both"/>
             <w:rPr>
               <w:rFonts w:ascii="Verdana" w:hAnsi="Verdana" w:cs="Calibri"/>
@@ -3432,7 +3604,7 @@
         </w:tcPr>
         <w:p>
           <w:pPr>
-            <w:pStyle w:val="15"/>
+            <w:pStyle w:val="Header"/>
             <w:jc w:val="both"/>
             <w:rPr>
               <w:rFonts w:ascii="Verdana" w:hAnsi="Verdana" w:cs="Calibri"/>
@@ -3454,23 +3626,19 @@
         <w:tcPr>
           <w:tcW w:w="2405" w:type="dxa"/>
           <w:tcBorders>
-            <w:top w:val="single" w:color="auto" w:sz="4" w:space="0"/>
+            <w:top w:val="single" w:sz="4" w:space="0" w:color="auto"/>
             <w:left w:val="nil"/>
-            <w:bottom w:val="single" w:color="auto" w:sz="4" w:space="0"/>
+            <w:bottom w:val="single" w:sz="4" w:space="0" w:color="auto"/>
             <w:right w:val="nil"/>
           </w:tcBorders>
           <w:vAlign w:val="center"/>
         </w:tcPr>
         <w:p>
           <w:pPr>
-            <w:pStyle w:val="15"/>
-            <w:numPr>
-              <w:ilvl w:val="0"/>
-              <w:numId w:val="1"/>
-            </w:numPr>
+            <w:pStyle w:val="Header"/>
             <w:jc w:val="both"/>
             <w:rPr>
-              <w:rFonts w:hint="default" w:ascii="Verdana" w:hAnsi="Verdana" w:cs="Calibri"/>
+              <w:rFonts w:ascii="Verdana" w:hAnsi="Verdana" w:cs="Calibri"/>
               <w:sz w:val="16"/>
               <w:szCs w:val="16"/>
               <w:lang w:val="en-US"/>
@@ -3478,35 +3646,39 @@
           </w:pPr>
           <w:r>
             <w:rPr>
-              <w:rFonts w:hint="default" w:ascii="Verdana" w:hAnsi="Verdana" w:cs="Calibri"/>
+              <w:rFonts w:ascii="Verdana" w:hAnsi="Verdana" w:cs="Calibri"/>
               <w:sz w:val="16"/>
               <w:szCs w:val="16"/>
               <w:lang w:val="en-US"/>
             </w:rPr>
-            <w:t>{RequestedBy}</w:t>
+            <w:t>{</w:t>
+          </w:r>
+          <w:proofErr w:type="spellStart"/>
+          <w:r>
+            <w:rPr>
+              <w:rFonts w:ascii="Verdana" w:hAnsi="Verdana" w:cs="Calibri"/>
+              <w:sz w:val="16"/>
+              <w:szCs w:val="16"/>
+              <w:lang w:val="en-US"/>
+            </w:rPr>
+            <w:t>RequestedBy</w:t>
+          </w:r>
+          <w:proofErr w:type="spellEnd"/>
+          <w:r>
+            <w:rPr>
+              <w:rFonts w:ascii="Verdana" w:hAnsi="Verdana" w:cs="Calibri"/>
+              <w:sz w:val="16"/>
+              <w:szCs w:val="16"/>
+              <w:lang w:val="en-US"/>
+            </w:rPr>
+            <w:t>}</w:t>
           </w:r>
         </w:p>
       </w:tc>
     </w:tr>
     <w:tr>
-      <w:tblPrEx>
-        <w:tblBorders>
-          <w:top w:val="none" w:color="auto" w:sz="0" w:space="0"/>
-          <w:left w:val="none" w:color="auto" w:sz="0" w:space="0"/>
-          <w:bottom w:val="none" w:color="auto" w:sz="0" w:space="0"/>
-          <w:right w:val="none" w:color="auto" w:sz="0" w:space="0"/>
-          <w:insideH w:val="single" w:color="auto" w:sz="4" w:space="0"/>
-          <w:insideV w:val="single" w:color="auto" w:sz="4" w:space="0"/>
-        </w:tblBorders>
-        <w:tblCellMar>
-          <w:top w:w="0" w:type="dxa"/>
-          <w:left w:w="108" w:type="dxa"/>
-          <w:bottom w:w="0" w:type="dxa"/>
-          <w:right w:w="108" w:type="dxa"/>
-        </w:tblCellMar>
-      </w:tblPrEx>
       <w:trPr>
-        <w:trHeight w:val="227" w:hRule="atLeast"/>
+        <w:trHeight w:val="227"/>
       </w:trPr>
       <w:tc>
         <w:tcPr>
@@ -3521,7 +3693,7 @@
         </w:tcPr>
         <w:p>
           <w:pPr>
-            <w:pStyle w:val="15"/>
+            <w:pStyle w:val="Header"/>
             <w:jc w:val="both"/>
             <w:rPr>
               <w:rFonts w:ascii="Verdana" w:hAnsi="Verdana" w:cs="Calibri"/>
@@ -3552,7 +3724,7 @@
         </w:tcPr>
         <w:p>
           <w:pPr>
-            <w:pStyle w:val="15"/>
+            <w:pStyle w:val="Header"/>
             <w:jc w:val="both"/>
             <w:rPr>
               <w:rFonts w:ascii="Verdana" w:hAnsi="Verdana" w:cs="Calibri"/>
@@ -3577,46 +3749,83 @@
           <w:tcBorders>
             <w:top w:val="nil"/>
             <w:left w:val="nil"/>
-            <w:bottom w:val="single" w:color="auto" w:sz="4" w:space="0"/>
+            <w:bottom w:val="single" w:sz="4" w:space="0" w:color="auto"/>
             <w:right w:val="nil"/>
           </w:tcBorders>
           <w:vAlign w:val="center"/>
         </w:tcPr>
         <w:p>
           <w:pPr>
-            <w:pStyle w:val="15"/>
+            <w:pStyle w:val="Header"/>
             <w:jc w:val="both"/>
             <w:rPr>
-              <w:rFonts w:hint="default" w:ascii="Verdana" w:hAnsi="Verdana" w:cs="Arial"/>
-              <w:sz w:val="18"/>
-              <w:szCs w:val="18"/>
-              <w:lang w:val="en-US"/>
-            </w:rPr>
-          </w:pPr>
-          <w:r>
-            <w:rPr>
               <w:rFonts w:ascii="Verdana" w:hAnsi="Verdana" w:cs="Arial"/>
               <w:sz w:val="18"/>
               <w:szCs w:val="18"/>
-            </w:rPr>
-            <w:t xml:space="preserve">{Purpose}                                                      Logbook                   </w:t>
-          </w:r>
-          <w:r>
-            <w:rPr>
-              <w:rFonts w:hint="default" w:ascii="Verdana" w:hAnsi="Verdana" w:cs="Arial"/>
-              <w:sz w:val="18"/>
-              <w:szCs w:val="18"/>
-              <w:lang w:val="en-US"/>
-            </w:rPr>
-            <w:t xml:space="preserve">  </w:t>
-          </w:r>
+              <w:lang w:val="en-US"/>
+            </w:rPr>
+          </w:pPr>
           <w:r>
             <w:rPr>
               <w:rFonts w:ascii="Verdana" w:hAnsi="Verdana" w:cs="Arial"/>
               <w:sz w:val="18"/>
               <w:szCs w:val="18"/>
             </w:rPr>
-            <w:t xml:space="preserve"> : </w:t>
+            <w:t>{</w:t>
+          </w:r>
+          <w:proofErr w:type="gramStart"/>
+          <w:r>
+            <w:rPr>
+              <w:rFonts w:ascii="Verdana" w:hAnsi="Verdana" w:cs="Arial"/>
+              <w:sz w:val="18"/>
+              <w:szCs w:val="18"/>
+            </w:rPr>
+            <w:t xml:space="preserve">Purpose}   </w:t>
+          </w:r>
+          <w:proofErr w:type="gramEnd"/>
+          <w:r>
+            <w:rPr>
+              <w:rFonts w:ascii="Verdana" w:hAnsi="Verdana" w:cs="Arial"/>
+              <w:sz w:val="18"/>
+              <w:szCs w:val="18"/>
+            </w:rPr>
+            <w:t xml:space="preserve">                                                   Logbook                   </w:t>
+          </w:r>
+          <w:r>
+            <w:rPr>
+              <w:rFonts w:ascii="Verdana" w:hAnsi="Verdana" w:cs="Arial"/>
+              <w:sz w:val="18"/>
+              <w:szCs w:val="18"/>
+              <w:lang w:val="en-US"/>
+            </w:rPr>
+            <w:t xml:space="preserve"> </w:t>
+          </w:r>
+          <w:proofErr w:type="gramStart"/>
+          <w:r>
+            <w:rPr>
+              <w:rFonts w:ascii="Verdana" w:hAnsi="Verdana" w:cs="Arial"/>
+              <w:sz w:val="18"/>
+              <w:szCs w:val="18"/>
+              <w:lang w:val="en-US"/>
+            </w:rPr>
+            <w:t xml:space="preserve"> </w:t>
+          </w:r>
+          <w:r>
+            <w:rPr>
+              <w:rFonts w:ascii="Verdana" w:hAnsi="Verdana" w:cs="Arial"/>
+              <w:sz w:val="18"/>
+              <w:szCs w:val="18"/>
+            </w:rPr>
+            <w:t xml:space="preserve"> :</w:t>
+          </w:r>
+          <w:proofErr w:type="gramEnd"/>
+          <w:r>
+            <w:rPr>
+              <w:rFonts w:ascii="Verdana" w:hAnsi="Verdana" w:cs="Arial"/>
+              <w:sz w:val="18"/>
+              <w:szCs w:val="18"/>
+            </w:rPr>
+            <w:t xml:space="preserve"> </w:t>
           </w:r>
           <w:r>
             <w:rPr>
@@ -3640,7 +3849,7 @@
   </w:tbl>
   <w:p>
     <w:pPr>
-      <w:pStyle w:val="15"/>
+      <w:pStyle w:val="Header"/>
       <w:rPr>
         <w:rFonts w:ascii="Verdana" w:hAnsi="Verdana" w:cs="Calibri"/>
         <w:b/>
@@ -3651,7 +3860,7 @@
   </w:p>
   <w:p>
     <w:pPr>
-      <w:pStyle w:val="15"/>
+      <w:pStyle w:val="Header"/>
       <w:rPr>
         <w:rFonts w:ascii="Verdana" w:hAnsi="Verdana" w:cs="Calibri"/>
         <w:b/>
@@ -3662,7 +3871,7 @@
   </w:p>
   <w:p>
     <w:pPr>
-      <w:pStyle w:val="15"/>
+      <w:pStyle w:val="Header"/>
       <w:rPr>
         <w:rFonts w:ascii="Verdana" w:hAnsi="Verdana" w:cs="Calibri"/>
         <w:b/>
@@ -3674,13 +3883,14 @@
       <w:rPr>
         <w:rFonts w:ascii="Verdana" w:hAnsi="Verdana" w:cs="Calibri"/>
         <w:b/>
+        <w:noProof/>
         <w:sz w:val="18"/>
         <w:szCs w:val="18"/>
       </w:rPr>
       <mc:AlternateContent>
         <mc:Choice Requires="wps">
           <w:drawing>
-            <wp:anchor distT="0" distB="0" distL="114300" distR="114300" simplePos="0" relativeHeight="251660288" behindDoc="0" locked="0" layoutInCell="1" allowOverlap="1">
+            <wp:anchor distT="0" distB="0" distL="114300" distR="114300" simplePos="0" relativeHeight="251660288" behindDoc="0" locked="0" layoutInCell="1" allowOverlap="1" wp14:anchorId="1F7BDDAB" wp14:editId="1F7BDDAC">
               <wp:simplePos x="0" y="0"/>
               <wp:positionH relativeFrom="margin">
                 <wp:posOffset>114300</wp:posOffset>
@@ -3732,7 +3942,7 @@
             </wp:anchor>
           </w:drawing>
         </mc:Choice>
-        <mc:Fallback>
+        <mc:Fallback xmlns:wpsCustomData="http://www.wps.cn/officeDocument/2013/wpsCustomData">
           <w:pict>
             <v:line id="_x0000_s1026" o:spid="_x0000_s1026" o:spt="20" style="position:absolute;left:0pt;margin-left:9pt;margin-top:57.6pt;height:0.8pt;width:568.7pt;mso-position-horizontal-relative:margin;z-index:251660288;mso-width-relative:page;mso-height-relative:page;" filled="f" stroked="t" coordsize="21600,21600" o:gfxdata="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">
               <v:fill on="f" focussize="0,0"/>
@@ -3748,33 +3958,13 @@
 </w:hdr>
 </file>
 
-<file path=word/header2.xml><?xml version="1.0" encoding="utf-8"?>
-<w:hdr xmlns:wpc="http://schemas.microsoft.com/office/word/2010/wordprocessingCanvas" xmlns:mc="http://schemas.openxmlformats.org/markup-compatibility/2006" xmlns:o="urn:schemas-microsoft-com:office:office" xmlns:r="http://schemas.openxmlformats.org/officeDocument/2006/relationships" xmlns:m="http://schemas.openxmlformats.org/officeDocument/2006/math" xmlns:v="urn:schemas-microsoft-com:vml" xmlns:wp14="http://schemas.microsoft.com/office/word/2010/wordprocessingDrawing" xmlns:wp="http://schemas.openxmlformats.org/drawingml/2006/wordprocessingDrawing" xmlns:w10="urn:schemas-microsoft-com:office:word" xmlns:w="http://schemas.openxmlformats.org/wordprocessingml/2006/main" xmlns:w14="http://schemas.microsoft.com/office/word/2010/wordml" xmlns:w15="http://schemas.microsoft.com/office/word/2012/wordml" xmlns:wpg="http://schemas.microsoft.com/office/word/2010/wordprocessingGroup" xmlns:wpi="http://schemas.microsoft.com/office/word/2010/wordprocessingInk" xmlns:wne="http://schemas.microsoft.com/office/word/2006/wordml" xmlns:wps="http://schemas.microsoft.com/office/word/2010/wordprocessingShape" xmlns:wpsCustomData="http://www.wps.cn/officeDocument/2013/wpsCustomData" mc:Ignorable="w14 w15 wp14">
-  <w:p>
-    <w:pPr>
-      <w:pStyle w:val="15"/>
-    </w:pPr>
-  </w:p>
-</w:hdr>
-</file>
-
-<file path=word/header3.xml><?xml version="1.0" encoding="utf-8"?>
-<w:hdr xmlns:wpc="http://schemas.microsoft.com/office/word/2010/wordprocessingCanvas" xmlns:mc="http://schemas.openxmlformats.org/markup-compatibility/2006" xmlns:o="urn:schemas-microsoft-com:office:office" xmlns:r="http://schemas.openxmlformats.org/officeDocument/2006/relationships" xmlns:m="http://schemas.openxmlformats.org/officeDocument/2006/math" xmlns:v="urn:schemas-microsoft-com:vml" xmlns:wp14="http://schemas.microsoft.com/office/word/2010/wordprocessingDrawing" xmlns:wp="http://schemas.openxmlformats.org/drawingml/2006/wordprocessingDrawing" xmlns:w10="urn:schemas-microsoft-com:office:word" xmlns:w="http://schemas.openxmlformats.org/wordprocessingml/2006/main" xmlns:w14="http://schemas.microsoft.com/office/word/2010/wordml" xmlns:w15="http://schemas.microsoft.com/office/word/2012/wordml" xmlns:wpg="http://schemas.microsoft.com/office/word/2010/wordprocessingGroup" xmlns:wpi="http://schemas.microsoft.com/office/word/2010/wordprocessingInk" xmlns:wne="http://schemas.microsoft.com/office/word/2006/wordml" xmlns:wps="http://schemas.microsoft.com/office/word/2010/wordprocessingShape" xmlns:wpsCustomData="http://www.wps.cn/officeDocument/2013/wpsCustomData" mc:Ignorable="w14 w15 wp14">
-  <w:p>
-    <w:pPr>
-      <w:pStyle w:val="15"/>
-    </w:pPr>
-  </w:p>
-</w:hdr>
-</file>
-
 <file path=word/numbering.xml><?xml version="1.0" encoding="utf-8"?>
-<w:numbering xmlns:wpc="http://schemas.microsoft.com/office/word/2010/wordprocessingCanvas" xmlns:mc="http://schemas.openxmlformats.org/markup-compatibility/2006" xmlns:o="urn:schemas-microsoft-com:office:office" xmlns:r="http://schemas.openxmlformats.org/officeDocument/2006/relationships" xmlns:m="http://schemas.openxmlformats.org/officeDocument/2006/math" xmlns:v="urn:schemas-microsoft-com:vml" xmlns:wp14="http://schemas.microsoft.com/office/word/2010/wordprocessingDrawing" xmlns:wp="http://schemas.openxmlformats.org/drawingml/2006/wordprocessingDrawing" xmlns:w10="urn:schemas-microsoft-com:office:word" xmlns:w="http://schemas.openxmlformats.org/wordprocessingml/2006/main" xmlns:w14="http://schemas.microsoft.com/office/word/2010/wordml" xmlns:wpg="http://schemas.microsoft.com/office/word/2010/wordprocessingGroup" xmlns:wpi="http://schemas.microsoft.com/office/word/2010/wordprocessingInk" xmlns:wne="http://schemas.microsoft.com/office/word/2006/wordml" xmlns:wps="http://schemas.microsoft.com/office/word/2010/wordprocessingShape" xmlns:wpsCustomData="http://www.wps.cn/officeDocument/2013/wpsCustomData" mc:Ignorable="w14 wp14">
-  <w:abstractNum w:abstractNumId="0">
+<w:numbering xmlns:wpc="http://schemas.microsoft.com/office/word/2010/wordprocessingCanvas" xmlns:cx="http://schemas.microsoft.com/office/drawing/2014/chartex" xmlns:cx1="http://schemas.microsoft.com/office/drawing/2015/9/8/chartex" xmlns:cx2="http://schemas.microsoft.com/office/drawing/2015/10/21/chartex" xmlns:cx3="http://schemas.microsoft.com/office/drawing/2016/5/9/chartex" xmlns:cx4="http://schemas.microsoft.com/office/drawing/2016/5/10/chartex" xmlns:cx5="http://schemas.microsoft.com/office/drawing/2016/5/11/chartex" xmlns:cx6="http://schemas.microsoft.com/office/drawing/2016/5/12/chartex" xmlns:cx7="http://schemas.microsoft.com/office/drawing/2016/5/13/chartex" xmlns:cx8="http://schemas.microsoft.com/office/drawing/2016/5/14/chartex" xmlns:mc="http://schemas.openxmlformats.org/markup-compatibility/2006" xmlns:aink="http://schemas.microsoft.com/office/drawing/2016/ink" xmlns:am3d="http://schemas.microsoft.com/office/drawing/2017/model3d" xmlns:o="urn:schemas-microsoft-com:office:office" xmlns:oel="http://schemas.microsoft.com/office/2019/extlst" xmlns:r="http://schemas.openxmlformats.org/officeDocument/2006/relationships" xmlns:m="http://schemas.openxmlformats.org/officeDocument/2006/math" xmlns:v="urn:schemas-microsoft-com:vml" xmlns:wp14="http://schemas.microsoft.com/office/word/2010/wordprocessingDrawing" xmlns:wp="http://schemas.openxmlformats.org/drawingml/2006/wordprocessingDrawing" xmlns:w10="urn:schemas-microsoft-com:office:word" xmlns:w="http://schemas.openxmlformats.org/wordprocessingml/2006/main" xmlns:w14="http://schemas.microsoft.com/office/word/2010/wordml" xmlns:w15="http://schemas.microsoft.com/office/word/2012/wordml" xmlns:w16cei="http://schemas.microsoft.com/office/word/2026/wordml/cei" xmlns:w16cex="http://schemas.microsoft.com/office/word/2018/wordml/cex" xmlns:w16cid="http://schemas.microsoft.com/office/word/2016/wordml/cid" xmlns:w16="http://schemas.microsoft.com/office/word/2018/wordml" xmlns:w16du="http://schemas.microsoft.com/office/word/2023/wordml/word16du" xmlns:w16sdtdh="http://schemas.microsoft.com/office/word/2020/wordml/sdtdatahash" xmlns:w16sdtfl="http://schemas.microsoft.com/office/word/2024/wordml/sdtformatlock" xmlns:w16se="http://schemas.microsoft.com/office/word/2015/wordml/symex" xmlns:wpg="http://schemas.microsoft.com/office/word/2010/wordprocessingGroup" xmlns:wpi="http://schemas.microsoft.com/office/word/2010/wordprocessingInk" xmlns:wne="http://schemas.microsoft.com/office/word/2006/wordml" xmlns:wps="http://schemas.microsoft.com/office/word/2010/wordprocessingShape" mc:Ignorable="w14 w15 w16se w16cid w16 w16cex w16sdtdh w16sdtfl w16du wp14">
+  <w:abstractNum w:abstractNumId="0" w15:restartNumberingAfterBreak="0">
     <w:nsid w:val="3E2DEFB7"/>
     <w:multiLevelType w:val="singleLevel"/>
     <w:tmpl w:val="3E2DEFB7"/>
-    <w:lvl w:ilvl="0" w:tentative="0">
+    <w:lvl w:ilvl="0">
       <w:start w:val="10"/>
       <w:numFmt w:val="upperLetter"/>
       <w:suff w:val="space"/>
@@ -3782,278 +3972,405 @@
       <w:lvlJc w:val="left"/>
     </w:lvl>
   </w:abstractNum>
-  <w:num w:numId="1">
+  <w:num w:numId="1" w16cid:durableId="270817814">
     <w:abstractNumId w:val="0"/>
   </w:num>
 </w:numbering>
 </file>
 
 <file path=word/styles.xml><?xml version="1.0" encoding="utf-8"?>
-<w:styles xmlns:mc="http://schemas.openxmlformats.org/markup-compatibility/2006" xmlns:o="urn:schemas-microsoft-com:office:office" xmlns:r="http://schemas.openxmlformats.org/officeDocument/2006/relationships" xmlns:m="http://schemas.openxmlformats.org/officeDocument/2006/math" xmlns:v="urn:schemas-microsoft-com:vml" xmlns:w="http://schemas.openxmlformats.org/wordprocessingml/2006/main" xmlns:w14="http://schemas.microsoft.com/office/word/2010/wordml" xmlns:w10="urn:schemas-microsoft-com:office:word" xmlns:sl="http://schemas.openxmlformats.org/schemaLibrary/2006/main" xmlns:wpsCustomData="http://www.wps.cn/officeDocument/2013/wpsCustomData" mc:Ignorable="w14">
+<w:styles xmlns:mc="http://schemas.openxmlformats.org/markup-compatibility/2006" xmlns:r="http://schemas.openxmlformats.org/officeDocument/2006/relationships" xmlns:w="http://schemas.openxmlformats.org/wordprocessingml/2006/main" xmlns:w14="http://schemas.microsoft.com/office/word/2010/wordml" xmlns:w15="http://schemas.microsoft.com/office/word/2012/wordml" xmlns:w16cex="http://schemas.microsoft.com/office/word/2018/wordml/cex" xmlns:w16cid="http://schemas.microsoft.com/office/word/2016/wordml/cid" xmlns:w16="http://schemas.microsoft.com/office/word/2018/wordml" xmlns:w16du="http://schemas.microsoft.com/office/word/2023/wordml/word16du" xmlns:w16sdtdh="http://schemas.microsoft.com/office/word/2020/wordml/sdtdatahash" xmlns:w16sdtfl="http://schemas.microsoft.com/office/word/2024/wordml/sdtformatlock" xmlns:w16se="http://schemas.microsoft.com/office/word/2015/wordml/symex" mc:Ignorable="w14 w15 w16se w16cid w16 w16cex w16sdtdh w16sdtfl w16du">
   <w:docDefaults>
     <w:rPrDefault>
       <w:rPr>
-        <w:rFonts w:ascii="Times New Roman" w:hAnsi="Times New Roman" w:eastAsia="SimSun" w:cs="Times New Roman"/>
+        <w:rFonts w:ascii="Times New Roman" w:eastAsia="SimSun" w:hAnsi="Times New Roman" w:cs="Times New Roman"/>
+        <w:lang w:val="en-US" w:eastAsia="en-US" w:bidi="ar-SA"/>
       </w:rPr>
     </w:rPrDefault>
     <w:pPrDefault/>
   </w:docDefaults>
-  <w:latentStyles w:count="260" w:defQFormat="0" w:defUnhideWhenUsed="1" w:defSemiHidden="1" w:defUIPriority="99" w:defLockedState="0">
-    <w:lsdException w:qFormat="1" w:unhideWhenUsed="0" w:uiPriority="0" w:semiHidden="0" w:name="Normal"/>
-    <w:lsdException w:qFormat="1" w:unhideWhenUsed="0" w:uiPriority="9" w:semiHidden="0" w:name="heading 1"/>
-    <w:lsdException w:qFormat="1" w:unhideWhenUsed="0" w:uiPriority="0" w:semiHidden="0" w:name="heading 2"/>
-    <w:lsdException w:qFormat="1" w:uiPriority="9" w:name="heading 3"/>
-    <w:lsdException w:qFormat="1" w:uiPriority="9" w:name="heading 4"/>
-    <w:lsdException w:qFormat="1" w:uiPriority="9" w:name="heading 5"/>
-    <w:lsdException w:qFormat="1" w:unhideWhenUsed="0" w:uiPriority="0" w:semiHidden="0" w:name="heading 6"/>
-    <w:lsdException w:qFormat="1" w:unhideWhenUsed="0" w:uiPriority="0" w:semiHidden="0" w:name="heading 7"/>
-    <w:lsdException w:qFormat="1" w:unhideWhenUsed="0" w:uiPriority="0" w:semiHidden="0" w:name="heading 8"/>
-    <w:lsdException w:qFormat="1" w:uiPriority="9" w:name="heading 9"/>
-    <w:lsdException w:uiPriority="99" w:name="index 1"/>
-    <w:lsdException w:uiPriority="99" w:name="index 2"/>
-    <w:lsdException w:uiPriority="99" w:name="index 3"/>
-    <w:lsdException w:uiPriority="99" w:name="index 4"/>
-    <w:lsdException w:uiPriority="99" w:name="index 5"/>
-    <w:lsdException w:uiPriority="99" w:name="index 6"/>
-    <w:lsdException w:uiPriority="99" w:name="index 7"/>
-    <w:lsdException w:uiPriority="99" w:name="index 8"/>
-    <w:lsdException w:uiPriority="99" w:name="index 9"/>
-    <w:lsdException w:uiPriority="39" w:name="toc 1"/>
-    <w:lsdException w:uiPriority="39" w:name="toc 2"/>
-    <w:lsdException w:uiPriority="39" w:name="toc 3"/>
-    <w:lsdException w:uiPriority="39" w:name="toc 4"/>
-    <w:lsdException w:uiPriority="39" w:name="toc 5"/>
-    <w:lsdException w:uiPriority="39" w:name="toc 6"/>
-    <w:lsdException w:uiPriority="39" w:name="toc 7"/>
-    <w:lsdException w:uiPriority="39" w:name="toc 8"/>
-    <w:lsdException w:uiPriority="39" w:name="toc 9"/>
-    <w:lsdException w:uiPriority="99" w:name="Normal Indent"/>
-    <w:lsdException w:uiPriority="99" w:name="footnote text"/>
-    <w:lsdException w:uiPriority="99" w:name="annotation text"/>
-    <w:lsdException w:qFormat="1" w:unhideWhenUsed="0" w:uiPriority="99" w:semiHidden="0" w:name="header"/>
-    <w:lsdException w:qFormat="1" w:unhideWhenUsed="0" w:uiPriority="99" w:semiHidden="0" w:name="footer"/>
-    <w:lsdException w:uiPriority="99" w:name="index heading"/>
-    <w:lsdException w:qFormat="1" w:uiPriority="35" w:name="caption"/>
-    <w:lsdException w:uiPriority="99" w:name="table of figures"/>
-    <w:lsdException w:uiPriority="99" w:name="envelope address"/>
-    <w:lsdException w:uiPriority="99" w:name="envelope return"/>
-    <w:lsdException w:uiPriority="99" w:name="footnote reference"/>
-    <w:lsdException w:uiPriority="99" w:name="annotation reference"/>
-    <w:lsdException w:uiPriority="99" w:name="line number"/>
-    <w:lsdException w:uiPriority="99" w:name="page number"/>
-    <w:lsdException w:uiPriority="99" w:name="endnote reference"/>
-    <w:lsdException w:uiPriority="99" w:name="endnote text"/>
-    <w:lsdException w:uiPriority="99" w:name="table of authorities"/>
-    <w:lsdException w:uiPriority="99" w:name="macro"/>
-    <w:lsdException w:uiPriority="99" w:name="toa heading"/>
-    <w:lsdException w:uiPriority="99" w:name="List"/>
-    <w:lsdException w:uiPriority="99" w:name="List Bullet"/>
-    <w:lsdException w:uiPriority="99" w:name="List Number"/>
-    <w:lsdException w:uiPriority="99" w:name="List 2"/>
-    <w:lsdException w:uiPriority="99" w:name="List 3"/>
-    <w:lsdException w:uiPriority="99" w:name="List 4"/>
-    <w:lsdException w:uiPriority="99" w:name="List 5"/>
-    <w:lsdException w:uiPriority="99" w:name="List Bullet 2"/>
-    <w:lsdException w:uiPriority="99" w:name="List Bullet 3"/>
-    <w:lsdException w:uiPriority="99" w:name="List Bullet 4"/>
-    <w:lsdException w:uiPriority="99" w:name="List Bullet 5"/>
-    <w:lsdException w:uiPriority="99" w:name="List Number 2"/>
-    <w:lsdException w:uiPriority="99" w:name="List Number 3"/>
-    <w:lsdException w:uiPriority="99" w:name="List Number 4"/>
-    <w:lsdException w:uiPriority="99" w:name="List Number 5"/>
-    <w:lsdException w:qFormat="1" w:unhideWhenUsed="0" w:uiPriority="10" w:semiHidden="0" w:name="Title"/>
-    <w:lsdException w:uiPriority="99" w:name="Closing"/>
-    <w:lsdException w:uiPriority="99" w:name="Signature"/>
-    <w:lsdException w:qFormat="1" w:uiPriority="1" w:name="Default Paragraph Font"/>
-    <w:lsdException w:uiPriority="99" w:name="Body Text"/>
-    <w:lsdException w:uiPriority="99" w:name="Body Text Indent"/>
-    <w:lsdException w:uiPriority="99" w:name="List Continue"/>
-    <w:lsdException w:uiPriority="99" w:name="List Continue 2"/>
-    <w:lsdException w:uiPriority="99" w:name="List Continue 3"/>
-    <w:lsdException w:uiPriority="99" w:name="List Continue 4"/>
-    <w:lsdException w:uiPriority="99" w:name="List Continue 5"/>
-    <w:lsdException w:uiPriority="99" w:name="Message Header"/>
-    <w:lsdException w:qFormat="1" w:unhideWhenUsed="0" w:uiPriority="11" w:semiHidden="0" w:name="Subtitle"/>
-    <w:lsdException w:uiPriority="99" w:name="Salutation"/>
-    <w:lsdException w:uiPriority="99" w:name="Date"/>
-    <w:lsdException w:uiPriority="99" w:name="Body Text First Indent"/>
-    <w:lsdException w:uiPriority="99" w:name="Body Text First Indent 2"/>
-    <w:lsdException w:uiPriority="99" w:name="Note Heading"/>
-    <w:lsdException w:uiPriority="99" w:name="Body Text 2"/>
-    <w:lsdException w:uiPriority="99" w:name="Body Text 3"/>
-    <w:lsdException w:uiPriority="99" w:name="Body Text Indent 2"/>
-    <w:lsdException w:uiPriority="99" w:name="Body Text Indent 3"/>
-    <w:lsdException w:uiPriority="99" w:name="Block Text"/>
-    <w:lsdException w:uiPriority="99" w:name="Hyperlink"/>
-    <w:lsdException w:uiPriority="99" w:name="FollowedHyperlink"/>
-    <w:lsdException w:qFormat="1" w:unhideWhenUsed="0" w:uiPriority="22" w:semiHidden="0" w:name="Strong"/>
-    <w:lsdException w:qFormat="1" w:unhideWhenUsed="0" w:uiPriority="20" w:semiHidden="0" w:name="Emphasis"/>
-    <w:lsdException w:uiPriority="99" w:name="Document Map"/>
-    <w:lsdException w:uiPriority="99" w:name="Plain Text"/>
-    <w:lsdException w:uiPriority="99" w:name="E-mail Signature"/>
-    <w:lsdException w:qFormat="1" w:uiPriority="99" w:semiHidden="0" w:name="Normal (Web)"/>
-    <w:lsdException w:uiPriority="99" w:name="HTML Acronym"/>
-    <w:lsdException w:uiPriority="99" w:name="HTML Address"/>
-    <w:lsdException w:uiPriority="99" w:name="HTML Cite"/>
-    <w:lsdException w:uiPriority="99" w:name="HTML Code"/>
-    <w:lsdException w:uiPriority="99" w:name="HTML Definition"/>
-    <w:lsdException w:uiPriority="99" w:name="HTML Keyboard"/>
-    <w:lsdException w:uiPriority="99" w:name="HTML Preformatted"/>
-    <w:lsdException w:uiPriority="99" w:name="HTML Sample"/>
-    <w:lsdException w:uiPriority="99" w:name="HTML Typewriter"/>
-    <w:lsdException w:uiPriority="99" w:name="HTML Variable"/>
-    <w:lsdException w:qFormat="1" w:uiPriority="99" w:name="Normal Table"/>
-    <w:lsdException w:uiPriority="99" w:name="annotation subject"/>
-    <w:lsdException w:uiPriority="99" w:name="Table Simple 1"/>
-    <w:lsdException w:uiPriority="99" w:name="Table Simple 2"/>
-    <w:lsdException w:uiPriority="99" w:name="Table Simple 3"/>
-    <w:lsdException w:uiPriority="99" w:name="Table Classic 1"/>
-    <w:lsdException w:uiPriority="99" w:name="Table Classic 2"/>
-    <w:lsdException w:uiPriority="99" w:name="Table Classic 3"/>
-    <w:lsdException w:uiPriority="99" w:name="Table Classic 4"/>
-    <w:lsdException w:uiPriority="99" w:name="Table Colorful 1"/>
-    <w:lsdException w:uiPriority="99" w:name="Table Colorful 2"/>
-    <w:lsdException w:uiPriority="99" w:name="Table Colorful 3"/>
-    <w:lsdException w:uiPriority="99" w:name="Table Columns 1"/>
-    <w:lsdException w:uiPriority="99" w:name="Table Columns 2"/>
-    <w:lsdException w:uiPriority="99" w:name="Table Columns 3"/>
-    <w:lsdException w:uiPriority="99" w:name="Table Columns 4"/>
-    <w:lsdException w:uiPriority="99" w:name="Table Columns 5"/>
-    <w:lsdException w:uiPriority="99" w:name="Table Grid 1"/>
-    <w:lsdException w:uiPriority="99" w:name="Table Grid 2"/>
-    <w:lsdException w:uiPriority="99" w:name="Table Grid 3"/>
-    <w:lsdException w:uiPriority="99" w:name="Table Grid 4"/>
-    <w:lsdException w:uiPriority="99" w:name="Table Grid 5"/>
-    <w:lsdException w:uiPriority="99" w:name="Table Grid 6"/>
-    <w:lsdException w:uiPriority="99" w:name="Table Grid 7"/>
-    <w:lsdException w:uiPriority="99" w:name="Table Grid 8"/>
-    <w:lsdException w:uiPriority="99" w:name="Table List 1"/>
-    <w:lsdException w:uiPriority="99" w:name="Table List 2"/>
-    <w:lsdException w:uiPriority="99" w:name="Table List 3"/>
-    <w:lsdException w:uiPriority="99" w:name="Table List 4"/>
-    <w:lsdException w:uiPriority="99" w:name="Table List 5"/>
-    <w:lsdException w:uiPriority="99" w:name="Table List 6"/>
-    <w:lsdException w:uiPriority="99" w:name="Table List 7"/>
-    <w:lsdException w:uiPriority="99" w:name="Table List 8"/>
-    <w:lsdException w:uiPriority="99" w:name="Table 3D effects 1"/>
-    <w:lsdException w:uiPriority="99" w:name="Table 3D effects 2"/>
-    <w:lsdException w:uiPriority="99" w:name="Table 3D effects 3"/>
-    <w:lsdException w:uiPriority="99" w:name="Table Contemporary"/>
-    <w:lsdException w:uiPriority="99" w:name="Table Elegant"/>
-    <w:lsdException w:uiPriority="99" w:name="Table Professional"/>
-    <w:lsdException w:uiPriority="99" w:name="Table Subtle 1"/>
-    <w:lsdException w:uiPriority="99" w:name="Table Subtle 2"/>
-    <w:lsdException w:uiPriority="99" w:name="Table Web 1"/>
-    <w:lsdException w:uiPriority="99" w:name="Table Web 2"/>
-    <w:lsdException w:uiPriority="99" w:name="Table Web 3"/>
-    <w:lsdException w:qFormat="1" w:unhideWhenUsed="0" w:uiPriority="0" w:semiHidden="0" w:name="Balloon Text"/>
-    <w:lsdException w:qFormat="1" w:unhideWhenUsed="0" w:uiPriority="99" w:semiHidden="0" w:name="Table Grid"/>
-    <w:lsdException w:uiPriority="99" w:name="Table Theme"/>
-    <w:lsdException w:qFormat="1" w:unhideWhenUsed="0" w:uiPriority="99" w:name="Placeholder Text"/>
-    <w:lsdException w:unhideWhenUsed="0" w:uiPriority="60" w:semiHidden="0" w:name="Light Shading"/>
-    <w:lsdException w:unhideWhenUsed="0" w:uiPriority="61" w:semiHidden="0" w:name="Light List"/>
-    <w:lsdException w:unhideWhenUsed="0" w:uiPriority="62" w:semiHidden="0" w:name="Light Grid"/>
-    <w:lsdException w:unhideWhenUsed="0" w:uiPriority="63" w:semiHidden="0" w:name="Medium Shading 1"/>
-    <w:lsdException w:unhideWhenUsed="0" w:uiPriority="64" w:semiHidden="0" w:name="Medium Shading 2"/>
-    <w:lsdException w:unhideWhenUsed="0" w:uiPriority="65" w:semiHidden="0" w:name="Medium List 1"/>
-    <w:lsdException w:unhideWhenUsed="0" w:uiPriority="66" w:semiHidden="0" w:name="Medium List 2"/>
-    <w:lsdException w:unhideWhenUsed="0" w:uiPriority="67" w:semiHidden="0" w:name="Medium Grid 1"/>
-    <w:lsdException w:unhideWhenUsed="0" w:uiPriority="68" w:semiHidden="0" w:name="Medium Grid 2"/>
-    <w:lsdException w:unhideWhenUsed="0" w:uiPriority="69" w:semiHidden="0" w:name="Medium Grid 3"/>
-    <w:lsdException w:unhideWhenUsed="0" w:uiPriority="70" w:semiHidden="0" w:name="Dark List"/>
-    <w:lsdException w:unhideWhenUsed="0" w:uiPriority="71" w:semiHidden="0" w:name="Colorful Shading"/>
-    <w:lsdException w:unhideWhenUsed="0" w:uiPriority="72" w:semiHidden="0" w:name="Colorful List"/>
-    <w:lsdException w:unhideWhenUsed="0" w:uiPriority="73" w:semiHidden="0" w:name="Colorful Grid"/>
-    <w:lsdException w:unhideWhenUsed="0" w:uiPriority="60" w:semiHidden="0" w:name="Light Shading Accent 1"/>
-    <w:lsdException w:unhideWhenUsed="0" w:uiPriority="61" w:semiHidden="0" w:name="Light List Accent 1"/>
-    <w:lsdException w:unhideWhenUsed="0" w:uiPriority="62" w:semiHidden="0" w:name="Light Grid Accent 1"/>
-    <w:lsdException w:unhideWhenUsed="0" w:uiPriority="63" w:semiHidden="0" w:name="Medium Shading 1 Accent 1"/>
-    <w:lsdException w:unhideWhenUsed="0" w:uiPriority="64" w:semiHidden="0" w:name="Medium Shading 2 Accent 1"/>
-    <w:lsdException w:unhideWhenUsed="0" w:uiPriority="65" w:semiHidden="0" w:name="Medium List 1 Accent 1"/>
-    <w:lsdException w:unhideWhenUsed="0" w:uiPriority="66" w:semiHidden="0" w:name="Medium List 2 Accent 1"/>
-    <w:lsdException w:unhideWhenUsed="0" w:uiPriority="67" w:semiHidden="0" w:name="Medium Grid 1 Accent 1"/>
-    <w:lsdException w:unhideWhenUsed="0" w:uiPriority="68" w:semiHidden="0" w:name="Medium Grid 2 Accent 1"/>
-    <w:lsdException w:unhideWhenUsed="0" w:uiPriority="69" w:semiHidden="0" w:name="Medium Grid 3 Accent 1"/>
-    <w:lsdException w:unhideWhenUsed="0" w:uiPriority="70" w:semiHidden="0" w:name="Dark List Accent 1"/>
-    <w:lsdException w:unhideWhenUsed="0" w:uiPriority="71" w:semiHidden="0" w:name="Colorful Shading Accent 1"/>
-    <w:lsdException w:unhideWhenUsed="0" w:uiPriority="72" w:semiHidden="0" w:name="Colorful List Accent 1"/>
-    <w:lsdException w:unhideWhenUsed="0" w:uiPriority="73" w:semiHidden="0" w:name="Colorful Grid Accent 1"/>
-    <w:lsdException w:unhideWhenUsed="0" w:uiPriority="60" w:semiHidden="0" w:name="Light Shading Accent 2"/>
-    <w:lsdException w:unhideWhenUsed="0" w:uiPriority="61" w:semiHidden="0" w:name="Light List Accent 2"/>
-    <w:lsdException w:unhideWhenUsed="0" w:uiPriority="62" w:semiHidden="0" w:name="Light Grid Accent 2"/>
-    <w:lsdException w:unhideWhenUsed="0" w:uiPriority="63" w:semiHidden="0" w:name="Medium Shading 1 Accent 2"/>
-    <w:lsdException w:unhideWhenUsed="0" w:uiPriority="64" w:semiHidden="0" w:name="Medium Shading 2 Accent 2"/>
-    <w:lsdException w:unhideWhenUsed="0" w:uiPriority="65" w:semiHidden="0" w:name="Medium List 1 Accent 2"/>
-    <w:lsdException w:unhideWhenUsed="0" w:uiPriority="66" w:semiHidden="0" w:name="Medium List 2 Accent 2"/>
-    <w:lsdException w:unhideWhenUsed="0" w:uiPriority="67" w:semiHidden="0" w:name="Medium Grid 1 Accent 2"/>
-    <w:lsdException w:unhideWhenUsed="0" w:uiPriority="68" w:semiHidden="0" w:name="Medium Grid 2 Accent 2"/>
-    <w:lsdException w:unhideWhenUsed="0" w:uiPriority="69" w:semiHidden="0" w:name="Medium Grid 3 Accent 2"/>
-    <w:lsdException w:unhideWhenUsed="0" w:uiPriority="70" w:semiHidden="0" w:name="Dark List Accent 2"/>
-    <w:lsdException w:unhideWhenUsed="0" w:uiPriority="71" w:semiHidden="0" w:name="Colorful Shading Accent 2"/>
-    <w:lsdException w:unhideWhenUsed="0" w:uiPriority="72" w:semiHidden="0" w:name="Colorful List Accent 2"/>
-    <w:lsdException w:unhideWhenUsed="0" w:uiPriority="73" w:semiHidden="0" w:name="Colorful Grid Accent 2"/>
-    <w:lsdException w:unhideWhenUsed="0" w:uiPriority="60" w:semiHidden="0" w:name="Light Shading Accent 3"/>
-    <w:lsdException w:unhideWhenUsed="0" w:uiPriority="61" w:semiHidden="0" w:name="Light List Accent 3"/>
-    <w:lsdException w:unhideWhenUsed="0" w:uiPriority="62" w:semiHidden="0" w:name="Light Grid Accent 3"/>
-    <w:lsdException w:unhideWhenUsed="0" w:uiPriority="63" w:semiHidden="0" w:name="Medium Shading 1 Accent 3"/>
-    <w:lsdException w:unhideWhenUsed="0" w:uiPriority="64" w:semiHidden="0" w:name="Medium Shading 2 Accent 3"/>
-    <w:lsdException w:unhideWhenUsed="0" w:uiPriority="65" w:semiHidden="0" w:name="Medium List 1 Accent 3"/>
-    <w:lsdException w:unhideWhenUsed="0" w:uiPriority="66" w:semiHidden="0" w:name="Medium List 2 Accent 3"/>
-    <w:lsdException w:unhideWhenUsed="0" w:uiPriority="67" w:semiHidden="0" w:name="Medium Grid 1 Accent 3"/>
-    <w:lsdException w:unhideWhenUsed="0" w:uiPriority="68" w:semiHidden="0" w:name="Medium Grid 2 Accent 3"/>
-    <w:lsdException w:unhideWhenUsed="0" w:uiPriority="69" w:semiHidden="0" w:name="Medium Grid 3 Accent 3"/>
-    <w:lsdException w:unhideWhenUsed="0" w:uiPriority="70" w:semiHidden="0" w:name="Dark List Accent 3"/>
-    <w:lsdException w:unhideWhenUsed="0" w:uiPriority="71" w:semiHidden="0" w:name="Colorful Shading Accent 3"/>
-    <w:lsdException w:unhideWhenUsed="0" w:uiPriority="72" w:semiHidden="0" w:name="Colorful List Accent 3"/>
-    <w:lsdException w:unhideWhenUsed="0" w:uiPriority="73" w:semiHidden="0" w:name="Colorful Grid Accent 3"/>
-    <w:lsdException w:unhideWhenUsed="0" w:uiPriority="60" w:semiHidden="0" w:name="Light Shading Accent 4"/>
-    <w:lsdException w:unhideWhenUsed="0" w:uiPriority="61" w:semiHidden="0" w:name="Light List Accent 4"/>
-    <w:lsdException w:unhideWhenUsed="0" w:uiPriority="62" w:semiHidden="0" w:name="Light Grid Accent 4"/>
-    <w:lsdException w:unhideWhenUsed="0" w:uiPriority="63" w:semiHidden="0" w:name="Medium Shading 1 Accent 4"/>
-    <w:lsdException w:unhideWhenUsed="0" w:uiPriority="64" w:semiHidden="0" w:name="Medium Shading 2 Accent 4"/>
-    <w:lsdException w:unhideWhenUsed="0" w:uiPriority="65" w:semiHidden="0" w:name="Medium List 1 Accent 4"/>
-    <w:lsdException w:unhideWhenUsed="0" w:uiPriority="66" w:semiHidden="0" w:name="Medium List 2 Accent 4"/>
-    <w:lsdException w:unhideWhenUsed="0" w:uiPriority="67" w:semiHidden="0" w:name="Medium Grid 1 Accent 4"/>
-    <w:lsdException w:unhideWhenUsed="0" w:uiPriority="68" w:semiHidden="0" w:name="Medium Grid 2 Accent 4"/>
-    <w:lsdException w:unhideWhenUsed="0" w:uiPriority="69" w:semiHidden="0" w:name="Medium Grid 3 Accent 4"/>
-    <w:lsdException w:unhideWhenUsed="0" w:uiPriority="70" w:semiHidden="0" w:name="Dark List Accent 4"/>
-    <w:lsdException w:unhideWhenUsed="0" w:uiPriority="71" w:semiHidden="0" w:name="Colorful Shading Accent 4"/>
-    <w:lsdException w:unhideWhenUsed="0" w:uiPriority="72" w:semiHidden="0" w:name="Colorful List Accent 4"/>
-    <w:lsdException w:unhideWhenUsed="0" w:uiPriority="73" w:semiHidden="0" w:name="Colorful Grid Accent 4"/>
-    <w:lsdException w:unhideWhenUsed="0" w:uiPriority="60" w:semiHidden="0" w:name="Light Shading Accent 5"/>
-    <w:lsdException w:unhideWhenUsed="0" w:uiPriority="61" w:semiHidden="0" w:name="Light List Accent 5"/>
-    <w:lsdException w:unhideWhenUsed="0" w:uiPriority="62" w:semiHidden="0" w:name="Light Grid Accent 5"/>
-    <w:lsdException w:unhideWhenUsed="0" w:uiPriority="63" w:semiHidden="0" w:name="Medium Shading 1 Accent 5"/>
-    <w:lsdException w:unhideWhenUsed="0" w:uiPriority="64" w:semiHidden="0" w:name="Medium Shading 2 Accent 5"/>
-    <w:lsdException w:unhideWhenUsed="0" w:uiPriority="65" w:semiHidden="0" w:name="Medium List 1 Accent 5"/>
-    <w:lsdException w:unhideWhenUsed="0" w:uiPriority="66" w:semiHidden="0" w:name="Medium List 2 Accent 5"/>
-    <w:lsdException w:unhideWhenUsed="0" w:uiPriority="67" w:semiHidden="0" w:name="Medium Grid 1 Accent 5"/>
-    <w:lsdException w:unhideWhenUsed="0" w:uiPriority="68" w:semiHidden="0" w:name="Medium Grid 2 Accent 5"/>
-    <w:lsdException w:unhideWhenUsed="0" w:uiPriority="69" w:semiHidden="0" w:name="Medium Grid 3 Accent 5"/>
-    <w:lsdException w:unhideWhenUsed="0" w:uiPriority="70" w:semiHidden="0" w:name="Dark List Accent 5"/>
-    <w:lsdException w:unhideWhenUsed="0" w:uiPriority="71" w:semiHidden="0" w:name="Colorful Shading Accent 5"/>
-    <w:lsdException w:unhideWhenUsed="0" w:uiPriority="72" w:semiHidden="0" w:name="Colorful List Accent 5"/>
-    <w:lsdException w:unhideWhenUsed="0" w:uiPriority="73" w:semiHidden="0" w:name="Colorful Grid Accent 5"/>
-    <w:lsdException w:unhideWhenUsed="0" w:uiPriority="60" w:semiHidden="0" w:name="Light Shading Accent 6"/>
-    <w:lsdException w:unhideWhenUsed="0" w:uiPriority="61" w:semiHidden="0" w:name="Light List Accent 6"/>
-    <w:lsdException w:unhideWhenUsed="0" w:uiPriority="62" w:semiHidden="0" w:name="Light Grid Accent 6"/>
-    <w:lsdException w:unhideWhenUsed="0" w:uiPriority="63" w:semiHidden="0" w:name="Medium Shading 1 Accent 6"/>
-    <w:lsdException w:unhideWhenUsed="0" w:uiPriority="64" w:semiHidden="0" w:name="Medium Shading 2 Accent 6"/>
-    <w:lsdException w:unhideWhenUsed="0" w:uiPriority="65" w:semiHidden="0" w:name="Medium List 1 Accent 6"/>
-    <w:lsdException w:unhideWhenUsed="0" w:uiPriority="66" w:semiHidden="0" w:name="Medium List 2 Accent 6"/>
-    <w:lsdException w:unhideWhenUsed="0" w:uiPriority="67" w:semiHidden="0" w:name="Medium Grid 1 Accent 6"/>
-    <w:lsdException w:unhideWhenUsed="0" w:uiPriority="68" w:semiHidden="0" w:name="Medium Grid 2 Accent 6"/>
-    <w:lsdException w:unhideWhenUsed="0" w:uiPriority="69" w:semiHidden="0" w:name="Medium Grid 3 Accent 6"/>
-    <w:lsdException w:unhideWhenUsed="0" w:uiPriority="70" w:semiHidden="0" w:name="Dark List Accent 6"/>
-    <w:lsdException w:unhideWhenUsed="0" w:uiPriority="71" w:semiHidden="0" w:name="Colorful Shading Accent 6"/>
-    <w:lsdException w:unhideWhenUsed="0" w:uiPriority="72" w:semiHidden="0" w:name="Colorful List Accent 6"/>
-    <w:lsdException w:unhideWhenUsed="0" w:uiPriority="73" w:semiHidden="0" w:name="Colorful Grid Accent 6"/>
+  <w:latentStyles w:defLockedState="0" w:defUIPriority="99" w:defSemiHidden="0" w:defUnhideWhenUsed="0" w:defQFormat="0" w:count="376">
+    <w:lsdException w:name="Normal" w:uiPriority="0" w:qFormat="1"/>
+    <w:lsdException w:name="heading 1" w:uiPriority="9" w:qFormat="1"/>
+    <w:lsdException w:name="heading 2" w:uiPriority="0" w:qFormat="1"/>
+    <w:lsdException w:name="heading 3" w:semiHidden="1" w:uiPriority="9" w:unhideWhenUsed="1" w:qFormat="1"/>
+    <w:lsdException w:name="heading 4" w:semiHidden="1" w:uiPriority="9" w:unhideWhenUsed="1" w:qFormat="1"/>
+    <w:lsdException w:name="heading 5" w:semiHidden="1" w:uiPriority="9" w:unhideWhenUsed="1" w:qFormat="1"/>
+    <w:lsdException w:name="heading 6" w:uiPriority="0" w:qFormat="1"/>
+    <w:lsdException w:name="heading 7" w:uiPriority="0" w:qFormat="1"/>
+    <w:lsdException w:name="heading 8" w:uiPriority="0" w:qFormat="1"/>
+    <w:lsdException w:name="heading 9" w:semiHidden="1" w:uiPriority="9" w:unhideWhenUsed="1" w:qFormat="1"/>
+    <w:lsdException w:name="index 1" w:semiHidden="1" w:unhideWhenUsed="1"/>
+    <w:lsdException w:name="index 2" w:semiHidden="1" w:unhideWhenUsed="1"/>
+    <w:lsdException w:name="index 3" w:semiHidden="1" w:unhideWhenUsed="1"/>
+    <w:lsdException w:name="index 4" w:semiHidden="1" w:unhideWhenUsed="1"/>
+    <w:lsdException w:name="index 5" w:semiHidden="1" w:unhideWhenUsed="1"/>
+    <w:lsdException w:name="index 6" w:semiHidden="1" w:unhideWhenUsed="1"/>
+    <w:lsdException w:name="index 7" w:semiHidden="1" w:unhideWhenUsed="1"/>
+    <w:lsdException w:name="index 8" w:semiHidden="1" w:unhideWhenUsed="1"/>
+    <w:lsdException w:name="index 9" w:semiHidden="1" w:unhideWhenUsed="1"/>
+    <w:lsdException w:name="toc 1" w:semiHidden="1" w:uiPriority="39" w:unhideWhenUsed="1"/>
+    <w:lsdException w:name="toc 2" w:semiHidden="1" w:uiPriority="39" w:unhideWhenUsed="1"/>
+    <w:lsdException w:name="toc 3" w:semiHidden="1" w:uiPriority="39" w:unhideWhenUsed="1"/>
+    <w:lsdException w:name="toc 4" w:semiHidden="1" w:uiPriority="39" w:unhideWhenUsed="1"/>
+    <w:lsdException w:name="toc 5" w:semiHidden="1" w:uiPriority="39" w:unhideWhenUsed="1"/>
+    <w:lsdException w:name="toc 6" w:semiHidden="1" w:uiPriority="39" w:unhideWhenUsed="1"/>
+    <w:lsdException w:name="toc 7" w:semiHidden="1" w:uiPriority="39" w:unhideWhenUsed="1"/>
+    <w:lsdException w:name="toc 8" w:semiHidden="1" w:uiPriority="39" w:unhideWhenUsed="1"/>
+    <w:lsdException w:name="toc 9" w:semiHidden="1" w:uiPriority="39" w:unhideWhenUsed="1"/>
+    <w:lsdException w:name="Normal Indent" w:semiHidden="1" w:unhideWhenUsed="1"/>
+    <w:lsdException w:name="footnote text" w:semiHidden="1" w:unhideWhenUsed="1"/>
+    <w:lsdException w:name="annotation text" w:semiHidden="1" w:unhideWhenUsed="1"/>
+    <w:lsdException w:name="header" w:qFormat="1"/>
+    <w:lsdException w:name="footer" w:qFormat="1"/>
+    <w:lsdException w:name="index heading" w:semiHidden="1" w:unhideWhenUsed="1"/>
+    <w:lsdException w:name="caption" w:semiHidden="1" w:uiPriority="35" w:unhideWhenUsed="1" w:qFormat="1"/>
+    <w:lsdException w:name="table of figures" w:semiHidden="1" w:unhideWhenUsed="1"/>
+    <w:lsdException w:name="envelope address" w:semiHidden="1" w:unhideWhenUsed="1"/>
+    <w:lsdException w:name="envelope return" w:semiHidden="1" w:unhideWhenUsed="1"/>
+    <w:lsdException w:name="footnote reference" w:semiHidden="1" w:unhideWhenUsed="1"/>
+    <w:lsdException w:name="annotation reference" w:semiHidden="1" w:unhideWhenUsed="1"/>
+    <w:lsdException w:name="line number" w:semiHidden="1" w:unhideWhenUsed="1"/>
+    <w:lsdException w:name="page number" w:semiHidden="1" w:unhideWhenUsed="1"/>
+    <w:lsdException w:name="endnote reference" w:semiHidden="1" w:unhideWhenUsed="1"/>
+    <w:lsdException w:name="endnote text" w:semiHidden="1" w:unhideWhenUsed="1"/>
+    <w:lsdException w:name="table of authorities" w:semiHidden="1" w:unhideWhenUsed="1"/>
+    <w:lsdException w:name="macro" w:semiHidden="1" w:unhideWhenUsed="1"/>
+    <w:lsdException w:name="toa heading" w:semiHidden="1" w:unhideWhenUsed="1"/>
+    <w:lsdException w:name="List" w:semiHidden="1" w:unhideWhenUsed="1"/>
+    <w:lsdException w:name="List Bullet" w:semiHidden="1" w:unhideWhenUsed="1"/>
+    <w:lsdException w:name="List Number" w:semiHidden="1" w:unhideWhenUsed="1"/>
+    <w:lsdException w:name="List 2" w:semiHidden="1" w:unhideWhenUsed="1"/>
+    <w:lsdException w:name="List 3" w:semiHidden="1" w:unhideWhenUsed="1"/>
+    <w:lsdException w:name="List 4" w:semiHidden="1" w:unhideWhenUsed="1"/>
+    <w:lsdException w:name="List 5" w:semiHidden="1" w:unhideWhenUsed="1"/>
+    <w:lsdException w:name="List Bullet 2" w:semiHidden="1" w:unhideWhenUsed="1"/>
+    <w:lsdException w:name="List Bullet 3" w:semiHidden="1" w:unhideWhenUsed="1"/>
+    <w:lsdException w:name="List Bullet 4" w:semiHidden="1" w:unhideWhenUsed="1"/>
+    <w:lsdException w:name="List Bullet 5" w:semiHidden="1" w:unhideWhenUsed="1"/>
+    <w:lsdException w:name="List Number 2" w:semiHidden="1" w:unhideWhenUsed="1"/>
+    <w:lsdException w:name="List Number 3" w:semiHidden="1" w:unhideWhenUsed="1"/>
+    <w:lsdException w:name="List Number 4" w:semiHidden="1" w:unhideWhenUsed="1"/>
+    <w:lsdException w:name="List Number 5" w:semiHidden="1" w:unhideWhenUsed="1"/>
+    <w:lsdException w:name="Title" w:uiPriority="10" w:qFormat="1"/>
+    <w:lsdException w:name="Closing" w:semiHidden="1" w:unhideWhenUsed="1"/>
+    <w:lsdException w:name="Signature" w:semiHidden="1" w:unhideWhenUsed="1"/>
+    <w:lsdException w:name="Default Paragraph Font" w:semiHidden="1" w:uiPriority="1" w:unhideWhenUsed="1" w:qFormat="1"/>
+    <w:lsdException w:name="Body Text" w:semiHidden="1" w:unhideWhenUsed="1"/>
+    <w:lsdException w:name="Body Text Indent" w:semiHidden="1" w:unhideWhenUsed="1"/>
+    <w:lsdException w:name="List Continue" w:semiHidden="1" w:unhideWhenUsed="1"/>
+    <w:lsdException w:name="List Continue 2" w:semiHidden="1" w:unhideWhenUsed="1"/>
+    <w:lsdException w:name="List Continue 3" w:semiHidden="1" w:unhideWhenUsed="1"/>
+    <w:lsdException w:name="List Continue 4" w:semiHidden="1" w:unhideWhenUsed="1"/>
+    <w:lsdException w:name="List Continue 5" w:semiHidden="1" w:unhideWhenUsed="1"/>
+    <w:lsdException w:name="Message Header" w:semiHidden="1" w:unhideWhenUsed="1"/>
+    <w:lsdException w:name="Subtitle" w:uiPriority="11" w:qFormat="1"/>
+    <w:lsdException w:name="Salutation" w:semiHidden="1" w:unhideWhenUsed="1"/>
+    <w:lsdException w:name="Date" w:semiHidden="1" w:unhideWhenUsed="1"/>
+    <w:lsdException w:name="Body Text First Indent" w:semiHidden="1" w:unhideWhenUsed="1"/>
+    <w:lsdException w:name="Body Text First Indent 2" w:semiHidden="1" w:unhideWhenUsed="1"/>
+    <w:lsdException w:name="Note Heading" w:semiHidden="1" w:unhideWhenUsed="1"/>
+    <w:lsdException w:name="Body Text 2" w:semiHidden="1" w:unhideWhenUsed="1"/>
+    <w:lsdException w:name="Body Text 3" w:semiHidden="1" w:unhideWhenUsed="1"/>
+    <w:lsdException w:name="Body Text Indent 2" w:semiHidden="1" w:unhideWhenUsed="1"/>
+    <w:lsdException w:name="Body Text Indent 3" w:semiHidden="1" w:unhideWhenUsed="1"/>
+    <w:lsdException w:name="Block Text" w:semiHidden="1" w:unhideWhenUsed="1"/>
+    <w:lsdException w:name="Hyperlink" w:semiHidden="1" w:unhideWhenUsed="1"/>
+    <w:lsdException w:name="FollowedHyperlink" w:semiHidden="1" w:unhideWhenUsed="1"/>
+    <w:lsdException w:name="Strong" w:uiPriority="22" w:qFormat="1"/>
+    <w:lsdException w:name="Emphasis" w:uiPriority="20" w:qFormat="1"/>
+    <w:lsdException w:name="Document Map" w:semiHidden="1" w:unhideWhenUsed="1"/>
+    <w:lsdException w:name="Plain Text" w:semiHidden="1" w:unhideWhenUsed="1"/>
+    <w:lsdException w:name="E-mail Signature" w:semiHidden="1" w:unhideWhenUsed="1"/>
+    <w:lsdException w:name="HTML Top of Form" w:semiHidden="1" w:unhideWhenUsed="1"/>
+    <w:lsdException w:name="HTML Bottom of Form" w:semiHidden="1" w:unhideWhenUsed="1"/>
+    <w:lsdException w:name="Normal (Web)" w:unhideWhenUsed="1" w:qFormat="1"/>
+    <w:lsdException w:name="HTML Acronym" w:semiHidden="1" w:unhideWhenUsed="1"/>
+    <w:lsdException w:name="HTML Address" w:semiHidden="1" w:unhideWhenUsed="1"/>
+    <w:lsdException w:name="HTML Cite" w:semiHidden="1" w:unhideWhenUsed="1"/>
+    <w:lsdException w:name="HTML Code" w:semiHidden="1" w:unhideWhenUsed="1"/>
+    <w:lsdException w:name="HTML Definition" w:semiHidden="1" w:unhideWhenUsed="1"/>
+    <w:lsdException w:name="HTML Keyboard" w:semiHidden="1" w:unhideWhenUsed="1"/>
+    <w:lsdException w:name="HTML Preformatted" w:semiHidden="1" w:unhideWhenUsed="1"/>
+    <w:lsdException w:name="HTML Sample" w:semiHidden="1" w:unhideWhenUsed="1"/>
+    <w:lsdException w:name="HTML Typewriter" w:semiHidden="1" w:unhideWhenUsed="1"/>
+    <w:lsdException w:name="HTML Variable" w:semiHidden="1" w:unhideWhenUsed="1"/>
+    <w:lsdException w:name="Normal Table" w:semiHidden="1" w:unhideWhenUsed="1" w:qFormat="1"/>
+    <w:lsdException w:name="annotation subject" w:semiHidden="1" w:unhideWhenUsed="1"/>
+    <w:lsdException w:name="No List" w:semiHidden="1" w:unhideWhenUsed="1"/>
+    <w:lsdException w:name="Outline List 1" w:semiHidden="1" w:unhideWhenUsed="1"/>
+    <w:lsdException w:name="Outline List 2" w:semiHidden="1" w:unhideWhenUsed="1"/>
+    <w:lsdException w:name="Outline List 3" w:semiHidden="1" w:unhideWhenUsed="1"/>
+    <w:lsdException w:name="Table Simple 1" w:semiHidden="1" w:unhideWhenUsed="1"/>
+    <w:lsdException w:name="Table Simple 2" w:semiHidden="1" w:unhideWhenUsed="1"/>
+    <w:lsdException w:name="Table Simple 3" w:semiHidden="1" w:unhideWhenUsed="1"/>
+    <w:lsdException w:name="Table Classic 1" w:semiHidden="1" w:unhideWhenUsed="1"/>
+    <w:lsdException w:name="Table Classic 2" w:semiHidden="1" w:unhideWhenUsed="1"/>
+    <w:lsdException w:name="Table Classic 3" w:semiHidden="1" w:unhideWhenUsed="1"/>
+    <w:lsdException w:name="Table Classic 4" w:semiHidden="1" w:unhideWhenUsed="1"/>
+    <w:lsdException w:name="Table Colorful 1" w:semiHidden="1" w:unhideWhenUsed="1"/>
+    <w:lsdException w:name="Table Colorful 2" w:semiHidden="1" w:unhideWhenUsed="1"/>
+    <w:lsdException w:name="Table Colorful 3" w:semiHidden="1" w:unhideWhenUsed="1"/>
+    <w:lsdException w:name="Table Columns 1" w:semiHidden="1" w:unhideWhenUsed="1"/>
+    <w:lsdException w:name="Table Columns 2" w:semiHidden="1" w:unhideWhenUsed="1"/>
+    <w:lsdException w:name="Table Columns 3" w:semiHidden="1" w:unhideWhenUsed="1"/>
+    <w:lsdException w:name="Table Columns 4" w:semiHidden="1" w:unhideWhenUsed="1"/>
+    <w:lsdException w:name="Table Columns 5" w:semiHidden="1" w:unhideWhenUsed="1"/>
+    <w:lsdException w:name="Table Grid 1" w:semiHidden="1" w:unhideWhenUsed="1"/>
+    <w:lsdException w:name="Table Grid 2" w:semiHidden="1" w:unhideWhenUsed="1"/>
+    <w:lsdException w:name="Table Grid 3" w:semiHidden="1" w:unhideWhenUsed="1"/>
+    <w:lsdException w:name="Table Grid 4" w:semiHidden="1" w:unhideWhenUsed="1"/>
+    <w:lsdException w:name="Table Grid 5" w:semiHidden="1" w:unhideWhenUsed="1"/>
+    <w:lsdException w:name="Table Grid 6" w:semiHidden="1" w:unhideWhenUsed="1"/>
+    <w:lsdException w:name="Table Grid 7" w:semiHidden="1" w:unhideWhenUsed="1"/>
+    <w:lsdException w:name="Table Grid 8" w:semiHidden="1" w:unhideWhenUsed="1"/>
+    <w:lsdException w:name="Table List 1" w:semiHidden="1" w:unhideWhenUsed="1"/>
+    <w:lsdException w:name="Table List 2" w:semiHidden="1" w:unhideWhenUsed="1"/>
+    <w:lsdException w:name="Table List 3" w:semiHidden="1" w:unhideWhenUsed="1"/>
+    <w:lsdException w:name="Table List 4" w:semiHidden="1" w:unhideWhenUsed="1"/>
+    <w:lsdException w:name="Table List 5" w:semiHidden="1" w:unhideWhenUsed="1"/>
+    <w:lsdException w:name="Table List 6" w:semiHidden="1" w:unhideWhenUsed="1"/>
+    <w:lsdException w:name="Table List 7" w:semiHidden="1" w:unhideWhenUsed="1"/>
+    <w:lsdException w:name="Table List 8" w:semiHidden="1" w:unhideWhenUsed="1"/>
+    <w:lsdException w:name="Table 3D effects 1" w:semiHidden="1" w:unhideWhenUsed="1"/>
+    <w:lsdException w:name="Table 3D effects 2" w:semiHidden="1" w:unhideWhenUsed="1"/>
+    <w:lsdException w:name="Table 3D effects 3" w:semiHidden="1" w:unhideWhenUsed="1"/>
+    <w:lsdException w:name="Table Contemporary" w:semiHidden="1" w:unhideWhenUsed="1"/>
+    <w:lsdException w:name="Table Elegant" w:semiHidden="1" w:unhideWhenUsed="1"/>
+    <w:lsdException w:name="Table Professional" w:semiHidden="1" w:unhideWhenUsed="1"/>
+    <w:lsdException w:name="Table Subtle 1" w:semiHidden="1" w:unhideWhenUsed="1"/>
+    <w:lsdException w:name="Table Subtle 2" w:semiHidden="1" w:unhideWhenUsed="1"/>
+    <w:lsdException w:name="Table Web 1" w:semiHidden="1" w:unhideWhenUsed="1"/>
+    <w:lsdException w:name="Table Web 2" w:semiHidden="1" w:unhideWhenUsed="1"/>
+    <w:lsdException w:name="Table Web 3" w:semiHidden="1" w:unhideWhenUsed="1"/>
+    <w:lsdException w:name="Balloon Text" w:uiPriority="0" w:qFormat="1"/>
+    <w:lsdException w:name="Table Grid" w:qFormat="1"/>
+    <w:lsdException w:name="Table Theme" w:semiHidden="1" w:unhideWhenUsed="1"/>
+    <w:lsdException w:name="Placeholder Text" w:semiHidden="1" w:qFormat="1"/>
+    <w:lsdException w:name="No Spacing" w:semiHidden="1" w:unhideWhenUsed="1"/>
+    <w:lsdException w:name="Light Shading" w:uiPriority="60"/>
+    <w:lsdException w:name="Light List" w:uiPriority="61"/>
+    <w:lsdException w:name="Light Grid" w:uiPriority="62"/>
+    <w:lsdException w:name="Medium Shading 1" w:uiPriority="63"/>
+    <w:lsdException w:name="Medium Shading 2" w:uiPriority="64"/>
+    <w:lsdException w:name="Medium List 1" w:uiPriority="65"/>
+    <w:lsdException w:name="Medium List 2" w:uiPriority="66"/>
+    <w:lsdException w:name="Medium Grid 1" w:uiPriority="67"/>
+    <w:lsdException w:name="Medium Grid 2" w:uiPriority="68"/>
+    <w:lsdException w:name="Medium Grid 3" w:uiPriority="69"/>
+    <w:lsdException w:name="Dark List" w:uiPriority="70"/>
+    <w:lsdException w:name="Colorful Shading" w:uiPriority="71"/>
+    <w:lsdException w:name="Colorful List" w:uiPriority="72"/>
+    <w:lsdException w:name="Colorful Grid" w:uiPriority="73"/>
+    <w:lsdException w:name="Light Shading Accent 1" w:uiPriority="60"/>
+    <w:lsdException w:name="Light List Accent 1" w:uiPriority="61"/>
+    <w:lsdException w:name="Light Grid Accent 1" w:uiPriority="62"/>
+    <w:lsdException w:name="Medium Shading 1 Accent 1" w:uiPriority="63"/>
+    <w:lsdException w:name="Medium Shading 2 Accent 1" w:uiPriority="64"/>
+    <w:lsdException w:name="Medium List 1 Accent 1" w:uiPriority="65"/>
+    <w:lsdException w:name="Revision" w:semiHidden="1" w:unhideWhenUsed="1"/>
+    <w:lsdException w:name="List Paragraph" w:semiHidden="1" w:unhideWhenUsed="1"/>
+    <w:lsdException w:name="Quote" w:semiHidden="1" w:unhideWhenUsed="1"/>
+    <w:lsdException w:name="Intense Quote" w:semiHidden="1" w:unhideWhenUsed="1"/>
+    <w:lsdException w:name="Medium List 2 Accent 1" w:uiPriority="66"/>
+    <w:lsdException w:name="Medium Grid 1 Accent 1" w:uiPriority="67"/>
+    <w:lsdException w:name="Medium Grid 2 Accent 1" w:uiPriority="68"/>
+    <w:lsdException w:name="Medium Grid 3 Accent 1" w:uiPriority="69"/>
+    <w:lsdException w:name="Dark List Accent 1" w:uiPriority="70"/>
+    <w:lsdException w:name="Colorful Shading Accent 1" w:uiPriority="71"/>
+    <w:lsdException w:name="Colorful List Accent 1" w:uiPriority="72"/>
+    <w:lsdException w:name="Colorful Grid Accent 1" w:uiPriority="73"/>
+    <w:lsdException w:name="Light Shading Accent 2" w:uiPriority="60"/>
+    <w:lsdException w:name="Light List Accent 2" w:uiPriority="61"/>
+    <w:lsdException w:name="Light Grid Accent 2" w:uiPriority="62"/>
+    <w:lsdException w:name="Medium Shading 1 Accent 2" w:uiPriority="63"/>
+    <w:lsdException w:name="Medium Shading 2 Accent 2" w:uiPriority="64"/>
+    <w:lsdException w:name="Medium List 1 Accent 2" w:uiPriority="65"/>
+    <w:lsdException w:name="Medium List 2 Accent 2" w:uiPriority="66"/>
+    <w:lsdException w:name="Medium Grid 1 Accent 2" w:uiPriority="67"/>
+    <w:lsdException w:name="Medium Grid 2 Accent 2" w:uiPriority="68"/>
+    <w:lsdException w:name="Medium Grid 3 Accent 2" w:uiPriority="69"/>
+    <w:lsdException w:name="Dark List Accent 2" w:uiPriority="70"/>
+    <w:lsdException w:name="Colorful Shading Accent 2" w:uiPriority="71"/>
+    <w:lsdException w:name="Colorful List Accent 2" w:uiPriority="72"/>
+    <w:lsdException w:name="Colorful Grid Accent 2" w:uiPriority="73"/>
+    <w:lsdException w:name="Light Shading Accent 3" w:uiPriority="60"/>
+    <w:lsdException w:name="Light List Accent 3" w:uiPriority="61"/>
+    <w:lsdException w:name="Light Grid Accent 3" w:uiPriority="62"/>
+    <w:lsdException w:name="Medium Shading 1 Accent 3" w:uiPriority="63"/>
+    <w:lsdException w:name="Medium Shading 2 Accent 3" w:uiPriority="64"/>
+    <w:lsdException w:name="Medium List 1 Accent 3" w:uiPriority="65"/>
+    <w:lsdException w:name="Medium List 2 Accent 3" w:uiPriority="66"/>
+    <w:lsdException w:name="Medium Grid 1 Accent 3" w:uiPriority="67"/>
+    <w:lsdException w:name="Medium Grid 2 Accent 3" w:uiPriority="68"/>
+    <w:lsdException w:name="Medium Grid 3 Accent 3" w:uiPriority="69"/>
+    <w:lsdException w:name="Dark List Accent 3" w:uiPriority="70"/>
+    <w:lsdException w:name="Colorful Shading Accent 3" w:uiPriority="71"/>
+    <w:lsdException w:name="Colorful List Accent 3" w:uiPriority="72"/>
+    <w:lsdException w:name="Colorful Grid Accent 3" w:uiPriority="73"/>
+    <w:lsdException w:name="Light Shading Accent 4" w:uiPriority="60"/>
+    <w:lsdException w:name="Light List Accent 4" w:uiPriority="61"/>
+    <w:lsdException w:name="Light Grid Accent 4" w:uiPriority="62"/>
+    <w:lsdException w:name="Medium Shading 1 Accent 4" w:uiPriority="63"/>
+    <w:lsdException w:name="Medium Shading 2 Accent 4" w:uiPriority="64"/>
+    <w:lsdException w:name="Medium List 1 Accent 4" w:uiPriority="65"/>
+    <w:lsdException w:name="Medium List 2 Accent 4" w:uiPriority="66"/>
+    <w:lsdException w:name="Medium Grid 1 Accent 4" w:uiPriority="67"/>
+    <w:lsdException w:name="Medium Grid 2 Accent 4" w:uiPriority="68"/>
+    <w:lsdException w:name="Medium Grid 3 Accent 4" w:uiPriority="69"/>
+    <w:lsdException w:name="Dark List Accent 4" w:uiPriority="70"/>
+    <w:lsdException w:name="Colorful Shading Accent 4" w:uiPriority="71"/>
+    <w:lsdException w:name="Colorful List Accent 4" w:uiPriority="72"/>
+    <w:lsdException w:name="Colorful Grid Accent 4" w:uiPriority="73"/>
+    <w:lsdException w:name="Light Shading Accent 5" w:uiPriority="60"/>
+    <w:lsdException w:name="Light List Accent 5" w:uiPriority="61"/>
+    <w:lsdException w:name="Light Grid Accent 5" w:uiPriority="62"/>
+    <w:lsdException w:name="Medium Shading 1 Accent 5" w:uiPriority="63"/>
+    <w:lsdException w:name="Medium Shading 2 Accent 5" w:uiPriority="64"/>
+    <w:lsdException w:name="Medium List 1 Accent 5" w:uiPriority="65"/>
+    <w:lsdException w:name="Medium List 2 Accent 5" w:uiPriority="66"/>
+    <w:lsdException w:name="Medium Grid 1 Accent 5" w:uiPriority="67"/>
+    <w:lsdException w:name="Medium Grid 2 Accent 5" w:uiPriority="68"/>
+    <w:lsdException w:name="Medium Grid 3 Accent 5" w:uiPriority="69"/>
+    <w:lsdException w:name="Dark List Accent 5" w:uiPriority="70"/>
+    <w:lsdException w:name="Colorful Shading Accent 5" w:uiPriority="71"/>
+    <w:lsdException w:name="Colorful List Accent 5" w:uiPriority="72"/>
+    <w:lsdException w:name="Colorful Grid Accent 5" w:uiPriority="73"/>
+    <w:lsdException w:name="Light Shading Accent 6" w:uiPriority="60"/>
+    <w:lsdException w:name="Light List Accent 6" w:uiPriority="61"/>
+    <w:lsdException w:name="Light Grid Accent 6" w:uiPriority="62"/>
+    <w:lsdException w:name="Medium Shading 1 Accent 6" w:uiPriority="63"/>
+    <w:lsdException w:name="Medium Shading 2 Accent 6" w:uiPriority="64"/>
+    <w:lsdException w:name="Medium List 1 Accent 6" w:uiPriority="65"/>
+    <w:lsdException w:name="Medium List 2 Accent 6" w:uiPriority="66"/>
+    <w:lsdException w:name="Medium Grid 1 Accent 6" w:uiPriority="67"/>
+    <w:lsdException w:name="Medium Grid 2 Accent 6" w:uiPriority="68"/>
+    <w:lsdException w:name="Medium Grid 3 Accent 6" w:uiPriority="69"/>
+    <w:lsdException w:name="Dark List Accent 6" w:uiPriority="70"/>
+    <w:lsdException w:name="Colorful Shading Accent 6" w:uiPriority="71"/>
+    <w:lsdException w:name="Colorful List Accent 6" w:uiPriority="72"/>
+    <w:lsdException w:name="Colorful Grid Accent 6" w:uiPriority="73"/>
+    <w:lsdException w:name="Subtle Emphasis" w:uiPriority="19" w:qFormat="1"/>
+    <w:lsdException w:name="Intense Emphasis" w:uiPriority="21" w:qFormat="1"/>
+    <w:lsdException w:name="Subtle Reference" w:uiPriority="31" w:qFormat="1"/>
+    <w:lsdException w:name="Intense Reference" w:uiPriority="32" w:qFormat="1"/>
+    <w:lsdException w:name="Book Title" w:uiPriority="33" w:qFormat="1"/>
+    <w:lsdException w:name="Bibliography" w:semiHidden="1" w:uiPriority="37" w:unhideWhenUsed="1"/>
+    <w:lsdException w:name="TOC Heading" w:semiHidden="1" w:uiPriority="39" w:unhideWhenUsed="1" w:qFormat="1"/>
+    <w:lsdException w:name="Plain Table 1" w:uiPriority="41"/>
+    <w:lsdException w:name="Plain Table 2" w:uiPriority="42"/>
+    <w:lsdException w:name="Plain Table 3" w:uiPriority="43"/>
+    <w:lsdException w:name="Plain Table 4" w:uiPriority="44"/>
+    <w:lsdException w:name="Plain Table 5" w:uiPriority="45"/>
+    <w:lsdException w:name="Grid Table Light" w:uiPriority="40"/>
+    <w:lsdException w:name="Grid Table 1 Light" w:uiPriority="46"/>
+    <w:lsdException w:name="Grid Table 2" w:uiPriority="47"/>
+    <w:lsdException w:name="Grid Table 3" w:uiPriority="48"/>
+    <w:lsdException w:name="Grid Table 4" w:uiPriority="49"/>
+    <w:lsdException w:name="Grid Table 5 Dark" w:uiPriority="50"/>
+    <w:lsdException w:name="Grid Table 6 Colorful" w:uiPriority="51"/>
+    <w:lsdException w:name="Grid Table 7 Colorful" w:uiPriority="52"/>
+    <w:lsdException w:name="Grid Table 1 Light Accent 1" w:uiPriority="46"/>
+    <w:lsdException w:name="Grid Table 2 Accent 1" w:uiPriority="47"/>
+    <w:lsdException w:name="Grid Table 3 Accent 1" w:uiPriority="48"/>
+    <w:lsdException w:name="Grid Table 4 Accent 1" w:uiPriority="49"/>
+    <w:lsdException w:name="Grid Table 5 Dark Accent 1" w:uiPriority="50"/>
+    <w:lsdException w:name="Grid Table 6 Colorful Accent 1" w:uiPriority="51"/>
+    <w:lsdException w:name="Grid Table 7 Colorful Accent 1" w:uiPriority="52"/>
+    <w:lsdException w:name="Grid Table 1 Light Accent 2" w:uiPriority="46"/>
+    <w:lsdException w:name="Grid Table 2 Accent 2" w:uiPriority="47"/>
+    <w:lsdException w:name="Grid Table 3 Accent 2" w:uiPriority="48"/>
+    <w:lsdException w:name="Grid Table 4 Accent 2" w:uiPriority="49"/>
+    <w:lsdException w:name="Grid Table 5 Dark Accent 2" w:uiPriority="50"/>
+    <w:lsdException w:name="Grid Table 6 Colorful Accent 2" w:uiPriority="51"/>
+    <w:lsdException w:name="Grid Table 7 Colorful Accent 2" w:uiPriority="52"/>
+    <w:lsdException w:name="Grid Table 1 Light Accent 3" w:uiPriority="46"/>
+    <w:lsdException w:name="Grid Table 2 Accent 3" w:uiPriority="47"/>
+    <w:lsdException w:name="Grid Table 3 Accent 3" w:uiPriority="48"/>
+    <w:lsdException w:name="Grid Table 4 Accent 3" w:uiPriority="49"/>
+    <w:lsdException w:name="Grid Table 5 Dark Accent 3" w:uiPriority="50"/>
+    <w:lsdException w:name="Grid Table 6 Colorful Accent 3" w:uiPriority="51"/>
+    <w:lsdException w:name="Grid Table 7 Colorful Accent 3" w:uiPriority="52"/>
+    <w:lsdException w:name="Grid Table 1 Light Accent 4" w:uiPriority="46"/>
+    <w:lsdException w:name="Grid Table 2 Accent 4" w:uiPriority="47"/>
+    <w:lsdException w:name="Grid Table 3 Accent 4" w:uiPriority="48"/>
+    <w:lsdException w:name="Grid Table 4 Accent 4" w:uiPriority="49"/>
+    <w:lsdException w:name="Grid Table 5 Dark Accent 4" w:uiPriority="50"/>
+    <w:lsdException w:name="Grid Table 6 Colorful Accent 4" w:uiPriority="51"/>
+    <w:lsdException w:name="Grid Table 7 Colorful Accent 4" w:uiPriority="52"/>
+    <w:lsdException w:name="Grid Table 1 Light Accent 5" w:uiPriority="46"/>
+    <w:lsdException w:name="Grid Table 2 Accent 5" w:uiPriority="47"/>
+    <w:lsdException w:name="Grid Table 3 Accent 5" w:uiPriority="48"/>
+    <w:lsdException w:name="Grid Table 4 Accent 5" w:uiPriority="49"/>
+    <w:lsdException w:name="Grid Table 5 Dark Accent 5" w:uiPriority="50"/>
+    <w:lsdException w:name="Grid Table 6 Colorful Accent 5" w:uiPriority="51"/>
+    <w:lsdException w:name="Grid Table 7 Colorful Accent 5" w:uiPriority="52"/>
+    <w:lsdException w:name="Grid Table 1 Light Accent 6" w:uiPriority="46"/>
+    <w:lsdException w:name="Grid Table 2 Accent 6" w:uiPriority="47"/>
+    <w:lsdException w:name="Grid Table 3 Accent 6" w:uiPriority="48"/>
+    <w:lsdException w:name="Grid Table 4 Accent 6" w:uiPriority="49"/>
+    <w:lsdException w:name="Grid Table 5 Dark Accent 6" w:uiPriority="50"/>
+    <w:lsdException w:name="Grid Table 6 Colorful Accent 6" w:uiPriority="51"/>
+    <w:lsdException w:name="Grid Table 7 Colorful Accent 6" w:uiPriority="52"/>
+    <w:lsdException w:name="List Table 1 Light" w:uiPriority="46"/>
+    <w:lsdException w:name="List Table 2" w:uiPriority="47"/>
+    <w:lsdException w:name="List Table 3" w:uiPriority="48"/>
+    <w:lsdException w:name="List Table 4" w:uiPriority="49"/>
+    <w:lsdException w:name="List Table 5 Dark" w:uiPriority="50"/>
+    <w:lsdException w:name="List Table 6 Colorful" w:uiPriority="51"/>
+    <w:lsdException w:name="List Table 7 Colorful" w:uiPriority="52"/>
+    <w:lsdException w:name="List Table 1 Light Accent 1" w:uiPriority="46"/>
+    <w:lsdException w:name="List Table 2 Accent 1" w:uiPriority="47"/>
+    <w:lsdException w:name="List Table 3 Accent 1" w:uiPriority="48"/>
+    <w:lsdException w:name="List Table 4 Accent 1" w:uiPriority="49"/>
+    <w:lsdException w:name="List Table 5 Dark Accent 1" w:uiPriority="50"/>
+    <w:lsdException w:name="List Table 6 Colorful Accent 1" w:uiPriority="51"/>
+    <w:lsdException w:name="List Table 7 Colorful Accent 1" w:uiPriority="52"/>
+    <w:lsdException w:name="List Table 1 Light Accent 2" w:uiPriority="46"/>
+    <w:lsdException w:name="List Table 2 Accent 2" w:uiPriority="47"/>
+    <w:lsdException w:name="List Table 3 Accent 2" w:uiPriority="48"/>
+    <w:lsdException w:name="List Table 4 Accent 2" w:uiPriority="49"/>
+    <w:lsdException w:name="List Table 5 Dark Accent 2" w:uiPriority="50"/>
+    <w:lsdException w:name="List Table 6 Colorful Accent 2" w:uiPriority="51"/>
+    <w:lsdException w:name="List Table 7 Colorful Accent 2" w:uiPriority="52"/>
+    <w:lsdException w:name="List Table 1 Light Accent 3" w:uiPriority="46"/>
+    <w:lsdException w:name="List Table 2 Accent 3" w:uiPriority="47"/>
+    <w:lsdException w:name="List Table 3 Accent 3" w:uiPriority="48"/>
+    <w:lsdException w:name="List Table 4 Accent 3" w:uiPriority="49"/>
+    <w:lsdException w:name="List Table 5 Dark Accent 3" w:uiPriority="50"/>
+    <w:lsdException w:name="List Table 6 Colorful Accent 3" w:uiPriority="51"/>
+    <w:lsdException w:name="List Table 7 Colorful Accent 3" w:uiPriority="52"/>
+    <w:lsdException w:name="List Table 1 Light Accent 4" w:uiPriority="46"/>
+    <w:lsdException w:name="List Table 2 Accent 4" w:uiPriority="47"/>
+    <w:lsdException w:name="List Table 3 Accent 4" w:uiPriority="48"/>
+    <w:lsdException w:name="List Table 4 Accent 4" w:uiPriority="49"/>
+    <w:lsdException w:name="List Table 5 Dark Accent 4" w:uiPriority="50"/>
+    <w:lsdException w:name="List Table 6 Colorful Accent 4" w:uiPriority="51"/>
+    <w:lsdException w:name="List Table 7 Colorful Accent 4" w:uiPriority="52"/>
+    <w:lsdException w:name="List Table 1 Light Accent 5" w:uiPriority="46"/>
+    <w:lsdException w:name="List Table 2 Accent 5" w:uiPriority="47"/>
+    <w:lsdException w:name="List Table 3 Accent 5" w:uiPriority="48"/>
+    <w:lsdException w:name="List Table 4 Accent 5" w:uiPriority="49"/>
+    <w:lsdException w:name="List Table 5 Dark Accent 5" w:uiPriority="50"/>
+    <w:lsdException w:name="List Table 6 Colorful Accent 5" w:uiPriority="51"/>
+    <w:lsdException w:name="List Table 7 Colorful Accent 5" w:uiPriority="52"/>
+    <w:lsdException w:name="List Table 1 Light Accent 6" w:uiPriority="46"/>
+    <w:lsdException w:name="List Table 2 Accent 6" w:uiPriority="47"/>
+    <w:lsdException w:name="List Table 3 Accent 6" w:uiPriority="48"/>
+    <w:lsdException w:name="List Table 4 Accent 6" w:uiPriority="49"/>
+    <w:lsdException w:name="List Table 5 Dark Accent 6" w:uiPriority="50"/>
+    <w:lsdException w:name="List Table 6 Colorful Accent 6" w:uiPriority="51"/>
+    <w:lsdException w:name="List Table 7 Colorful Accent 6" w:uiPriority="52"/>
+    <w:lsdException w:name="Mention" w:semiHidden="1" w:unhideWhenUsed="1"/>
+    <w:lsdException w:name="Smart Hyperlink" w:semiHidden="1" w:unhideWhenUsed="1"/>
+    <w:lsdException w:name="Hashtag" w:semiHidden="1" w:unhideWhenUsed="1"/>
+    <w:lsdException w:name="Unresolved Mention" w:semiHidden="1" w:unhideWhenUsed="1"/>
+    <w:lsdException w:name="Smart Link" w:semiHidden="1" w:unhideWhenUsed="1"/>
   </w:latentStyles>
-  <w:style w:type="paragraph" w:default="1" w:styleId="1">
+  <w:style w:type="paragraph" w:default="1" w:styleId="Normal">
     <w:name w:val="Normal"/>
     <w:autoRedefine/>
     <w:qFormat/>
-    <w:uiPriority w:val="0"/>
     <w:pPr>
       <w:suppressAutoHyphens/>
       <w:autoSpaceDN w:val="0"/>
@@ -4061,20 +4378,20 @@
       <w:textAlignment w:val="baseline"/>
     </w:pPr>
     <w:rPr>
-      <w:rFonts w:ascii="Calibri" w:hAnsi="Calibri" w:eastAsia="Calibri" w:cs="Times New Roman"/>
+      <w:rFonts w:ascii="Calibri" w:eastAsia="Calibri" w:hAnsi="Calibri"/>
       <w:sz w:val="22"/>
       <w:szCs w:val="22"/>
-      <w:lang w:val="en-PH" w:eastAsia="en-US" w:bidi="ar-SA"/>
+      <w:lang w:val="en-PH"/>
     </w:rPr>
   </w:style>
-  <w:style w:type="paragraph" w:styleId="2">
+  <w:style w:type="paragraph" w:styleId="Heading1">
     <w:name w:val="heading 1"/>
-    <w:basedOn w:val="1"/>
-    <w:next w:val="1"/>
-    <w:link w:val="26"/>
+    <w:basedOn w:val="Normal"/>
+    <w:next w:val="Normal"/>
+    <w:link w:val="Heading1Char"/>
     <w:autoRedefine/>
+    <w:uiPriority w:val="9"/>
     <w:qFormat/>
-    <w:uiPriority w:val="9"/>
     <w:pPr>
       <w:keepNext/>
       <w:keepLines/>
@@ -4082,20 +4399,19 @@
       <w:outlineLvl w:val="0"/>
     </w:pPr>
     <w:rPr>
-      <w:rFonts w:asciiTheme="majorHAnsi" w:hAnsiTheme="majorHAnsi" w:eastAsiaTheme="majorEastAsia" w:cstheme="majorBidi"/>
-      <w:color w:val="2F5597" w:themeColor="accent1" w:themeShade="BF"/>
+      <w:rFonts w:asciiTheme="majorHAnsi" w:eastAsiaTheme="majorEastAsia" w:hAnsiTheme="majorHAnsi" w:cstheme="majorBidi"/>
+      <w:color w:val="2F5496" w:themeColor="accent1" w:themeShade="BF"/>
       <w:sz w:val="32"/>
       <w:szCs w:val="32"/>
     </w:rPr>
   </w:style>
-  <w:style w:type="paragraph" w:styleId="3">
+  <w:style w:type="paragraph" w:styleId="Heading2">
     <w:name w:val="heading 2"/>
-    <w:basedOn w:val="1"/>
-    <w:next w:val="1"/>
-    <w:link w:val="22"/>
+    <w:basedOn w:val="Normal"/>
+    <w:next w:val="Normal"/>
+    <w:link w:val="Heading2Char"/>
     <w:autoRedefine/>
     <w:qFormat/>
-    <w:uiPriority w:val="0"/>
     <w:pPr>
       <w:keepNext/>
       <w:suppressAutoHyphens w:val="0"/>
@@ -4106,23 +4422,23 @@
       <w:outlineLvl w:val="1"/>
     </w:pPr>
     <w:rPr>
-      <w:rFonts w:ascii="Arial" w:hAnsi="Arial" w:eastAsia="Times New Roman"/>
+      <w:rFonts w:ascii="Arial" w:eastAsia="Times New Roman" w:hAnsi="Arial"/>
       <w:b/>
       <w:sz w:val="20"/>
       <w:szCs w:val="20"/>
       <w:lang w:val="en-US"/>
     </w:rPr>
   </w:style>
-  <w:style w:type="paragraph" w:styleId="4">
+  <w:style w:type="paragraph" w:styleId="Heading3">
     <w:name w:val="heading 3"/>
-    <w:basedOn w:val="1"/>
-    <w:next w:val="1"/>
-    <w:link w:val="27"/>
+    <w:basedOn w:val="Normal"/>
+    <w:next w:val="Normal"/>
+    <w:link w:val="Heading3Char"/>
     <w:autoRedefine/>
+    <w:uiPriority w:val="9"/>
     <w:semiHidden/>
     <w:unhideWhenUsed/>
     <w:qFormat/>
-    <w:uiPriority w:val="9"/>
     <w:pPr>
       <w:keepNext/>
       <w:keepLines/>
@@ -4130,22 +4446,22 @@
       <w:outlineLvl w:val="2"/>
     </w:pPr>
     <w:rPr>
-      <w:rFonts w:asciiTheme="majorHAnsi" w:hAnsiTheme="majorHAnsi" w:eastAsiaTheme="majorEastAsia" w:cstheme="majorBidi"/>
-      <w:color w:val="203864" w:themeColor="accent1" w:themeShade="80"/>
+      <w:rFonts w:asciiTheme="majorHAnsi" w:eastAsiaTheme="majorEastAsia" w:hAnsiTheme="majorHAnsi" w:cstheme="majorBidi"/>
+      <w:color w:val="1F3864" w:themeColor="accent1" w:themeShade="80"/>
       <w:sz w:val="24"/>
       <w:szCs w:val="24"/>
     </w:rPr>
   </w:style>
-  <w:style w:type="paragraph" w:styleId="5">
+  <w:style w:type="paragraph" w:styleId="Heading4">
     <w:name w:val="heading 4"/>
-    <w:basedOn w:val="1"/>
-    <w:next w:val="1"/>
-    <w:link w:val="28"/>
+    <w:basedOn w:val="Normal"/>
+    <w:next w:val="Normal"/>
+    <w:link w:val="Heading4Char"/>
     <w:autoRedefine/>
+    <w:uiPriority w:val="9"/>
     <w:semiHidden/>
     <w:unhideWhenUsed/>
     <w:qFormat/>
-    <w:uiPriority w:val="9"/>
     <w:pPr>
       <w:keepNext/>
       <w:keepLines/>
@@ -4153,22 +4469,22 @@
       <w:outlineLvl w:val="3"/>
     </w:pPr>
     <w:rPr>
-      <w:rFonts w:asciiTheme="majorHAnsi" w:hAnsiTheme="majorHAnsi" w:eastAsiaTheme="majorEastAsia" w:cstheme="majorBidi"/>
+      <w:rFonts w:asciiTheme="majorHAnsi" w:eastAsiaTheme="majorEastAsia" w:hAnsiTheme="majorHAnsi" w:cstheme="majorBidi"/>
       <w:i/>
       <w:iCs/>
-      <w:color w:val="2F5597" w:themeColor="accent1" w:themeShade="BF"/>
+      <w:color w:val="2F5496" w:themeColor="accent1" w:themeShade="BF"/>
     </w:rPr>
   </w:style>
-  <w:style w:type="paragraph" w:styleId="6">
+  <w:style w:type="paragraph" w:styleId="Heading5">
     <w:name w:val="heading 5"/>
-    <w:basedOn w:val="1"/>
-    <w:next w:val="1"/>
-    <w:link w:val="30"/>
+    <w:basedOn w:val="Normal"/>
+    <w:next w:val="Normal"/>
+    <w:link w:val="Heading5Char"/>
     <w:autoRedefine/>
+    <w:uiPriority w:val="9"/>
     <w:semiHidden/>
     <w:unhideWhenUsed/>
     <w:qFormat/>
-    <w:uiPriority w:val="9"/>
     <w:pPr>
       <w:keepNext/>
       <w:keepLines/>
@@ -4176,18 +4492,17 @@
       <w:outlineLvl w:val="4"/>
     </w:pPr>
     <w:rPr>
-      <w:rFonts w:asciiTheme="majorHAnsi" w:hAnsiTheme="majorHAnsi" w:eastAsiaTheme="majorEastAsia" w:cstheme="majorBidi"/>
-      <w:color w:val="2F5597" w:themeColor="accent1" w:themeShade="BF"/>
+      <w:rFonts w:asciiTheme="majorHAnsi" w:eastAsiaTheme="majorEastAsia" w:hAnsiTheme="majorHAnsi" w:cstheme="majorBidi"/>
+      <w:color w:val="2F5496" w:themeColor="accent1" w:themeShade="BF"/>
     </w:rPr>
   </w:style>
-  <w:style w:type="paragraph" w:styleId="7">
+  <w:style w:type="paragraph" w:styleId="Heading6">
     <w:name w:val="heading 6"/>
-    <w:basedOn w:val="1"/>
-    <w:next w:val="1"/>
-    <w:link w:val="23"/>
+    <w:basedOn w:val="Normal"/>
+    <w:next w:val="Normal"/>
+    <w:link w:val="Heading6Char"/>
     <w:autoRedefine/>
     <w:qFormat/>
-    <w:uiPriority w:val="0"/>
     <w:pPr>
       <w:keepNext/>
       <w:framePr w:hSpace="180" w:wrap="around" w:vAnchor="text" w:hAnchor="margin" w:xAlign="right" w:y="160"/>
@@ -4200,20 +4515,19 @@
       <w:outlineLvl w:val="5"/>
     </w:pPr>
     <w:rPr>
-      <w:rFonts w:ascii="Arial" w:hAnsi="Arial" w:eastAsia="Times New Roman"/>
+      <w:rFonts w:ascii="Arial" w:eastAsia="Times New Roman" w:hAnsi="Arial"/>
       <w:b/>
       <w:szCs w:val="20"/>
       <w:lang w:val="en-US"/>
     </w:rPr>
   </w:style>
-  <w:style w:type="paragraph" w:styleId="8">
+  <w:style w:type="paragraph" w:styleId="Heading7">
     <w:name w:val="heading 7"/>
-    <w:basedOn w:val="1"/>
-    <w:next w:val="1"/>
-    <w:link w:val="24"/>
+    <w:basedOn w:val="Normal"/>
+    <w:next w:val="Normal"/>
+    <w:link w:val="Heading7Char"/>
     <w:autoRedefine/>
     <w:qFormat/>
-    <w:uiPriority w:val="0"/>
     <w:pPr>
       <w:keepNext/>
       <w:suppressAutoHyphens w:val="0"/>
@@ -4223,21 +4537,20 @@
       <w:outlineLvl w:val="6"/>
     </w:pPr>
     <w:rPr>
-      <w:rFonts w:ascii="Arial" w:hAnsi="Arial" w:eastAsia="Times New Roman"/>
+      <w:rFonts w:ascii="Arial" w:eastAsia="Times New Roman" w:hAnsi="Arial"/>
       <w:b/>
       <w:bCs/>
       <w:szCs w:val="20"/>
       <w:lang w:val="en-US"/>
     </w:rPr>
   </w:style>
-  <w:style w:type="paragraph" w:styleId="9">
+  <w:style w:type="paragraph" w:styleId="Heading8">
     <w:name w:val="heading 8"/>
-    <w:basedOn w:val="1"/>
-    <w:next w:val="1"/>
-    <w:link w:val="25"/>
+    <w:basedOn w:val="Normal"/>
+    <w:next w:val="Normal"/>
+    <w:link w:val="Heading8Char"/>
     <w:autoRedefine/>
     <w:qFormat/>
-    <w:uiPriority w:val="0"/>
     <w:pPr>
       <w:keepNext/>
       <w:framePr w:hSpace="180" w:wrap="around" w:vAnchor="text" w:hAnchor="margin" w:y="106"/>
@@ -4248,22 +4561,22 @@
       <w:outlineLvl w:val="7"/>
     </w:pPr>
     <w:rPr>
-      <w:rFonts w:ascii="Arial" w:hAnsi="Arial" w:eastAsia="Times New Roman"/>
+      <w:rFonts w:ascii="Arial" w:eastAsia="Times New Roman" w:hAnsi="Arial"/>
       <w:b/>
       <w:szCs w:val="20"/>
       <w:lang w:val="en-US"/>
     </w:rPr>
   </w:style>
-  <w:style w:type="paragraph" w:styleId="10">
+  <w:style w:type="paragraph" w:styleId="Heading9">
     <w:name w:val="heading 9"/>
-    <w:basedOn w:val="1"/>
-    <w:next w:val="1"/>
-    <w:link w:val="31"/>
+    <w:basedOn w:val="Normal"/>
+    <w:next w:val="Normal"/>
+    <w:link w:val="Heading9Char"/>
     <w:autoRedefine/>
+    <w:uiPriority w:val="9"/>
     <w:semiHidden/>
     <w:unhideWhenUsed/>
     <w:qFormat/>
-    <w:uiPriority w:val="9"/>
     <w:pPr>
       <w:keepNext/>
       <w:keepLines/>
@@ -4271,38 +4584,27 @@
       <w:outlineLvl w:val="8"/>
     </w:pPr>
     <w:rPr>
-      <w:rFonts w:asciiTheme="majorHAnsi" w:hAnsiTheme="majorHAnsi" w:eastAsiaTheme="majorEastAsia" w:cstheme="majorBidi"/>
+      <w:rFonts w:asciiTheme="majorHAnsi" w:eastAsiaTheme="majorEastAsia" w:hAnsiTheme="majorHAnsi" w:cstheme="majorBidi"/>
       <w:i/>
       <w:iCs/>
       <w:color w:val="262626" w:themeColor="text1" w:themeTint="D9"/>
       <w:sz w:val="21"/>
       <w:szCs w:val="21"/>
-      <w14:textFill>
-        <w14:solidFill>
-          <w14:schemeClr w14:val="tx1">
-            <w14:lumMod w14:val="85000"/>
-            <w14:lumOff w14:val="15000"/>
-          </w14:schemeClr>
-        </w14:solidFill>
-      </w14:textFill>
     </w:rPr>
   </w:style>
-  <w:style w:type="character" w:default="1" w:styleId="11">
+  <w:style w:type="character" w:default="1" w:styleId="DefaultParagraphFont">
     <w:name w:val="Default Paragraph Font"/>
-    <w:autoRedefine/>
+    <w:uiPriority w:val="1"/>
     <w:semiHidden/>
     <w:unhideWhenUsed/>
-    <w:qFormat/>
-    <w:uiPriority w:val="1"/>
   </w:style>
-  <w:style w:type="table" w:default="1" w:styleId="12">
+  <w:style w:type="table" w:default="1" w:styleId="TableNormal">
     <w:name w:val="Normal Table"/>
-    <w:autoRedefine/>
+    <w:uiPriority w:val="99"/>
     <w:semiHidden/>
     <w:unhideWhenUsed/>
-    <w:qFormat/>
-    <w:uiPriority w:val="99"/>
     <w:tblPr>
+      <w:tblInd w:w="0" w:type="dxa"/>
       <w:tblCellMar>
         <w:top w:w="0" w:type="dxa"/>
         <w:left w:w="108" w:type="dxa"/>
@@ -4311,12 +4613,17 @@
       </w:tblCellMar>
     </w:tblPr>
   </w:style>
-  <w:style w:type="paragraph" w:styleId="13">
+  <w:style w:type="numbering" w:default="1" w:styleId="NoList">
+    <w:name w:val="No List"/>
+    <w:uiPriority w:val="99"/>
+    <w:semiHidden/>
+    <w:unhideWhenUsed/>
+  </w:style>
+  <w:style w:type="paragraph" w:styleId="BalloonText">
     <w:name w:val="Balloon Text"/>
-    <w:basedOn w:val="1"/>
+    <w:basedOn w:val="Normal"/>
     <w:autoRedefine/>
     <w:qFormat/>
-    <w:uiPriority w:val="0"/>
     <w:pPr>
       <w:spacing w:after="0" w:line="240" w:lineRule="auto"/>
     </w:pPr>
@@ -4326,12 +4633,12 @@
       <w:szCs w:val="18"/>
     </w:rPr>
   </w:style>
-  <w:style w:type="paragraph" w:styleId="14">
+  <w:style w:type="paragraph" w:styleId="Footer">
     <w:name w:val="footer"/>
-    <w:basedOn w:val="1"/>
+    <w:basedOn w:val="Normal"/>
     <w:autoRedefine/>
+    <w:uiPriority w:val="99"/>
     <w:qFormat/>
-    <w:uiPriority w:val="99"/>
     <w:pPr>
       <w:tabs>
         <w:tab w:val="center" w:pos="4680"/>
@@ -4340,12 +4647,12 @@
       <w:spacing w:after="0" w:line="240" w:lineRule="auto"/>
     </w:pPr>
   </w:style>
-  <w:style w:type="paragraph" w:styleId="15">
+  <w:style w:type="paragraph" w:styleId="Header">
     <w:name w:val="header"/>
-    <w:basedOn w:val="1"/>
+    <w:basedOn w:val="Normal"/>
     <w:autoRedefine/>
+    <w:uiPriority w:val="99"/>
     <w:qFormat/>
-    <w:uiPriority w:val="99"/>
     <w:pPr>
       <w:tabs>
         <w:tab w:val="center" w:pos="4680"/>
@@ -4354,226 +4661,211 @@
       <w:spacing w:after="0" w:line="240" w:lineRule="auto"/>
     </w:pPr>
   </w:style>
-  <w:style w:type="paragraph" w:styleId="16">
+  <w:style w:type="paragraph" w:styleId="NormalWeb">
     <w:name w:val="Normal (Web)"/>
     <w:autoRedefine/>
+    <w:uiPriority w:val="99"/>
     <w:unhideWhenUsed/>
     <w:qFormat/>
-    <w:uiPriority w:val="99"/>
     <w:pPr>
       <w:spacing w:beforeAutospacing="1" w:afterAutospacing="1"/>
     </w:pPr>
     <w:rPr>
-      <w:rFonts w:ascii="Times New Roman" w:hAnsi="Times New Roman" w:eastAsia="SimSun" w:cs="Times New Roman"/>
       <w:sz w:val="24"/>
       <w:szCs w:val="24"/>
-      <w:lang w:val="en-US" w:eastAsia="zh-CN" w:bidi="ar-SA"/>
+      <w:lang w:eastAsia="zh-CN"/>
     </w:rPr>
   </w:style>
-  <w:style w:type="table" w:styleId="17">
+  <w:style w:type="table" w:styleId="TableGrid">
     <w:name w:val="Table Grid"/>
-    <w:basedOn w:val="12"/>
+    <w:basedOn w:val="TableNormal"/>
     <w:autoRedefine/>
+    <w:uiPriority w:val="99"/>
     <w:qFormat/>
-    <w:uiPriority w:val="99"/>
     <w:tblPr>
       <w:tblBorders>
-        <w:top w:val="single" w:color="auto" w:sz="4" w:space="0"/>
-        <w:left w:val="single" w:color="auto" w:sz="4" w:space="0"/>
-        <w:bottom w:val="single" w:color="auto" w:sz="4" w:space="0"/>
-        <w:right w:val="single" w:color="auto" w:sz="4" w:space="0"/>
-        <w:insideH w:val="single" w:color="auto" w:sz="4" w:space="0"/>
-        <w:insideV w:val="single" w:color="auto" w:sz="4" w:space="0"/>
+        <w:top w:val="single" w:sz="4" w:space="0" w:color="auto"/>
+        <w:left w:val="single" w:sz="4" w:space="0" w:color="auto"/>
+        <w:bottom w:val="single" w:sz="4" w:space="0" w:color="auto"/>
+        <w:right w:val="single" w:sz="4" w:space="0" w:color="auto"/>
+        <w:insideH w:val="single" w:sz="4" w:space="0" w:color="auto"/>
+        <w:insideV w:val="single" w:sz="4" w:space="0" w:color="auto"/>
       </w:tblBorders>
     </w:tblPr>
   </w:style>
-  <w:style w:type="character" w:customStyle="1" w:styleId="18">
+  <w:style w:type="character" w:customStyle="1" w:styleId="HeaderChar">
     <w:name w:val="Header Char"/>
-    <w:basedOn w:val="11"/>
+    <w:basedOn w:val="DefaultParagraphFont"/>
+    <w:autoRedefine/>
+    <w:uiPriority w:val="99"/>
+    <w:qFormat/>
+  </w:style>
+  <w:style w:type="character" w:customStyle="1" w:styleId="FooterChar">
+    <w:name w:val="Footer Char"/>
+    <w:basedOn w:val="DefaultParagraphFont"/>
+    <w:autoRedefine/>
+    <w:uiPriority w:val="99"/>
+    <w:qFormat/>
+  </w:style>
+  <w:style w:type="character" w:customStyle="1" w:styleId="BalloonTextChar">
+    <w:name w:val="Balloon Text Char"/>
+    <w:basedOn w:val="DefaultParagraphFont"/>
     <w:autoRedefine/>
     <w:qFormat/>
-    <w:uiPriority w:val="99"/>
-  </w:style>
-  <w:style w:type="character" w:customStyle="1" w:styleId="19">
-    <w:name w:val="Footer Char"/>
-    <w:basedOn w:val="11"/>
-    <w:autoRedefine/>
-    <w:qFormat/>
-    <w:uiPriority w:val="99"/>
-  </w:style>
-  <w:style w:type="character" w:customStyle="1" w:styleId="20">
-    <w:name w:val="Balloon Text Char"/>
-    <w:basedOn w:val="11"/>
-    <w:autoRedefine/>
-    <w:qFormat/>
-    <w:uiPriority w:val="0"/>
     <w:rPr>
       <w:rFonts w:ascii="Segoe UI" w:hAnsi="Segoe UI" w:cs="Segoe UI"/>
       <w:sz w:val="18"/>
       <w:szCs w:val="18"/>
     </w:rPr>
   </w:style>
-  <w:style w:type="character" w:styleId="21">
+  <w:style w:type="character" w:styleId="PlaceholderText">
     <w:name w:val="Placeholder Text"/>
-    <w:basedOn w:val="11"/>
+    <w:basedOn w:val="DefaultParagraphFont"/>
     <w:autoRedefine/>
+    <w:uiPriority w:val="99"/>
     <w:semiHidden/>
     <w:qFormat/>
-    <w:uiPriority w:val="99"/>
     <w:rPr>
       <w:color w:val="808080"/>
     </w:rPr>
   </w:style>
-  <w:style w:type="character" w:customStyle="1" w:styleId="22">
+  <w:style w:type="character" w:customStyle="1" w:styleId="Heading2Char">
     <w:name w:val="Heading 2 Char"/>
-    <w:basedOn w:val="11"/>
-    <w:link w:val="3"/>
+    <w:basedOn w:val="DefaultParagraphFont"/>
+    <w:link w:val="Heading2"/>
     <w:autoRedefine/>
     <w:qFormat/>
-    <w:uiPriority w:val="0"/>
     <w:rPr>
-      <w:rFonts w:ascii="Arial" w:hAnsi="Arial" w:eastAsia="Times New Roman"/>
+      <w:rFonts w:ascii="Arial" w:eastAsia="Times New Roman" w:hAnsi="Arial"/>
       <w:b/>
       <w:sz w:val="20"/>
       <w:szCs w:val="20"/>
       <w:lang w:val="en-US"/>
     </w:rPr>
   </w:style>
-  <w:style w:type="character" w:customStyle="1" w:styleId="23">
+  <w:style w:type="character" w:customStyle="1" w:styleId="Heading6Char">
     <w:name w:val="Heading 6 Char"/>
-    <w:basedOn w:val="11"/>
-    <w:link w:val="7"/>
+    <w:basedOn w:val="DefaultParagraphFont"/>
+    <w:link w:val="Heading6"/>
     <w:autoRedefine/>
     <w:qFormat/>
-    <w:uiPriority w:val="0"/>
     <w:rPr>
-      <w:rFonts w:ascii="Arial" w:hAnsi="Arial" w:eastAsia="Times New Roman"/>
+      <w:rFonts w:ascii="Arial" w:eastAsia="Times New Roman" w:hAnsi="Arial"/>
       <w:b/>
       <w:szCs w:val="20"/>
       <w:lang w:val="en-US"/>
     </w:rPr>
   </w:style>
-  <w:style w:type="character" w:customStyle="1" w:styleId="24">
+  <w:style w:type="character" w:customStyle="1" w:styleId="Heading7Char">
     <w:name w:val="Heading 7 Char"/>
-    <w:basedOn w:val="11"/>
-    <w:link w:val="8"/>
+    <w:basedOn w:val="DefaultParagraphFont"/>
+    <w:link w:val="Heading7"/>
     <w:autoRedefine/>
     <w:qFormat/>
-    <w:uiPriority w:val="0"/>
     <w:rPr>
-      <w:rFonts w:ascii="Arial" w:hAnsi="Arial" w:eastAsia="Times New Roman"/>
+      <w:rFonts w:ascii="Arial" w:eastAsia="Times New Roman" w:hAnsi="Arial"/>
       <w:b/>
       <w:bCs/>
       <w:szCs w:val="20"/>
       <w:lang w:val="en-US"/>
     </w:rPr>
   </w:style>
-  <w:style w:type="character" w:customStyle="1" w:styleId="25">
+  <w:style w:type="character" w:customStyle="1" w:styleId="Heading8Char">
     <w:name w:val="Heading 8 Char"/>
-    <w:basedOn w:val="11"/>
-    <w:link w:val="9"/>
+    <w:basedOn w:val="DefaultParagraphFont"/>
+    <w:link w:val="Heading8"/>
     <w:autoRedefine/>
     <w:qFormat/>
-    <w:uiPriority w:val="0"/>
     <w:rPr>
-      <w:rFonts w:ascii="Arial" w:hAnsi="Arial" w:eastAsia="Times New Roman"/>
+      <w:rFonts w:ascii="Arial" w:eastAsia="Times New Roman" w:hAnsi="Arial"/>
       <w:b/>
       <w:szCs w:val="20"/>
       <w:lang w:val="en-US"/>
     </w:rPr>
   </w:style>
-  <w:style w:type="character" w:customStyle="1" w:styleId="26">
+  <w:style w:type="character" w:customStyle="1" w:styleId="Heading1Char">
     <w:name w:val="Heading 1 Char"/>
-    <w:basedOn w:val="11"/>
-    <w:link w:val="2"/>
+    <w:basedOn w:val="DefaultParagraphFont"/>
+    <w:link w:val="Heading1"/>
     <w:autoRedefine/>
+    <w:uiPriority w:val="9"/>
     <w:qFormat/>
-    <w:uiPriority w:val="9"/>
     <w:rPr>
-      <w:rFonts w:asciiTheme="majorHAnsi" w:hAnsiTheme="majorHAnsi" w:eastAsiaTheme="majorEastAsia" w:cstheme="majorBidi"/>
-      <w:color w:val="2F5597" w:themeColor="accent1" w:themeShade="BF"/>
+      <w:rFonts w:asciiTheme="majorHAnsi" w:eastAsiaTheme="majorEastAsia" w:hAnsiTheme="majorHAnsi" w:cstheme="majorBidi"/>
+      <w:color w:val="2F5496" w:themeColor="accent1" w:themeShade="BF"/>
       <w:sz w:val="32"/>
       <w:szCs w:val="32"/>
     </w:rPr>
   </w:style>
-  <w:style w:type="character" w:customStyle="1" w:styleId="27">
+  <w:style w:type="character" w:customStyle="1" w:styleId="Heading3Char">
     <w:name w:val="Heading 3 Char"/>
-    <w:basedOn w:val="11"/>
-    <w:link w:val="4"/>
+    <w:basedOn w:val="DefaultParagraphFont"/>
+    <w:link w:val="Heading3"/>
     <w:autoRedefine/>
+    <w:uiPriority w:val="9"/>
     <w:semiHidden/>
     <w:qFormat/>
-    <w:uiPriority w:val="9"/>
     <w:rPr>
-      <w:rFonts w:asciiTheme="majorHAnsi" w:hAnsiTheme="majorHAnsi" w:eastAsiaTheme="majorEastAsia" w:cstheme="majorBidi"/>
-      <w:color w:val="203864" w:themeColor="accent1" w:themeShade="80"/>
+      <w:rFonts w:asciiTheme="majorHAnsi" w:eastAsiaTheme="majorEastAsia" w:hAnsiTheme="majorHAnsi" w:cstheme="majorBidi"/>
+      <w:color w:val="1F3864" w:themeColor="accent1" w:themeShade="80"/>
       <w:sz w:val="24"/>
       <w:szCs w:val="24"/>
     </w:rPr>
   </w:style>
-  <w:style w:type="character" w:customStyle="1" w:styleId="28">
+  <w:style w:type="character" w:customStyle="1" w:styleId="Heading4Char">
     <w:name w:val="Heading 4 Char"/>
-    <w:basedOn w:val="11"/>
-    <w:link w:val="5"/>
+    <w:basedOn w:val="DefaultParagraphFont"/>
+    <w:link w:val="Heading4"/>
     <w:autoRedefine/>
+    <w:uiPriority w:val="9"/>
     <w:semiHidden/>
     <w:qFormat/>
-    <w:uiPriority w:val="9"/>
     <w:rPr>
-      <w:rFonts w:asciiTheme="majorHAnsi" w:hAnsiTheme="majorHAnsi" w:eastAsiaTheme="majorEastAsia" w:cstheme="majorBidi"/>
+      <w:rFonts w:asciiTheme="majorHAnsi" w:eastAsiaTheme="majorEastAsia" w:hAnsiTheme="majorHAnsi" w:cstheme="majorBidi"/>
       <w:i/>
       <w:iCs/>
-      <w:color w:val="2F5597" w:themeColor="accent1" w:themeShade="BF"/>
+      <w:color w:val="2F5496" w:themeColor="accent1" w:themeShade="BF"/>
     </w:rPr>
   </w:style>
-  <w:style w:type="paragraph" w:customStyle="1" w:styleId="29">
+  <w:style w:type="paragraph" w:customStyle="1" w:styleId="Default">
     <w:name w:val="Default"/>
     <w:autoRedefine/>
     <w:qFormat/>
-    <w:uiPriority w:val="0"/>
     <w:rPr>
-      <w:rFonts w:ascii="Times New Roman" w:hAnsi="Times New Roman" w:eastAsia="Times New Roman" w:cs="Times New Roman"/>
+      <w:rFonts w:eastAsia="Times New Roman"/>
       <w:snapToGrid w:val="0"/>
       <w:sz w:val="24"/>
-      <w:lang w:val="en-PH" w:eastAsia="en-US" w:bidi="ar-SA"/>
+      <w:lang w:val="en-PH"/>
     </w:rPr>
   </w:style>
-  <w:style w:type="character" w:customStyle="1" w:styleId="30">
+  <w:style w:type="character" w:customStyle="1" w:styleId="Heading5Char">
     <w:name w:val="Heading 5 Char"/>
-    <w:basedOn w:val="11"/>
-    <w:link w:val="6"/>
+    <w:basedOn w:val="DefaultParagraphFont"/>
+    <w:link w:val="Heading5"/>
     <w:autoRedefine/>
+    <w:uiPriority w:val="9"/>
     <w:semiHidden/>
     <w:qFormat/>
-    <w:uiPriority w:val="9"/>
     <w:rPr>
-      <w:rFonts w:asciiTheme="majorHAnsi" w:hAnsiTheme="majorHAnsi" w:eastAsiaTheme="majorEastAsia" w:cstheme="majorBidi"/>
-      <w:color w:val="2F5597" w:themeColor="accent1" w:themeShade="BF"/>
+      <w:rFonts w:asciiTheme="majorHAnsi" w:eastAsiaTheme="majorEastAsia" w:hAnsiTheme="majorHAnsi" w:cstheme="majorBidi"/>
+      <w:color w:val="2F5496" w:themeColor="accent1" w:themeShade="BF"/>
     </w:rPr>
   </w:style>
-  <w:style w:type="character" w:customStyle="1" w:styleId="31">
+  <w:style w:type="character" w:customStyle="1" w:styleId="Heading9Char">
     <w:name w:val="Heading 9 Char"/>
-    <w:basedOn w:val="11"/>
-    <w:link w:val="10"/>
+    <w:basedOn w:val="DefaultParagraphFont"/>
+    <w:link w:val="Heading9"/>
     <w:autoRedefine/>
+    <w:uiPriority w:val="9"/>
     <w:semiHidden/>
     <w:qFormat/>
-    <w:uiPriority w:val="9"/>
     <w:rPr>
-      <w:rFonts w:asciiTheme="majorHAnsi" w:hAnsiTheme="majorHAnsi" w:eastAsiaTheme="majorEastAsia" w:cstheme="majorBidi"/>
+      <w:rFonts w:asciiTheme="majorHAnsi" w:eastAsiaTheme="majorEastAsia" w:hAnsiTheme="majorHAnsi" w:cstheme="majorBidi"/>
       <w:i/>
       <w:iCs/>
       <w:color w:val="262626" w:themeColor="text1" w:themeTint="D9"/>
       <w:sz w:val="21"/>
       <w:szCs w:val="21"/>
-      <w14:textFill>
-        <w14:solidFill>
-          <w14:schemeClr w14:val="tx1">
-            <w14:lumMod w14:val="85000"/>
-            <w14:lumOff w14:val="15000"/>
-          </w14:schemeClr>
-        </w14:solidFill>
-      </w14:textFill>
     </w:rPr>
   </w:style>
 </w:styles>
@@ -4831,6 +5123,7 @@
     </a:fmtScheme>
   </a:themeElements>
   <a:objectDefaults/>
+  <a:extraClrSchemeLst/>
 </a:theme>
 </file>
 

</xml_diff>

<commit_message>
fix(report): Update template to use DateReleasedOnly for bottom date
</commit_message>
<xml_diff>
--- a/public/template.docx
+++ b/public/template.docx
@@ -64,7 +64,6 @@
         </w:rPr>
         <w:t xml:space="preserve">       SPECIFICATIONS</w:t>
       </w:r>
-      <w:proofErr w:type="gramStart"/>
       <w:r>
         <w:rPr>
           <w:rFonts w:asciiTheme="majorHAnsi" w:hAnsiTheme="majorHAnsi" w:cstheme="majorHAnsi"/>
@@ -74,18 +73,7 @@
           <w:szCs w:val="24"/>
         </w:rPr>
         <w:tab/>
-        <w:t xml:space="preserve">  ACTUAL</w:t>
-      </w:r>
-      <w:proofErr w:type="gramEnd"/>
-      <w:r>
-        <w:rPr>
-          <w:rFonts w:asciiTheme="majorHAnsi" w:hAnsiTheme="majorHAnsi" w:cstheme="majorHAnsi"/>
-          <w:b/>
-          <w:bCs/>
-          <w:sz w:val="24"/>
-          <w:szCs w:val="24"/>
-        </w:rPr>
-        <w:t xml:space="preserve"> RESULTS</w:t>
+        <w:t xml:space="preserve">  ACTUAL RESULTS</w:t>
       </w:r>
     </w:p>
     <w:tbl>
@@ -270,7 +258,6 @@
                 <w:bCs/>
                 <w:i w:val="0"/>
                 <w:iCs w:val="0"/>
-                <w:color w:val="262626" w:themeColor="text1" w:themeTint="D9"/>
                 <w:sz w:val="16"/>
                 <w:szCs w:val="16"/>
                 <w:lang w:val="en-US"/>
@@ -283,7 +270,7 @@
                 <w:bCs/>
                 <w:i w:val="0"/>
                 <w:iCs w:val="0"/>
-                <w:color w:val="auto"/>
+                <w:color w:val="000000"/>
                 <w:sz w:val="18"/>
                 <w:szCs w:val="18"/>
                 <w:lang w:val="en-US"/>
@@ -329,27 +316,7 @@
                 <w:sz w:val="16"/>
                 <w:szCs w:val="16"/>
               </w:rPr>
-              <w:t>{</w:t>
-            </w:r>
-            <w:proofErr w:type="spellStart"/>
-            <w:r>
-              <w:rPr>
-                <w:rFonts w:ascii="Verdana" w:hAnsi="Verdana"/>
-                <w:b/>
-                <w:sz w:val="16"/>
-                <w:szCs w:val="16"/>
-              </w:rPr>
-              <w:t>APC_Spec</w:t>
-            </w:r>
-            <w:proofErr w:type="spellEnd"/>
-            <w:r>
-              <w:rPr>
-                <w:rFonts w:ascii="Verdana" w:hAnsi="Verdana"/>
-                <w:b/>
-                <w:sz w:val="16"/>
-                <w:szCs w:val="16"/>
-              </w:rPr>
-              <w:t>}</w:t>
+              <w:t>{APC_Spec}</w:t>
             </w:r>
           </w:p>
         </w:tc>
@@ -383,27 +350,7 @@
                 <w:sz w:val="16"/>
                 <w:szCs w:val="16"/>
               </w:rPr>
-              <w:t>{</w:t>
-            </w:r>
-            <w:proofErr w:type="spellStart"/>
-            <w:r>
-              <w:rPr>
-                <w:rFonts w:ascii="Verdana" w:hAnsi="Verdana"/>
-                <w:b/>
-                <w:sz w:val="16"/>
-                <w:szCs w:val="16"/>
-              </w:rPr>
-              <w:t>APC_Result</w:t>
-            </w:r>
-            <w:proofErr w:type="spellEnd"/>
-            <w:r>
-              <w:rPr>
-                <w:rFonts w:ascii="Verdana" w:hAnsi="Verdana"/>
-                <w:b/>
-                <w:sz w:val="16"/>
-                <w:szCs w:val="16"/>
-              </w:rPr>
-              <w:t>}</w:t>
+              <w:t>{APC_Result}</w:t>
             </w:r>
           </w:p>
         </w:tc>
@@ -438,29 +385,7 @@
                 <w:sz w:val="16"/>
                 <w:szCs w:val="16"/>
               </w:rPr>
-              <w:t>{</w:t>
-            </w:r>
-            <w:proofErr w:type="spellStart"/>
-            <w:r>
-              <w:rPr>
-                <w:rFonts w:ascii="Verdana" w:hAnsi="Verdana"/>
-                <w:b/>
-                <w:bCs/>
-                <w:sz w:val="16"/>
-                <w:szCs w:val="16"/>
-              </w:rPr>
-              <w:t>APC_Remarks</w:t>
-            </w:r>
-            <w:proofErr w:type="spellEnd"/>
-            <w:r>
-              <w:rPr>
-                <w:rFonts w:ascii="Verdana" w:hAnsi="Verdana"/>
-                <w:b/>
-                <w:bCs/>
-                <w:sz w:val="16"/>
-                <w:szCs w:val="16"/>
-              </w:rPr>
-              <w:t>}</w:t>
+              <w:t>{APC_Remarks}</w:t>
             </w:r>
           </w:p>
         </w:tc>
@@ -533,27 +458,7 @@
                 <w:sz w:val="16"/>
                 <w:szCs w:val="16"/>
               </w:rPr>
-              <w:t>{</w:t>
-            </w:r>
-            <w:proofErr w:type="spellStart"/>
-            <w:r>
-              <w:rPr>
-                <w:rFonts w:ascii="Verdana" w:hAnsi="Verdana"/>
-                <w:b/>
-                <w:sz w:val="16"/>
-                <w:szCs w:val="16"/>
-              </w:rPr>
-              <w:t>MY_Spec</w:t>
-            </w:r>
-            <w:proofErr w:type="spellEnd"/>
-            <w:r>
-              <w:rPr>
-                <w:rFonts w:ascii="Verdana" w:hAnsi="Verdana"/>
-                <w:b/>
-                <w:sz w:val="16"/>
-                <w:szCs w:val="16"/>
-              </w:rPr>
-              <w:t>}</w:t>
+              <w:t>{MY_Spec}</w:t>
             </w:r>
           </w:p>
         </w:tc>
@@ -587,27 +492,7 @@
                 <w:sz w:val="16"/>
                 <w:szCs w:val="16"/>
               </w:rPr>
-              <w:t>{</w:t>
-            </w:r>
-            <w:proofErr w:type="spellStart"/>
-            <w:r>
-              <w:rPr>
-                <w:rFonts w:ascii="Verdana" w:hAnsi="Verdana"/>
-                <w:b/>
-                <w:sz w:val="16"/>
-                <w:szCs w:val="16"/>
-              </w:rPr>
-              <w:t>MY_Result</w:t>
-            </w:r>
-            <w:proofErr w:type="spellEnd"/>
-            <w:r>
-              <w:rPr>
-                <w:rFonts w:ascii="Verdana" w:hAnsi="Verdana"/>
-                <w:b/>
-                <w:sz w:val="16"/>
-                <w:szCs w:val="16"/>
-              </w:rPr>
-              <w:t>}</w:t>
+              <w:t>{MY_Result}</w:t>
             </w:r>
           </w:p>
         </w:tc>
@@ -642,31 +527,7 @@
                 <w:szCs w:val="16"/>
                 <w:lang w:val="en-US"/>
               </w:rPr>
-              <w:t>{</w:t>
-            </w:r>
-            <w:proofErr w:type="spellStart"/>
-            <w:r>
-              <w:rPr>
-                <w:rFonts w:ascii="Verdana" w:hAnsi="Verdana"/>
-                <w:b/>
-                <w:bCs/>
-                <w:sz w:val="16"/>
-                <w:szCs w:val="16"/>
-                <w:lang w:val="en-US"/>
-              </w:rPr>
-              <w:t>MY_Remarks</w:t>
-            </w:r>
-            <w:proofErr w:type="spellEnd"/>
-            <w:r>
-              <w:rPr>
-                <w:rFonts w:ascii="Verdana" w:hAnsi="Verdana"/>
-                <w:b/>
-                <w:bCs/>
-                <w:sz w:val="16"/>
-                <w:szCs w:val="16"/>
-                <w:lang w:val="en-US"/>
-              </w:rPr>
-              <w:t>}</w:t>
+              <w:t>{MY_Remarks}</w:t>
             </w:r>
           </w:p>
         </w:tc>
@@ -729,7 +590,7 @@
             <w:pPr>
               <w:jc w:val="center"/>
               <w:rPr>
-                <w:rFonts w:ascii="Verdana" w:eastAsia="等线 Light" w:hAnsi="Verdana"/>
+                <w:rFonts w:ascii="Verdana" w:eastAsia="DengXian Light" w:hAnsi="Verdana"/>
                 <w:b/>
                 <w:color w:val="2F5496"/>
                 <w:sz w:val="16"/>
@@ -746,31 +607,7 @@
                 <w:szCs w:val="16"/>
                 <w:lang w:val="en-US"/>
               </w:rPr>
-              <w:t>{</w:t>
-            </w:r>
-            <w:proofErr w:type="spellStart"/>
-            <w:r>
-              <w:rPr>
-                <w:rFonts w:ascii="Verdana" w:hAnsi="Verdana"/>
-                <w:b/>
-                <w:bCs/>
-                <w:sz w:val="16"/>
-                <w:szCs w:val="16"/>
-                <w:lang w:val="en-US"/>
-              </w:rPr>
-              <w:t>GN_Spec</w:t>
-            </w:r>
-            <w:proofErr w:type="spellEnd"/>
-            <w:r>
-              <w:rPr>
-                <w:rFonts w:ascii="Verdana" w:hAnsi="Verdana"/>
-                <w:b/>
-                <w:bCs/>
-                <w:sz w:val="16"/>
-                <w:szCs w:val="16"/>
-                <w:lang w:val="en-US"/>
-              </w:rPr>
-              <w:t>}</w:t>
+              <w:t>{GN_Spec}</w:t>
             </w:r>
           </w:p>
         </w:tc>
@@ -805,31 +642,7 @@
                 <w:szCs w:val="16"/>
                 <w:lang w:val="en-US"/>
               </w:rPr>
-              <w:t>{</w:t>
-            </w:r>
-            <w:proofErr w:type="spellStart"/>
-            <w:r>
-              <w:rPr>
-                <w:rFonts w:ascii="Verdana" w:hAnsi="Verdana"/>
-                <w:b/>
-                <w:bCs/>
-                <w:sz w:val="16"/>
-                <w:szCs w:val="16"/>
-                <w:lang w:val="en-US"/>
-              </w:rPr>
-              <w:t>GN_Result</w:t>
-            </w:r>
-            <w:proofErr w:type="spellEnd"/>
-            <w:r>
-              <w:rPr>
-                <w:rFonts w:ascii="Verdana" w:hAnsi="Verdana"/>
-                <w:b/>
-                <w:bCs/>
-                <w:sz w:val="16"/>
-                <w:szCs w:val="16"/>
-                <w:lang w:val="en-US"/>
-              </w:rPr>
-              <w:t>}</w:t>
+              <w:t>{GN_Result}</w:t>
             </w:r>
           </w:p>
         </w:tc>
@@ -865,31 +678,7 @@
                 <w:szCs w:val="16"/>
                 <w:lang w:val="en-US"/>
               </w:rPr>
-              <w:t>{</w:t>
-            </w:r>
-            <w:proofErr w:type="spellStart"/>
-            <w:r>
-              <w:rPr>
-                <w:rFonts w:ascii="Verdana" w:hAnsi="Verdana"/>
-                <w:b/>
-                <w:bCs/>
-                <w:sz w:val="16"/>
-                <w:szCs w:val="16"/>
-                <w:lang w:val="en-US"/>
-              </w:rPr>
-              <w:t>GN_Remarks</w:t>
-            </w:r>
-            <w:proofErr w:type="spellEnd"/>
-            <w:r>
-              <w:rPr>
-                <w:rFonts w:ascii="Verdana" w:hAnsi="Verdana"/>
-                <w:b/>
-                <w:bCs/>
-                <w:sz w:val="16"/>
-                <w:szCs w:val="16"/>
-                <w:lang w:val="en-US"/>
-              </w:rPr>
-              <w:t>}</w:t>
+              <w:t>{GN_Remarks}</w:t>
             </w:r>
           </w:p>
         </w:tc>
@@ -900,8 +689,12 @@
     <w:p/>
     <w:p/>
     <w:sectPr>
-      <w:headerReference w:type="default" r:id="rId8"/>
-      <w:footerReference w:type="default" r:id="rId9"/>
+      <w:headerReference w:type="even" r:id="rId8"/>
+      <w:headerReference w:type="default" r:id="rId9"/>
+      <w:footerReference w:type="even" r:id="rId10"/>
+      <w:footerReference w:type="default" r:id="rId11"/>
+      <w:headerReference w:type="first" r:id="rId12"/>
+      <w:footerReference w:type="first" r:id="rId13"/>
       <w:pgSz w:w="12240" w:h="15840"/>
       <w:pgMar w:top="432" w:right="432" w:bottom="432" w:left="432" w:header="709" w:footer="567" w:gutter="0"/>
       <w:cols w:space="720"/>
@@ -940,6 +733,16 @@
   <w:p>
     <w:pPr>
       <w:pStyle w:val="Footer"/>
+    </w:pPr>
+  </w:p>
+</w:ftr>
+</file>
+
+<file path=word/footer2.xml><?xml version="1.0" encoding="utf-8"?>
+<w:ftr xmlns:wpc="http://schemas.microsoft.com/office/word/2010/wordprocessingCanvas" xmlns:cx="http://schemas.microsoft.com/office/drawing/2014/chartex" xmlns:cx1="http://schemas.microsoft.com/office/drawing/2015/9/8/chartex" xmlns:cx2="http://schemas.microsoft.com/office/drawing/2015/10/21/chartex" xmlns:cx3="http://schemas.microsoft.com/office/drawing/2016/5/9/chartex" xmlns:cx4="http://schemas.microsoft.com/office/drawing/2016/5/10/chartex" xmlns:cx5="http://schemas.microsoft.com/office/drawing/2016/5/11/chartex" xmlns:cx6="http://schemas.microsoft.com/office/drawing/2016/5/12/chartex" xmlns:cx7="http://schemas.microsoft.com/office/drawing/2016/5/13/chartex" xmlns:cx8="http://schemas.microsoft.com/office/drawing/2016/5/14/chartex" xmlns:mc="http://schemas.openxmlformats.org/markup-compatibility/2006" xmlns:aink="http://schemas.microsoft.com/office/drawing/2016/ink" xmlns:am3d="http://schemas.microsoft.com/office/drawing/2017/model3d" xmlns:o="urn:schemas-microsoft-com:office:office" xmlns:oel="http://schemas.microsoft.com/office/2019/extlst" xmlns:r="http://schemas.openxmlformats.org/officeDocument/2006/relationships" xmlns:m="http://schemas.openxmlformats.org/officeDocument/2006/math" xmlns:v="urn:schemas-microsoft-com:vml" xmlns:wp14="http://schemas.microsoft.com/office/word/2010/wordprocessingDrawing" xmlns:wp="http://schemas.openxmlformats.org/drawingml/2006/wordprocessingDrawing" xmlns:w10="urn:schemas-microsoft-com:office:word" xmlns:w="http://schemas.openxmlformats.org/wordprocessingml/2006/main" xmlns:w14="http://schemas.microsoft.com/office/word/2010/wordml" xmlns:w15="http://schemas.microsoft.com/office/word/2012/wordml" xmlns:w16cei="http://schemas.microsoft.com/office/word/2026/wordml/cei" xmlns:w16cex="http://schemas.microsoft.com/office/word/2018/wordml/cex" xmlns:w16cid="http://schemas.microsoft.com/office/word/2016/wordml/cid" xmlns:w16="http://schemas.microsoft.com/office/word/2018/wordml" xmlns:w16du="http://schemas.microsoft.com/office/word/2023/wordml/word16du" xmlns:w16sdtdh="http://schemas.microsoft.com/office/word/2020/wordml/sdtdatahash" xmlns:w16sdtfl="http://schemas.microsoft.com/office/word/2024/wordml/sdtformatlock" xmlns:w16se="http://schemas.microsoft.com/office/word/2015/wordml/symex" xmlns:wpg="http://schemas.microsoft.com/office/word/2010/wordprocessingGroup" xmlns:wpi="http://schemas.microsoft.com/office/word/2010/wordprocessingInk" xmlns:wne="http://schemas.microsoft.com/office/word/2006/wordml" xmlns:wps="http://schemas.microsoft.com/office/word/2010/wordprocessingShape" mc:Ignorable="w14 w15 w16se w16cid w16 w16cex w16sdtdh w16sdtfl w16du wp14">
+  <w:p>
+    <w:pPr>
+      <w:pStyle w:val="Footer"/>
       <w:rPr>
         <w:rFonts w:ascii="Verdana" w:hAnsi="Verdana"/>
         <w:sz w:val="16"/>
@@ -990,16 +793,7 @@
               <w:sz w:val="18"/>
               <w:szCs w:val="18"/>
             </w:rPr>
-            <w:t>REMARKS</w:t>
-          </w:r>
-          <w:r>
-            <w:rPr>
-              <w:rFonts w:ascii="Verdana" w:hAnsi="Verdana"/>
-              <w:b/>
-              <w:sz w:val="18"/>
-              <w:szCs w:val="18"/>
-            </w:rPr>
-            <w:t>:</w:t>
+            <w:t>REMARKS:</w:t>
           </w:r>
           <w:r>
             <w:rPr>
@@ -1020,31 +814,7 @@
               <w:szCs w:val="18"/>
               <w:lang w:val="en-US"/>
             </w:rPr>
-            <w:t>{</w:t>
-          </w:r>
-          <w:proofErr w:type="spellStart"/>
-          <w:r>
-            <w:rPr>
-              <w:rFonts w:ascii="Verdana" w:hAnsi="Verdana"/>
-              <w:b/>
-              <w:bCs/>
-              <w:sz w:val="18"/>
-              <w:szCs w:val="18"/>
-              <w:lang w:val="en-US"/>
-            </w:rPr>
-            <w:t>OverallRemarks</w:t>
-          </w:r>
-          <w:proofErr w:type="spellEnd"/>
-          <w:r>
-            <w:rPr>
-              <w:rFonts w:ascii="Verdana" w:hAnsi="Verdana"/>
-              <w:b/>
-              <w:bCs/>
-              <w:sz w:val="18"/>
-              <w:szCs w:val="18"/>
-              <w:lang w:val="en-US"/>
-            </w:rPr>
-            <w:t>}</w:t>
+            <w:t>{OverallRemarks}</w:t>
           </w:r>
         </w:p>
         <w:p>
@@ -1297,27 +1067,7 @@
               <w:szCs w:val="18"/>
               <w:lang w:val="en-US"/>
             </w:rPr>
-            <w:t>{</w:t>
-          </w:r>
-          <w:proofErr w:type="spellStart"/>
-          <w:r>
-            <w:rPr>
-              <w:rFonts w:ascii="Verdana" w:hAnsi="Verdana"/>
-              <w:sz w:val="18"/>
-              <w:szCs w:val="18"/>
-              <w:lang w:val="en-US"/>
-            </w:rPr>
-            <w:t>AnalyzedBy</w:t>
-          </w:r>
-          <w:proofErr w:type="spellEnd"/>
-          <w:r>
-            <w:rPr>
-              <w:rFonts w:ascii="Verdana" w:hAnsi="Verdana"/>
-              <w:sz w:val="18"/>
-              <w:szCs w:val="18"/>
-              <w:lang w:val="en-US"/>
-            </w:rPr>
-            <w:t>}</w:t>
+            <w:t>{AnalyzedBy}</w:t>
           </w:r>
         </w:p>
         <w:p>
@@ -1391,18 +1141,8 @@
               <w:sz w:val="18"/>
               <w:szCs w:val="18"/>
             </w:rPr>
-            <w:t xml:space="preserve">Celeste P. </w:t>
-          </w:r>
-          <w:proofErr w:type="spellStart"/>
-          <w:r>
-            <w:rPr>
-              <w:rFonts w:ascii="Verdana" w:hAnsi="Verdana"/>
-              <w:sz w:val="18"/>
-              <w:szCs w:val="18"/>
-            </w:rPr>
-            <w:t>Yandug</w:t>
-          </w:r>
-          <w:proofErr w:type="spellEnd"/>
+            <w:t>Celeste P. Yandug</w:t>
+          </w:r>
         </w:p>
         <w:p>
           <w:pPr>
@@ -1521,27 +1261,7 @@
               <w:szCs w:val="18"/>
               <w:lang w:val="en-US"/>
             </w:rPr>
-            <w:t>{</w:t>
-          </w:r>
-          <w:proofErr w:type="spellStart"/>
-          <w:r>
-            <w:rPr>
-              <w:rFonts w:ascii="Verdana" w:hAnsi="Verdana"/>
-              <w:sz w:val="18"/>
-              <w:szCs w:val="18"/>
-              <w:lang w:val="en-US"/>
-            </w:rPr>
-            <w:t>DateReleased</w:t>
-          </w:r>
-          <w:proofErr w:type="spellEnd"/>
-          <w:r>
-            <w:rPr>
-              <w:rFonts w:ascii="Verdana" w:hAnsi="Verdana"/>
-              <w:sz w:val="18"/>
-              <w:szCs w:val="18"/>
-              <w:lang w:val="en-US"/>
-            </w:rPr>
-            <w:t>}</w:t>
+            <w:t>{DateReleasedOnly}</w:t>
           </w:r>
         </w:p>
       </w:tc>
@@ -1774,27 +1494,27 @@
             </wp:anchor>
           </w:drawing>
         </mc:Choice>
-        <mc:Fallback xmlns:wpsCustomData="http://www.wps.cn/officeDocument/2013/wpsCustomData">
+        <mc:Fallback>
           <w:pict>
-            <v:shape id="_x0000_s1026" o:spid="_x0000_s1026" o:spt="202" type="#_x0000_t202" style="position:absolute;left:0pt;margin-left:511.5pt;margin-top:3.6pt;height:144pt;width:144pt;mso-position-horizontal-relative:margin;mso-wrap-style:none;z-index:251661312;mso-width-relative:page;mso-height-relative:page;" filled="f" stroked="f" coordsize="21600,21600" o:gfxdata="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">
-              <v:fill on="f" focussize="0,0"/>
-              <v:stroke on="f" weight="0.5pt"/>
-              <v:imagedata o:title=""/>
-              <o:lock v:ext="edit" aspectratio="f"/>
-              <v:textbox inset="0mm,0mm,0mm,0mm" style="mso-fit-shape-to-text:t;">
+            <v:shapetype w14:anchorId="1F7BDDAD" id="_x0000_t202" coordsize="21600,21600" o:spt="202" path="m,l,21600r21600,l21600,xe">
+              <v:stroke joinstyle="miter"/>
+              <v:path gradientshapeok="t" o:connecttype="rect"/>
+            </v:shapetype>
+            <v:shape id="Text Box 3" o:spid="_x0000_s1027" type="#_x0000_t202" style="position:absolute;margin-left:511.5pt;margin-top:3.6pt;width:2in;height:2in;z-index:251661312;visibility:visible;mso-wrap-style:none;mso-wrap-distance-left:9pt;mso-wrap-distance-top:0;mso-wrap-distance-right:9pt;mso-wrap-distance-bottom:0;mso-position-horizontal:absolute;mso-position-horizontal-relative:margin;mso-position-vertical:absolute;mso-position-vertical-relative:text;v-text-anchor:top" o:gfxdata="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" filled="f" stroked="f" strokeweight=".5pt">
+              <v:textbox style="mso-fit-shape-to-text:t" inset="0,0,0,0">
                 <w:txbxContent>
                   <w:p>
                     <w:pPr>
-                      <w:pStyle w:val="14"/>
+                      <w:pStyle w:val="Footer"/>
                       <w:rPr>
-                        <w:rFonts w:hint="default" w:ascii="Verdana" w:hAnsi="Verdana" w:cs="Verdana"/>
+                        <w:rFonts w:ascii="Verdana" w:hAnsi="Verdana" w:cs="Verdana"/>
                         <w:sz w:val="16"/>
                         <w:szCs w:val="16"/>
                       </w:rPr>
                     </w:pPr>
                     <w:r>
                       <w:rPr>
-                        <w:rFonts w:hint="default" w:ascii="Verdana" w:hAnsi="Verdana" w:cs="Verdana"/>
+                        <w:rFonts w:ascii="Verdana" w:hAnsi="Verdana" w:cs="Verdana"/>
                         <w:sz w:val="16"/>
                         <w:szCs w:val="16"/>
                       </w:rPr>
@@ -1802,7 +1522,7 @@
                     </w:r>
                     <w:r>
                       <w:rPr>
-                        <w:rFonts w:hint="default" w:ascii="Verdana" w:hAnsi="Verdana" w:cs="Verdana"/>
+                        <w:rFonts w:ascii="Verdana" w:hAnsi="Verdana" w:cs="Verdana"/>
                         <w:sz w:val="16"/>
                         <w:szCs w:val="16"/>
                       </w:rPr>
@@ -1810,7 +1530,7 @@
                     </w:r>
                     <w:r>
                       <w:rPr>
-                        <w:rFonts w:hint="default" w:ascii="Verdana" w:hAnsi="Verdana" w:cs="Verdana"/>
+                        <w:rFonts w:ascii="Verdana" w:hAnsi="Verdana" w:cs="Verdana"/>
                         <w:sz w:val="16"/>
                         <w:szCs w:val="16"/>
                       </w:rPr>
@@ -1818,7 +1538,7 @@
                     </w:r>
                     <w:r>
                       <w:rPr>
-                        <w:rFonts w:hint="default" w:ascii="Verdana" w:hAnsi="Verdana" w:cs="Verdana"/>
+                        <w:rFonts w:ascii="Verdana" w:hAnsi="Verdana" w:cs="Verdana"/>
                         <w:sz w:val="16"/>
                         <w:szCs w:val="16"/>
                       </w:rPr>
@@ -1826,7 +1546,7 @@
                     </w:r>
                     <w:r>
                       <w:rPr>
-                        <w:rFonts w:hint="default" w:ascii="Verdana" w:hAnsi="Verdana" w:cs="Verdana"/>
+                        <w:rFonts w:ascii="Verdana" w:hAnsi="Verdana" w:cs="Verdana"/>
                         <w:sz w:val="16"/>
                         <w:szCs w:val="16"/>
                       </w:rPr>
@@ -1834,7 +1554,7 @@
                     </w:r>
                     <w:r>
                       <w:rPr>
-                        <w:rFonts w:hint="default" w:ascii="Verdana" w:hAnsi="Verdana" w:cs="Verdana"/>
+                        <w:rFonts w:ascii="Verdana" w:hAnsi="Verdana" w:cs="Verdana"/>
                         <w:sz w:val="16"/>
                         <w:szCs w:val="16"/>
                       </w:rPr>
@@ -1842,7 +1562,7 @@
                     </w:r>
                     <w:r>
                       <w:rPr>
-                        <w:rFonts w:hint="default" w:ascii="Verdana" w:hAnsi="Verdana" w:cs="Verdana"/>
+                        <w:rFonts w:ascii="Verdana" w:hAnsi="Verdana" w:cs="Verdana"/>
                         <w:sz w:val="16"/>
                         <w:szCs w:val="16"/>
                       </w:rPr>
@@ -1850,7 +1570,7 @@
                     </w:r>
                     <w:r>
                       <w:rPr>
-                        <w:rFonts w:hint="default" w:ascii="Verdana" w:hAnsi="Verdana" w:cs="Verdana"/>
+                        <w:rFonts w:ascii="Verdana" w:hAnsi="Verdana" w:cs="Verdana"/>
                         <w:sz w:val="16"/>
                         <w:szCs w:val="16"/>
                       </w:rPr>
@@ -1858,7 +1578,7 @@
                     </w:r>
                     <w:r>
                       <w:rPr>
-                        <w:rFonts w:hint="default" w:ascii="Verdana" w:hAnsi="Verdana" w:cs="Verdana"/>
+                        <w:rFonts w:ascii="Verdana" w:hAnsi="Verdana" w:cs="Verdana"/>
                         <w:sz w:val="16"/>
                         <w:szCs w:val="16"/>
                       </w:rPr>
@@ -1866,7 +1586,7 @@
                     </w:r>
                     <w:r>
                       <w:rPr>
-                        <w:rFonts w:hint="default" w:ascii="Verdana" w:hAnsi="Verdana" w:cs="Verdana"/>
+                        <w:rFonts w:ascii="Verdana" w:hAnsi="Verdana" w:cs="Verdana"/>
                         <w:sz w:val="16"/>
                         <w:szCs w:val="16"/>
                       </w:rPr>
@@ -1874,7 +1594,7 @@
                     </w:r>
                     <w:r>
                       <w:rPr>
-                        <w:rFonts w:hint="default" w:ascii="Verdana" w:hAnsi="Verdana" w:cs="Verdana"/>
+                        <w:rFonts w:ascii="Verdana" w:hAnsi="Verdana" w:cs="Verdana"/>
                         <w:sz w:val="16"/>
                         <w:szCs w:val="16"/>
                       </w:rPr>
@@ -1882,7 +1602,7 @@
                     </w:r>
                     <w:r>
                       <w:rPr>
-                        <w:rFonts w:hint="default" w:ascii="Verdana" w:hAnsi="Verdana" w:cs="Verdana"/>
+                        <w:rFonts w:ascii="Verdana" w:hAnsi="Verdana" w:cs="Verdana"/>
                         <w:sz w:val="16"/>
                         <w:szCs w:val="16"/>
                       </w:rPr>
@@ -1891,6 +1611,7 @@
                   </w:p>
                 </w:txbxContent>
               </v:textbox>
+              <w10:wrap anchorx="margin"/>
             </v:shape>
           </w:pict>
         </mc:Fallback>
@@ -1992,6 +1713,16 @@
 </w:ftr>
 </file>
 
+<file path=word/footer3.xml><?xml version="1.0" encoding="utf-8"?>
+<w:ftr xmlns:wpc="http://schemas.microsoft.com/office/word/2010/wordprocessingCanvas" xmlns:cx="http://schemas.microsoft.com/office/drawing/2014/chartex" xmlns:cx1="http://schemas.microsoft.com/office/drawing/2015/9/8/chartex" xmlns:cx2="http://schemas.microsoft.com/office/drawing/2015/10/21/chartex" xmlns:cx3="http://schemas.microsoft.com/office/drawing/2016/5/9/chartex" xmlns:cx4="http://schemas.microsoft.com/office/drawing/2016/5/10/chartex" xmlns:cx5="http://schemas.microsoft.com/office/drawing/2016/5/11/chartex" xmlns:cx6="http://schemas.microsoft.com/office/drawing/2016/5/12/chartex" xmlns:cx7="http://schemas.microsoft.com/office/drawing/2016/5/13/chartex" xmlns:cx8="http://schemas.microsoft.com/office/drawing/2016/5/14/chartex" xmlns:mc="http://schemas.openxmlformats.org/markup-compatibility/2006" xmlns:aink="http://schemas.microsoft.com/office/drawing/2016/ink" xmlns:am3d="http://schemas.microsoft.com/office/drawing/2017/model3d" xmlns:o="urn:schemas-microsoft-com:office:office" xmlns:oel="http://schemas.microsoft.com/office/2019/extlst" xmlns:r="http://schemas.openxmlformats.org/officeDocument/2006/relationships" xmlns:m="http://schemas.openxmlformats.org/officeDocument/2006/math" xmlns:v="urn:schemas-microsoft-com:vml" xmlns:wp14="http://schemas.microsoft.com/office/word/2010/wordprocessingDrawing" xmlns:wp="http://schemas.openxmlformats.org/drawingml/2006/wordprocessingDrawing" xmlns:w10="urn:schemas-microsoft-com:office:word" xmlns:w="http://schemas.openxmlformats.org/wordprocessingml/2006/main" xmlns:w14="http://schemas.microsoft.com/office/word/2010/wordml" xmlns:w15="http://schemas.microsoft.com/office/word/2012/wordml" xmlns:w16cei="http://schemas.microsoft.com/office/word/2026/wordml/cei" xmlns:w16cex="http://schemas.microsoft.com/office/word/2018/wordml/cex" xmlns:w16cid="http://schemas.microsoft.com/office/word/2016/wordml/cid" xmlns:w16="http://schemas.microsoft.com/office/word/2018/wordml" xmlns:w16du="http://schemas.microsoft.com/office/word/2023/wordml/word16du" xmlns:w16sdtdh="http://schemas.microsoft.com/office/word/2020/wordml/sdtdatahash" xmlns:w16sdtfl="http://schemas.microsoft.com/office/word/2024/wordml/sdtformatlock" xmlns:w16se="http://schemas.microsoft.com/office/word/2015/wordml/symex" xmlns:wpg="http://schemas.microsoft.com/office/word/2010/wordprocessingGroup" xmlns:wpi="http://schemas.microsoft.com/office/word/2010/wordprocessingInk" xmlns:wne="http://schemas.microsoft.com/office/word/2006/wordml" xmlns:wps="http://schemas.microsoft.com/office/word/2010/wordprocessingShape" mc:Ignorable="w14 w15 w16se w16cid w16 w16cex w16sdtdh w16sdtfl w16du wp14">
+  <w:p>
+    <w:pPr>
+      <w:pStyle w:val="Footer"/>
+    </w:pPr>
+  </w:p>
+</w:ftr>
+</file>
+
 <file path=word/footnotes.xml><?xml version="1.0" encoding="utf-8"?>
 <w:footnotes xmlns:wpc="http://schemas.microsoft.com/office/word/2010/wordprocessingCanvas" xmlns:cx="http://schemas.microsoft.com/office/drawing/2014/chartex" xmlns:cx1="http://schemas.microsoft.com/office/drawing/2015/9/8/chartex" xmlns:cx2="http://schemas.microsoft.com/office/drawing/2015/10/21/chartex" xmlns:cx3="http://schemas.microsoft.com/office/drawing/2016/5/9/chartex" xmlns:cx4="http://schemas.microsoft.com/office/drawing/2016/5/10/chartex" xmlns:cx5="http://schemas.microsoft.com/office/drawing/2016/5/11/chartex" xmlns:cx6="http://schemas.microsoft.com/office/drawing/2016/5/12/chartex" xmlns:cx7="http://schemas.microsoft.com/office/drawing/2016/5/13/chartex" xmlns:cx8="http://schemas.microsoft.com/office/drawing/2016/5/14/chartex" xmlns:mc="http://schemas.openxmlformats.org/markup-compatibility/2006" xmlns:aink="http://schemas.microsoft.com/office/drawing/2016/ink" xmlns:am3d="http://schemas.microsoft.com/office/drawing/2017/model3d" xmlns:o="urn:schemas-microsoft-com:office:office" xmlns:oel="http://schemas.microsoft.com/office/2019/extlst" xmlns:r="http://schemas.openxmlformats.org/officeDocument/2006/relationships" xmlns:m="http://schemas.openxmlformats.org/officeDocument/2006/math" xmlns:v="urn:schemas-microsoft-com:vml" xmlns:wp14="http://schemas.microsoft.com/office/word/2010/wordprocessingDrawing" xmlns:wp="http://schemas.openxmlformats.org/drawingml/2006/wordprocessingDrawing" xmlns:w10="urn:schemas-microsoft-com:office:word" xmlns:w="http://schemas.openxmlformats.org/wordprocessingml/2006/main" xmlns:w14="http://schemas.microsoft.com/office/word/2010/wordml" xmlns:w15="http://schemas.microsoft.com/office/word/2012/wordml" xmlns:w16cei="http://schemas.microsoft.com/office/word/2026/wordml/cei" xmlns:w16cex="http://schemas.microsoft.com/office/word/2018/wordml/cex" xmlns:w16cid="http://schemas.microsoft.com/office/word/2016/wordml/cid" xmlns:w16="http://schemas.microsoft.com/office/word/2018/wordml" xmlns:w16du="http://schemas.microsoft.com/office/word/2023/wordml/word16du" xmlns:w16sdtdh="http://schemas.microsoft.com/office/word/2020/wordml/sdtdatahash" xmlns:w16sdtfl="http://schemas.microsoft.com/office/word/2024/wordml/sdtformatlock" xmlns:w16se="http://schemas.microsoft.com/office/word/2015/wordml/symex" xmlns:wpg="http://schemas.microsoft.com/office/word/2010/wordprocessingGroup" xmlns:wpi="http://schemas.microsoft.com/office/word/2010/wordprocessingInk" xmlns:wne="http://schemas.microsoft.com/office/word/2006/wordml" xmlns:wps="http://schemas.microsoft.com/office/word/2010/wordprocessingShape" mc:Ignorable="w14 w15 w16se w16cid w16 w16cex w16sdtdh w16sdtfl w16du wp14">
   <w:footnote w:type="separator" w:id="-1">
@@ -2018,6 +1749,16 @@
 </file>
 
 <file path=word/header1.xml><?xml version="1.0" encoding="utf-8"?>
+<w:hdr xmlns:wpc="http://schemas.microsoft.com/office/word/2010/wordprocessingCanvas" xmlns:cx="http://schemas.microsoft.com/office/drawing/2014/chartex" xmlns:cx1="http://schemas.microsoft.com/office/drawing/2015/9/8/chartex" xmlns:cx2="http://schemas.microsoft.com/office/drawing/2015/10/21/chartex" xmlns:cx3="http://schemas.microsoft.com/office/drawing/2016/5/9/chartex" xmlns:cx4="http://schemas.microsoft.com/office/drawing/2016/5/10/chartex" xmlns:cx5="http://schemas.microsoft.com/office/drawing/2016/5/11/chartex" xmlns:cx6="http://schemas.microsoft.com/office/drawing/2016/5/12/chartex" xmlns:cx7="http://schemas.microsoft.com/office/drawing/2016/5/13/chartex" xmlns:cx8="http://schemas.microsoft.com/office/drawing/2016/5/14/chartex" xmlns:mc="http://schemas.openxmlformats.org/markup-compatibility/2006" xmlns:aink="http://schemas.microsoft.com/office/drawing/2016/ink" xmlns:am3d="http://schemas.microsoft.com/office/drawing/2017/model3d" xmlns:o="urn:schemas-microsoft-com:office:office" xmlns:oel="http://schemas.microsoft.com/office/2019/extlst" xmlns:r="http://schemas.openxmlformats.org/officeDocument/2006/relationships" xmlns:m="http://schemas.openxmlformats.org/officeDocument/2006/math" xmlns:v="urn:schemas-microsoft-com:vml" xmlns:wp14="http://schemas.microsoft.com/office/word/2010/wordprocessingDrawing" xmlns:wp="http://schemas.openxmlformats.org/drawingml/2006/wordprocessingDrawing" xmlns:w10="urn:schemas-microsoft-com:office:word" xmlns:w="http://schemas.openxmlformats.org/wordprocessingml/2006/main" xmlns:w14="http://schemas.microsoft.com/office/word/2010/wordml" xmlns:w15="http://schemas.microsoft.com/office/word/2012/wordml" xmlns:w16cei="http://schemas.microsoft.com/office/word/2026/wordml/cei" xmlns:w16cex="http://schemas.microsoft.com/office/word/2018/wordml/cex" xmlns:w16cid="http://schemas.microsoft.com/office/word/2016/wordml/cid" xmlns:w16="http://schemas.microsoft.com/office/word/2018/wordml" xmlns:w16du="http://schemas.microsoft.com/office/word/2023/wordml/word16du" xmlns:w16sdtdh="http://schemas.microsoft.com/office/word/2020/wordml/sdtdatahash" xmlns:w16sdtfl="http://schemas.microsoft.com/office/word/2024/wordml/sdtformatlock" xmlns:w16se="http://schemas.microsoft.com/office/word/2015/wordml/symex" xmlns:wpg="http://schemas.microsoft.com/office/word/2010/wordprocessingGroup" xmlns:wpi="http://schemas.microsoft.com/office/word/2010/wordprocessingInk" xmlns:wne="http://schemas.microsoft.com/office/word/2006/wordml" xmlns:wps="http://schemas.microsoft.com/office/word/2010/wordprocessingShape" mc:Ignorable="w14 w15 w16se w16cid w16 w16cex w16sdtdh w16sdtfl w16du wp14">
+  <w:p>
+    <w:pPr>
+      <w:pStyle w:val="Header"/>
+    </w:pPr>
+  </w:p>
+</w:hdr>
+</file>
+
+<file path=word/header2.xml><?xml version="1.0" encoding="utf-8"?>
 <w:hdr xmlns:wpc="http://schemas.microsoft.com/office/word/2010/wordprocessingCanvas" xmlns:cx="http://schemas.microsoft.com/office/drawing/2014/chartex" xmlns:cx1="http://schemas.microsoft.com/office/drawing/2015/9/8/chartex" xmlns:cx2="http://schemas.microsoft.com/office/drawing/2015/10/21/chartex" xmlns:cx3="http://schemas.microsoft.com/office/drawing/2016/5/9/chartex" xmlns:cx4="http://schemas.microsoft.com/office/drawing/2016/5/10/chartex" xmlns:cx5="http://schemas.microsoft.com/office/drawing/2016/5/11/chartex" xmlns:cx6="http://schemas.microsoft.com/office/drawing/2016/5/12/chartex" xmlns:cx7="http://schemas.microsoft.com/office/drawing/2016/5/13/chartex" xmlns:cx8="http://schemas.microsoft.com/office/drawing/2016/5/14/chartex" xmlns:mc="http://schemas.openxmlformats.org/markup-compatibility/2006" xmlns:aink="http://schemas.microsoft.com/office/drawing/2016/ink" xmlns:am3d="http://schemas.microsoft.com/office/drawing/2017/model3d" xmlns:o="urn:schemas-microsoft-com:office:office" xmlns:oel="http://schemas.microsoft.com/office/2019/extlst" xmlns:r="http://schemas.openxmlformats.org/officeDocument/2006/relationships" xmlns:m="http://schemas.openxmlformats.org/officeDocument/2006/math" xmlns:v="urn:schemas-microsoft-com:vml" xmlns:wp14="http://schemas.microsoft.com/office/word/2010/wordprocessingDrawing" xmlns:wp="http://schemas.openxmlformats.org/drawingml/2006/wordprocessingDrawing" xmlns:w10="urn:schemas-microsoft-com:office:word" xmlns:w="http://schemas.openxmlformats.org/wordprocessingml/2006/main" xmlns:w14="http://schemas.microsoft.com/office/word/2010/wordml" xmlns:w15="http://schemas.microsoft.com/office/word/2012/wordml" xmlns:w16cei="http://schemas.microsoft.com/office/word/2026/wordml/cei" xmlns:w16cex="http://schemas.microsoft.com/office/word/2018/wordml/cex" xmlns:w16cid="http://schemas.microsoft.com/office/word/2016/wordml/cid" xmlns:w16="http://schemas.microsoft.com/office/word/2018/wordml" xmlns:w16du="http://schemas.microsoft.com/office/word/2023/wordml/word16du" xmlns:w16sdtdh="http://schemas.microsoft.com/office/word/2020/wordml/sdtdatahash" xmlns:w16sdtfl="http://schemas.microsoft.com/office/word/2024/wordml/sdtformatlock" xmlns:w16se="http://schemas.microsoft.com/office/word/2015/wordml/symex" xmlns:wpg="http://schemas.microsoft.com/office/word/2010/wordprocessingGroup" xmlns:wpi="http://schemas.microsoft.com/office/word/2010/wordprocessingInk" xmlns:wne="http://schemas.microsoft.com/office/word/2006/wordml" xmlns:wps="http://schemas.microsoft.com/office/word/2010/wordprocessingShape" mc:Ignorable="w14 w15 w16se w16cid w16 w16cex w16sdtdh w16sdtfl w16du wp14">
   <w:p>
     <w:pPr>
@@ -2161,13 +1902,13 @@
             </wp:anchor>
           </w:drawing>
         </mc:Choice>
-        <mc:Fallback xmlns:wpsCustomData="http://www.wps.cn/officeDocument/2013/wpsCustomData">
+        <mc:Fallback>
           <w:pict>
-            <v:shape id="Text Box 2" o:spid="_x0000_s1026" o:spt="202" type="#_x0000_t202" style="position:absolute;left:0pt;margin-left:0pt;margin-top:1.3pt;height:47.25pt;width:118.45pt;mso-position-horizontal-relative:margin;mso-wrap-distance-bottom:0pt;mso-wrap-distance-left:9pt;mso-wrap-distance-right:9pt;mso-wrap-distance-top:0pt;z-index:251659264;mso-width-relative:page;mso-height-relative:page;" fillcolor="#FFFFFF" filled="t" stroked="t" coordsize="21600,21600" o:gfxdata="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">
-              <v:fill on="t" focussize="0,0"/>
-              <v:stroke weight="0.750236220472441pt" color="#000000" joinstyle="round"/>
-              <v:imagedata o:title=""/>
-              <o:lock v:ext="edit" aspectratio="f"/>
+            <v:shapetype w14:anchorId="1F7BDDA9" id="_x0000_t202" coordsize="21600,21600" o:spt="202" path="m,l,21600r21600,l21600,xe">
+              <v:stroke joinstyle="miter"/>
+              <v:path gradientshapeok="t" o:connecttype="rect"/>
+            </v:shapetype>
+            <v:shape id="Text Box 2" o:spid="_x0000_s1026" type="#_x0000_t202" style="position:absolute;left:0;text-align:left;margin-left:0;margin-top:1.3pt;width:118.45pt;height:47.25pt;z-index:251659264;visibility:visible;mso-wrap-style:square;mso-wrap-distance-left:9pt;mso-wrap-distance-top:0;mso-wrap-distance-right:9pt;mso-wrap-distance-bottom:0;mso-position-horizontal:absolute;mso-position-horizontal-relative:margin;mso-position-vertical:absolute;mso-position-vertical-relative:text;v-text-anchor:top" o:gfxdata="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" strokeweight=".26467mm">
               <v:textbox>
                 <w:txbxContent>
                   <w:p>
@@ -2244,7 +1985,7 @@
                   </w:p>
                 </w:txbxContent>
               </v:textbox>
-              <w10:wrap type="square"/>
+              <w10:wrap type="square" anchorx="margin"/>
             </v:shape>
           </w:pict>
         </mc:Fallback>
@@ -2294,27 +2035,7 @@
         <w:szCs w:val="16"/>
         <w:lang w:val="en-US"/>
       </w:rPr>
-      <w:t xml:space="preserve">B. Suico St. </w:t>
-    </w:r>
-    <w:proofErr w:type="spellStart"/>
-    <w:r>
-      <w:rPr>
-        <w:rFonts w:ascii="Verdana" w:hAnsi="Verdana" w:cs="Calibri"/>
-        <w:sz w:val="16"/>
-        <w:szCs w:val="16"/>
-        <w:lang w:val="en-US"/>
-      </w:rPr>
-      <w:t>Tingub</w:t>
-    </w:r>
-    <w:proofErr w:type="spellEnd"/>
-    <w:r>
-      <w:rPr>
-        <w:rFonts w:ascii="Verdana" w:hAnsi="Verdana" w:cs="Calibri"/>
-        <w:sz w:val="16"/>
-        <w:szCs w:val="16"/>
-        <w:lang w:val="en-US"/>
-      </w:rPr>
-      <w:t>, Mandaue City, 6014, Cebu, Philippines</w:t>
+      <w:t>B. Suico St. Tingub, Mandaue City, 6014, Cebu, Philippines</w:t>
     </w:r>
   </w:p>
   <w:p>
@@ -2609,23 +2330,13 @@
               <w:szCs w:val="18"/>
             </w:rPr>
           </w:pPr>
-          <w:proofErr w:type="spellStart"/>
-          <w:r>
-            <w:rPr>
-              <w:rFonts w:ascii="Verdana" w:hAnsi="Verdana" w:cs="Calibri"/>
-              <w:sz w:val="18"/>
-              <w:szCs w:val="18"/>
-            </w:rPr>
-            <w:t>Date&amp;Time</w:t>
-          </w:r>
-          <w:proofErr w:type="spellEnd"/>
-          <w:r>
-            <w:rPr>
-              <w:rFonts w:ascii="Verdana" w:hAnsi="Verdana" w:cs="Calibri"/>
-              <w:sz w:val="18"/>
-              <w:szCs w:val="18"/>
-            </w:rPr>
-            <w:t xml:space="preserve"> Received</w:t>
+          <w:r>
+            <w:rPr>
+              <w:rFonts w:ascii="Verdana" w:hAnsi="Verdana" w:cs="Calibri"/>
+              <w:sz w:val="18"/>
+              <w:szCs w:val="18"/>
+            </w:rPr>
+            <w:t>Date&amp;Time Received</w:t>
           </w:r>
         </w:p>
       </w:tc>
@@ -2688,27 +2399,7 @@
               <w:szCs w:val="18"/>
               <w:lang w:val="en-US"/>
             </w:rPr>
-            <w:t>{</w:t>
-          </w:r>
-          <w:proofErr w:type="spellStart"/>
-          <w:r>
-            <w:rPr>
-              <w:rFonts w:ascii="Verdana" w:hAnsi="Verdana"/>
-              <w:sz w:val="18"/>
-              <w:szCs w:val="18"/>
-              <w:lang w:val="en-US"/>
-            </w:rPr>
-            <w:t>DateReceived</w:t>
-          </w:r>
-          <w:proofErr w:type="spellEnd"/>
-          <w:r>
-            <w:rPr>
-              <w:rFonts w:ascii="Verdana" w:hAnsi="Verdana"/>
-              <w:sz w:val="18"/>
-              <w:szCs w:val="18"/>
-              <w:lang w:val="en-US"/>
-            </w:rPr>
-            <w:t>}</w:t>
+            <w:t>{DateReceived}</w:t>
           </w:r>
         </w:p>
       </w:tc>
@@ -2811,31 +2502,7 @@
               <w:szCs w:val="18"/>
               <w:lang w:val="en-US"/>
             </w:rPr>
-            <w:t>{</w:t>
-          </w:r>
-          <w:proofErr w:type="spellStart"/>
-          <w:r>
-            <w:rPr>
-              <w:rFonts w:ascii="Verdana" w:hAnsi="Verdana" w:cs="Calibri"/>
-              <w:b/>
-              <w:bCs/>
-              <w:sz w:val="18"/>
-              <w:szCs w:val="18"/>
-              <w:lang w:val="en-US"/>
-            </w:rPr>
-            <w:t>SampleName</w:t>
-          </w:r>
-          <w:proofErr w:type="spellEnd"/>
-          <w:r>
-            <w:rPr>
-              <w:rFonts w:ascii="Verdana" w:hAnsi="Verdana" w:cs="Calibri"/>
-              <w:b/>
-              <w:bCs/>
-              <w:sz w:val="18"/>
-              <w:szCs w:val="18"/>
-              <w:lang w:val="en-US"/>
-            </w:rPr>
-            <w:t>}</w:t>
+            <w:t>{SampleName}</w:t>
           </w:r>
         </w:p>
       </w:tc>
@@ -2860,23 +2527,13 @@
               <w:szCs w:val="18"/>
             </w:rPr>
           </w:pPr>
-          <w:proofErr w:type="spellStart"/>
-          <w:r>
-            <w:rPr>
-              <w:rFonts w:ascii="Verdana" w:hAnsi="Verdana" w:cs="Calibri"/>
-              <w:sz w:val="18"/>
-              <w:szCs w:val="18"/>
-            </w:rPr>
-            <w:t>Date&amp;Time</w:t>
-          </w:r>
-          <w:proofErr w:type="spellEnd"/>
-          <w:r>
-            <w:rPr>
-              <w:rFonts w:ascii="Verdana" w:hAnsi="Verdana" w:cs="Calibri"/>
-              <w:sz w:val="18"/>
-              <w:szCs w:val="18"/>
-            </w:rPr>
-            <w:t xml:space="preserve"> Released</w:t>
+          <w:r>
+            <w:rPr>
+              <w:rFonts w:ascii="Verdana" w:hAnsi="Verdana" w:cs="Calibri"/>
+              <w:sz w:val="18"/>
+              <w:szCs w:val="18"/>
+            </w:rPr>
+            <w:t>Date&amp;Time Released</w:t>
           </w:r>
         </w:p>
       </w:tc>
@@ -2939,27 +2596,7 @@
               <w:szCs w:val="18"/>
               <w:lang w:val="en-US"/>
             </w:rPr>
-            <w:t>{</w:t>
-          </w:r>
-          <w:proofErr w:type="spellStart"/>
-          <w:r>
-            <w:rPr>
-              <w:rFonts w:ascii="Verdana" w:hAnsi="Verdana"/>
-              <w:sz w:val="18"/>
-              <w:szCs w:val="18"/>
-              <w:lang w:val="en-US"/>
-            </w:rPr>
-            <w:t>DateReleased</w:t>
-          </w:r>
-          <w:proofErr w:type="spellEnd"/>
-          <w:r>
-            <w:rPr>
-              <w:rFonts w:ascii="Verdana" w:hAnsi="Verdana"/>
-              <w:sz w:val="18"/>
-              <w:szCs w:val="18"/>
-              <w:lang w:val="en-US"/>
-            </w:rPr>
-            <w:t>}</w:t>
+            <w:t>{DateReleased}</w:t>
           </w:r>
         </w:p>
       </w:tc>
@@ -3063,31 +2700,7 @@
               <w:szCs w:val="18"/>
               <w:lang w:val="en-US"/>
             </w:rPr>
-            <w:t>{</w:t>
-          </w:r>
-          <w:proofErr w:type="spellStart"/>
-          <w:r>
-            <w:rPr>
-              <w:rFonts w:ascii="Verdana" w:hAnsi="Verdana" w:cs="Calibri"/>
-              <w:b/>
-              <w:bCs/>
-              <w:sz w:val="18"/>
-              <w:szCs w:val="18"/>
-              <w:lang w:val="en-US"/>
-            </w:rPr>
-            <w:t>DateMfd</w:t>
-          </w:r>
-          <w:proofErr w:type="spellEnd"/>
-          <w:r>
-            <w:rPr>
-              <w:rFonts w:ascii="Verdana" w:hAnsi="Verdana" w:cs="Calibri"/>
-              <w:b/>
-              <w:bCs/>
-              <w:sz w:val="18"/>
-              <w:szCs w:val="18"/>
-              <w:lang w:val="en-US"/>
-            </w:rPr>
-            <w:t>}</w:t>
+            <w:t>{DateMfd}</w:t>
           </w:r>
         </w:p>
       </w:tc>
@@ -3184,31 +2797,7 @@
               <w:szCs w:val="18"/>
               <w:lang w:val="en-US"/>
             </w:rPr>
-            <w:t>{</w:t>
-          </w:r>
-          <w:proofErr w:type="spellStart"/>
-          <w:r>
-            <w:rPr>
-              <w:rFonts w:ascii="Verdana" w:hAnsi="Verdana" w:cs="Calibri"/>
-              <w:b/>
-              <w:bCs/>
-              <w:sz w:val="18"/>
-              <w:szCs w:val="18"/>
-              <w:lang w:val="en-US"/>
-            </w:rPr>
-            <w:t>BatchNo</w:t>
-          </w:r>
-          <w:proofErr w:type="spellEnd"/>
-          <w:r>
-            <w:rPr>
-              <w:rFonts w:ascii="Verdana" w:hAnsi="Verdana" w:cs="Calibri"/>
-              <w:b/>
-              <w:bCs/>
-              <w:sz w:val="18"/>
-              <w:szCs w:val="18"/>
-              <w:lang w:val="en-US"/>
-            </w:rPr>
-            <w:t>}</w:t>
+            <w:t>{BatchNo}</w:t>
           </w:r>
         </w:p>
       </w:tc>
@@ -3305,31 +2894,7 @@
               <w:szCs w:val="18"/>
               <w:lang w:val="en-US"/>
             </w:rPr>
-            <w:t>{</w:t>
-          </w:r>
-          <w:proofErr w:type="spellStart"/>
-          <w:r>
-            <w:rPr>
-              <w:rFonts w:ascii="Verdana" w:hAnsi="Verdana" w:cs="Calibri"/>
-              <w:b/>
-              <w:bCs/>
-              <w:sz w:val="18"/>
-              <w:szCs w:val="18"/>
-              <w:lang w:val="en-US"/>
-            </w:rPr>
-            <w:t>FillVol</w:t>
-          </w:r>
-          <w:proofErr w:type="spellEnd"/>
-          <w:r>
-            <w:rPr>
-              <w:rFonts w:ascii="Verdana" w:hAnsi="Verdana" w:cs="Calibri"/>
-              <w:b/>
-              <w:bCs/>
-              <w:sz w:val="18"/>
-              <w:szCs w:val="18"/>
-              <w:lang w:val="en-US"/>
-            </w:rPr>
-            <w:t>}</w:t>
+            <w:t>{FillVol}</w:t>
           </w:r>
         </w:p>
       </w:tc>
@@ -3433,31 +2998,7 @@
               <w:szCs w:val="18"/>
               <w:lang w:val="en-US"/>
             </w:rPr>
-            <w:t>{</w:t>
-          </w:r>
-          <w:proofErr w:type="spellStart"/>
-          <w:r>
-            <w:rPr>
-              <w:rFonts w:ascii="Verdana" w:hAnsi="Verdana" w:cs="Calibri"/>
-              <w:b/>
-              <w:bCs/>
-              <w:sz w:val="18"/>
-              <w:szCs w:val="18"/>
-              <w:lang w:val="en-US"/>
-            </w:rPr>
-            <w:t>ExpiryDate</w:t>
-          </w:r>
-          <w:proofErr w:type="spellEnd"/>
-          <w:r>
-            <w:rPr>
-              <w:rFonts w:ascii="Verdana" w:hAnsi="Verdana" w:cs="Calibri"/>
-              <w:b/>
-              <w:bCs/>
-              <w:sz w:val="18"/>
-              <w:szCs w:val="18"/>
-              <w:lang w:val="en-US"/>
-            </w:rPr>
-            <w:t>}</w:t>
+            <w:t>{ExpiryDate}</w:t>
           </w:r>
         </w:p>
       </w:tc>
@@ -3651,27 +3192,7 @@
               <w:szCs w:val="16"/>
               <w:lang w:val="en-US"/>
             </w:rPr>
-            <w:t>{</w:t>
-          </w:r>
-          <w:proofErr w:type="spellStart"/>
-          <w:r>
-            <w:rPr>
-              <w:rFonts w:ascii="Verdana" w:hAnsi="Verdana" w:cs="Calibri"/>
-              <w:sz w:val="16"/>
-              <w:szCs w:val="16"/>
-              <w:lang w:val="en-US"/>
-            </w:rPr>
-            <w:t>RequestedBy</w:t>
-          </w:r>
-          <w:proofErr w:type="spellEnd"/>
-          <w:r>
-            <w:rPr>
-              <w:rFonts w:ascii="Verdana" w:hAnsi="Verdana" w:cs="Calibri"/>
-              <w:sz w:val="16"/>
-              <w:szCs w:val="16"/>
-              <w:lang w:val="en-US"/>
-            </w:rPr>
-            <w:t>}</w:t>
+            <w:t>{RequestedBy}</w:t>
           </w:r>
         </w:p>
       </w:tc>
@@ -3771,61 +3292,24 @@
               <w:sz w:val="18"/>
               <w:szCs w:val="18"/>
             </w:rPr>
-            <w:t>{</w:t>
-          </w:r>
-          <w:proofErr w:type="gramStart"/>
+            <w:t xml:space="preserve">{Purpose}                                                      Logbook                   </w:t>
+          </w:r>
           <w:r>
             <w:rPr>
               <w:rFonts w:ascii="Verdana" w:hAnsi="Verdana" w:cs="Arial"/>
               <w:sz w:val="18"/>
               <w:szCs w:val="18"/>
-            </w:rPr>
-            <w:t xml:space="preserve">Purpose}   </w:t>
-          </w:r>
-          <w:proofErr w:type="gramEnd"/>
+              <w:lang w:val="en-US"/>
+            </w:rPr>
+            <w:t xml:space="preserve">  </w:t>
+          </w:r>
           <w:r>
             <w:rPr>
               <w:rFonts w:ascii="Verdana" w:hAnsi="Verdana" w:cs="Arial"/>
               <w:sz w:val="18"/>
               <w:szCs w:val="18"/>
             </w:rPr>
-            <w:t xml:space="preserve">                                                   Logbook                   </w:t>
-          </w:r>
-          <w:r>
-            <w:rPr>
-              <w:rFonts w:ascii="Verdana" w:hAnsi="Verdana" w:cs="Arial"/>
-              <w:sz w:val="18"/>
-              <w:szCs w:val="18"/>
-              <w:lang w:val="en-US"/>
-            </w:rPr>
-            <w:t xml:space="preserve"> </w:t>
-          </w:r>
-          <w:proofErr w:type="gramStart"/>
-          <w:r>
-            <w:rPr>
-              <w:rFonts w:ascii="Verdana" w:hAnsi="Verdana" w:cs="Arial"/>
-              <w:sz w:val="18"/>
-              <w:szCs w:val="18"/>
-              <w:lang w:val="en-US"/>
-            </w:rPr>
-            <w:t xml:space="preserve"> </w:t>
-          </w:r>
-          <w:r>
-            <w:rPr>
-              <w:rFonts w:ascii="Verdana" w:hAnsi="Verdana" w:cs="Arial"/>
-              <w:sz w:val="18"/>
-              <w:szCs w:val="18"/>
-            </w:rPr>
-            <w:t xml:space="preserve"> :</w:t>
-          </w:r>
-          <w:proofErr w:type="gramEnd"/>
-          <w:r>
-            <w:rPr>
-              <w:rFonts w:ascii="Verdana" w:hAnsi="Verdana" w:cs="Arial"/>
-              <w:sz w:val="18"/>
-              <w:szCs w:val="18"/>
-            </w:rPr>
-            <w:t xml:space="preserve"> </w:t>
+            <w:t xml:space="preserve"> : </w:t>
           </w:r>
           <w:r>
             <w:rPr>
@@ -3954,6 +3438,16 @@
         </mc:Fallback>
       </mc:AlternateContent>
     </w:r>
+  </w:p>
+</w:hdr>
+</file>
+
+<file path=word/header3.xml><?xml version="1.0" encoding="utf-8"?>
+<w:hdr xmlns:wpc="http://schemas.microsoft.com/office/word/2010/wordprocessingCanvas" xmlns:cx="http://schemas.microsoft.com/office/drawing/2014/chartex" xmlns:cx1="http://schemas.microsoft.com/office/drawing/2015/9/8/chartex" xmlns:cx2="http://schemas.microsoft.com/office/drawing/2015/10/21/chartex" xmlns:cx3="http://schemas.microsoft.com/office/drawing/2016/5/9/chartex" xmlns:cx4="http://schemas.microsoft.com/office/drawing/2016/5/10/chartex" xmlns:cx5="http://schemas.microsoft.com/office/drawing/2016/5/11/chartex" xmlns:cx6="http://schemas.microsoft.com/office/drawing/2016/5/12/chartex" xmlns:cx7="http://schemas.microsoft.com/office/drawing/2016/5/13/chartex" xmlns:cx8="http://schemas.microsoft.com/office/drawing/2016/5/14/chartex" xmlns:mc="http://schemas.openxmlformats.org/markup-compatibility/2006" xmlns:aink="http://schemas.microsoft.com/office/drawing/2016/ink" xmlns:am3d="http://schemas.microsoft.com/office/drawing/2017/model3d" xmlns:o="urn:schemas-microsoft-com:office:office" xmlns:oel="http://schemas.microsoft.com/office/2019/extlst" xmlns:r="http://schemas.openxmlformats.org/officeDocument/2006/relationships" xmlns:m="http://schemas.openxmlformats.org/officeDocument/2006/math" xmlns:v="urn:schemas-microsoft-com:vml" xmlns:wp14="http://schemas.microsoft.com/office/word/2010/wordprocessingDrawing" xmlns:wp="http://schemas.openxmlformats.org/drawingml/2006/wordprocessingDrawing" xmlns:w10="urn:schemas-microsoft-com:office:word" xmlns:w="http://schemas.openxmlformats.org/wordprocessingml/2006/main" xmlns:w14="http://schemas.microsoft.com/office/word/2010/wordml" xmlns:w15="http://schemas.microsoft.com/office/word/2012/wordml" xmlns:w16cei="http://schemas.microsoft.com/office/word/2026/wordml/cei" xmlns:w16cex="http://schemas.microsoft.com/office/word/2018/wordml/cex" xmlns:w16cid="http://schemas.microsoft.com/office/word/2016/wordml/cid" xmlns:w16="http://schemas.microsoft.com/office/word/2018/wordml" xmlns:w16du="http://schemas.microsoft.com/office/word/2023/wordml/word16du" xmlns:w16sdtdh="http://schemas.microsoft.com/office/word/2020/wordml/sdtdatahash" xmlns:w16sdtfl="http://schemas.microsoft.com/office/word/2024/wordml/sdtformatlock" xmlns:w16se="http://schemas.microsoft.com/office/word/2015/wordml/symex" xmlns:wpg="http://schemas.microsoft.com/office/word/2010/wordprocessingGroup" xmlns:wpi="http://schemas.microsoft.com/office/word/2010/wordprocessingInk" xmlns:wne="http://schemas.microsoft.com/office/word/2006/wordml" xmlns:wps="http://schemas.microsoft.com/office/word/2010/wordprocessingShape" mc:Ignorable="w14 w15 w16se w16cid w16 w16cex w16sdtdh w16sdtfl w16du wp14">
+  <w:p>
+    <w:pPr>
+      <w:pStyle w:val="Header"/>
+    </w:pPr>
   </w:p>
 </w:hdr>
 </file>
@@ -4595,7 +4089,6 @@
   <w:style w:type="character" w:default="1" w:styleId="DefaultParagraphFont">
     <w:name w:val="Default Paragraph Font"/>
     <w:uiPriority w:val="1"/>
-    <w:semiHidden/>
     <w:unhideWhenUsed/>
   </w:style>
   <w:style w:type="table" w:default="1" w:styleId="TableNormal">

</xml_diff>